<commit_message>
Hướng dẫn dùng cpp
</commit_message>
<xml_diff>
--- a/Git stash.docx
+++ b/Git stash.docx
@@ -2,6 +2,43 @@
 <file path=word/document.xml><?xml version="1.0" encoding="utf-8"?>
 <w:document xmlns:wpc="http://schemas.microsoft.com/office/word/2010/wordprocessingCanvas" xmlns:cx="http://schemas.microsoft.com/office/drawing/2014/chartex" xmlns:cx1="http://schemas.microsoft.com/office/drawing/2015/9/8/chartex" xmlns:cx2="http://schemas.microsoft.com/office/drawing/2015/10/21/chartex" xmlns:cx3="http://schemas.microsoft.com/office/drawing/2016/5/9/chartex" xmlns:cx4="http://schemas.microsoft.com/office/drawing/2016/5/10/chartex" xmlns:cx5="http://schemas.microsoft.com/office/drawing/2016/5/11/chartex" xmlns:cx6="http://schemas.microsoft.com/office/drawing/2016/5/12/chartex" xmlns:cx7="http://schemas.microsoft.com/office/drawing/2016/5/13/chartex" xmlns:cx8="http://schemas.microsoft.com/office/drawing/2016/5/14/chartex" xmlns:mc="http://schemas.openxmlformats.org/markup-compatibility/2006" xmlns:aink="http://schemas.microsoft.com/office/drawing/2016/ink" xmlns:am3d="http://schemas.microsoft.com/office/drawing/2017/model3d" xmlns:o="urn:schemas-microsoft-com:office:office" xmlns:oel="http://schemas.microsoft.com/office/2019/extlst" xmlns:r="http://schemas.openxmlformats.org/officeDocument/2006/relationships" xmlns:m="http://schemas.openxmlformats.org/officeDocument/2006/math" xmlns:v="urn:schemas-microsoft-com:vml" xmlns:wp14="http://schemas.microsoft.com/office/word/2010/wordprocessingDrawing" xmlns:wp="http://schemas.openxmlformats.org/drawingml/2006/wordprocessingDrawing" xmlns:w10="urn:schemas-microsoft-com:office:word" xmlns:w="http://schemas.openxmlformats.org/wordprocessingml/2006/main" xmlns:w14="http://schemas.microsoft.com/office/word/2010/wordml" xmlns:w15="http://schemas.microsoft.com/office/word/2012/wordml" xmlns:w16cex="http://schemas.microsoft.com/office/word/2018/wordml/cex" xmlns:w16cid="http://schemas.microsoft.com/office/word/2016/wordml/cid" xmlns:w16="http://schemas.microsoft.com/office/word/2018/wordml" xmlns:w16du="http://schemas.microsoft.com/office/word/2023/wordml/word16du" xmlns:w16sdtdh="http://schemas.microsoft.com/office/word/2020/wordml/sdtdatahash" xmlns:w16se="http://schemas.microsoft.com/office/word/2015/wordml/symex" xmlns:wpg="http://schemas.microsoft.com/office/word/2010/wordprocessingGroup" xmlns:wpi="http://schemas.microsoft.com/office/word/2010/wordprocessingInk" xmlns:wne="http://schemas.microsoft.com/office/word/2006/wordml" xmlns:wps="http://schemas.microsoft.com/office/word/2010/wordprocessingShape" mc:Ignorable="w14 w15 w16se w16cid w16 w16cex w16sdtdh wp14">
   <w:body>
+    <w:p>
+      <w:pPr>
+        <w:jc w:val="both"/>
+        <w:rPr>
+          <w:rFonts w:ascii="Times New Roman" w:hAnsi="Times New Roman" w:cs="Times New Roman"/>
+          <w:b/>
+          <w:bCs/>
+          <w:sz w:val="28"/>
+          <w:szCs w:val="28"/>
+          <w:u w:val="single"/>
+        </w:rPr>
+      </w:pPr>
+      <w:proofErr w:type="spellStart"/>
+      <w:r>
+        <w:rPr>
+          <w:rFonts w:ascii="Times New Roman" w:hAnsi="Times New Roman" w:cs="Times New Roman"/>
+          <w:b/>
+          <w:bCs/>
+          <w:sz w:val="28"/>
+          <w:szCs w:val="28"/>
+          <w:u w:val="single"/>
+        </w:rPr>
+        <w:t>Câu</w:t>
+      </w:r>
+      <w:proofErr w:type="spellEnd"/>
+      <w:r>
+        <w:rPr>
+          <w:rFonts w:ascii="Times New Roman" w:hAnsi="Times New Roman" w:cs="Times New Roman"/>
+          <w:b/>
+          <w:bCs/>
+          <w:sz w:val="28"/>
+          <w:szCs w:val="28"/>
+          <w:u w:val="single"/>
+        </w:rPr>
+        <w:t xml:space="preserve"> 1:</w:t>
+      </w:r>
+    </w:p>
     <w:p>
       <w:pPr>
         <w:jc w:val="both"/>
@@ -1286,6 +1323,7 @@
       <w:r>
         <w:rPr>
           <w:rFonts w:ascii="Times New Roman" w:hAnsi="Times New Roman" w:cs="Times New Roman"/>
+          <w:noProof/>
           <w:sz w:val="28"/>
           <w:szCs w:val="28"/>
         </w:rPr>
@@ -1792,6 +1830,7 @@
       <w:r>
         <w:rPr>
           <w:rFonts w:ascii="Times New Roman" w:hAnsi="Times New Roman" w:cs="Times New Roman"/>
+          <w:noProof/>
           <w:sz w:val="28"/>
           <w:szCs w:val="28"/>
         </w:rPr>
@@ -1845,6 +1884,7 @@
       <w:r>
         <w:rPr>
           <w:rFonts w:ascii="Times New Roman" w:hAnsi="Times New Roman" w:cs="Times New Roman"/>
+          <w:noProof/>
           <w:sz w:val="28"/>
           <w:szCs w:val="28"/>
         </w:rPr>
@@ -2065,9 +2105,11 @@
       <w:r>
         <w:rPr>
           <w:rFonts w:ascii="Times New Roman" w:hAnsi="Times New Roman" w:cs="Times New Roman"/>
-          <w:sz w:val="28"/>
-          <w:szCs w:val="28"/>
-        </w:rPr>
+          <w:noProof/>
+          <w:sz w:val="28"/>
+          <w:szCs w:val="28"/>
+        </w:rPr>
+        <w:lastRenderedPageBreak/>
         <w:drawing>
           <wp:inline distT="0" distB="0" distL="0" distR="0" wp14:anchorId="4BC595FC" wp14:editId="0679D8F6">
             <wp:extent cx="5943600" cy="1162685"/>
@@ -2125,7 +2167,6 @@
           <w:sz w:val="28"/>
           <w:szCs w:val="28"/>
         </w:rPr>
-        <w:lastRenderedPageBreak/>
         <w:t xml:space="preserve">Git stash pop: </w:t>
       </w:r>
       <w:proofErr w:type="spellStart"/>
@@ -2392,6 +2433,7 @@
       <w:r>
         <w:rPr>
           <w:rFonts w:ascii="Times New Roman" w:hAnsi="Times New Roman" w:cs="Times New Roman"/>
+          <w:noProof/>
           <w:sz w:val="28"/>
           <w:szCs w:val="28"/>
         </w:rPr>
@@ -2550,25 +2592,7 @@
           <w:sz w:val="28"/>
           <w:szCs w:val="28"/>
         </w:rPr>
-        <w:t xml:space="preserve"> </w:t>
-      </w:r>
-      <w:proofErr w:type="spellStart"/>
-      <w:r>
-        <w:rPr>
-          <w:rFonts w:ascii="Times New Roman" w:hAnsi="Times New Roman" w:cs="Times New Roman"/>
-          <w:sz w:val="28"/>
-          <w:szCs w:val="28"/>
-        </w:rPr>
-        <w:t>bên</w:t>
-      </w:r>
-      <w:proofErr w:type="spellEnd"/>
-      <w:r>
-        <w:rPr>
-          <w:rFonts w:ascii="Times New Roman" w:hAnsi="Times New Roman" w:cs="Times New Roman"/>
-          <w:sz w:val="28"/>
-          <w:szCs w:val="28"/>
-        </w:rPr>
-        <w:t xml:space="preserve"> </w:t>
+        <w:t xml:space="preserve"> bên </w:t>
       </w:r>
       <w:proofErr w:type="spellStart"/>
       <w:r>
@@ -2602,6 +2626,7 @@
       <w:r>
         <w:rPr>
           <w:rFonts w:ascii="Times New Roman" w:hAnsi="Times New Roman" w:cs="Times New Roman"/>
+          <w:noProof/>
           <w:sz w:val="28"/>
           <w:szCs w:val="28"/>
         </w:rPr>
@@ -2647,6 +2672,1094 @@
         <w:jc w:val="both"/>
         <w:rPr>
           <w:rFonts w:ascii="Times New Roman" w:hAnsi="Times New Roman" w:cs="Times New Roman"/>
+          <w:b/>
+          <w:bCs/>
+          <w:sz w:val="28"/>
+          <w:szCs w:val="28"/>
+          <w:u w:val="single"/>
+        </w:rPr>
+      </w:pPr>
+      <w:proofErr w:type="spellStart"/>
+      <w:r>
+        <w:rPr>
+          <w:rFonts w:ascii="Times New Roman" w:hAnsi="Times New Roman" w:cs="Times New Roman"/>
+          <w:b/>
+          <w:bCs/>
+          <w:sz w:val="28"/>
+          <w:szCs w:val="28"/>
+          <w:u w:val="single"/>
+        </w:rPr>
+        <w:t>Câu</w:t>
+      </w:r>
+      <w:proofErr w:type="spellEnd"/>
+      <w:r>
+        <w:rPr>
+          <w:rFonts w:ascii="Times New Roman" w:hAnsi="Times New Roman" w:cs="Times New Roman"/>
+          <w:b/>
+          <w:bCs/>
+          <w:sz w:val="28"/>
+          <w:szCs w:val="28"/>
+          <w:u w:val="single"/>
+        </w:rPr>
+        <w:t xml:space="preserve"> 2:</w:t>
+      </w:r>
+    </w:p>
+    <w:p>
+      <w:pPr>
+        <w:pStyle w:val="ListParagraph"/>
+        <w:numPr>
+          <w:ilvl w:val="0"/>
+          <w:numId w:val="1"/>
+        </w:numPr>
+        <w:jc w:val="both"/>
+        <w:rPr>
+          <w:rFonts w:ascii="Times New Roman" w:hAnsi="Times New Roman" w:cs="Times New Roman"/>
+          <w:sz w:val="28"/>
+          <w:szCs w:val="28"/>
+        </w:rPr>
+      </w:pPr>
+      <w:proofErr w:type="spellStart"/>
+      <w:r>
+        <w:rPr>
+          <w:rFonts w:ascii="Times New Roman" w:hAnsi="Times New Roman" w:cs="Times New Roman"/>
+          <w:sz w:val="28"/>
+          <w:szCs w:val="28"/>
+        </w:rPr>
+        <w:t>Hướng</w:t>
+      </w:r>
+      <w:proofErr w:type="spellEnd"/>
+      <w:r>
+        <w:rPr>
+          <w:rFonts w:ascii="Times New Roman" w:hAnsi="Times New Roman" w:cs="Times New Roman"/>
+          <w:sz w:val="28"/>
+          <w:szCs w:val="28"/>
+        </w:rPr>
+        <w:t xml:space="preserve"> </w:t>
+      </w:r>
+      <w:proofErr w:type="spellStart"/>
+      <w:r>
+        <w:rPr>
+          <w:rFonts w:ascii="Times New Roman" w:hAnsi="Times New Roman" w:cs="Times New Roman"/>
+          <w:sz w:val="28"/>
+          <w:szCs w:val="28"/>
+        </w:rPr>
+        <w:t>dẫn</w:t>
+      </w:r>
+      <w:proofErr w:type="spellEnd"/>
+      <w:r>
+        <w:rPr>
+          <w:rFonts w:ascii="Times New Roman" w:hAnsi="Times New Roman" w:cs="Times New Roman"/>
+          <w:sz w:val="28"/>
+          <w:szCs w:val="28"/>
+        </w:rPr>
+        <w:t xml:space="preserve"> </w:t>
+      </w:r>
+      <w:proofErr w:type="spellStart"/>
+      <w:r>
+        <w:rPr>
+          <w:rFonts w:ascii="Times New Roman" w:hAnsi="Times New Roman" w:cs="Times New Roman"/>
+          <w:sz w:val="28"/>
+          <w:szCs w:val="28"/>
+        </w:rPr>
+        <w:t>chạy</w:t>
+      </w:r>
+      <w:proofErr w:type="spellEnd"/>
+      <w:r>
+        <w:rPr>
+          <w:rFonts w:ascii="Times New Roman" w:hAnsi="Times New Roman" w:cs="Times New Roman"/>
+          <w:sz w:val="28"/>
+          <w:szCs w:val="28"/>
+        </w:rPr>
+        <w:t xml:space="preserve"> file</w:t>
+      </w:r>
+      <w:r>
+        <w:rPr>
+          <w:rFonts w:ascii="Times New Roman" w:hAnsi="Times New Roman" w:cs="Times New Roman"/>
+          <w:sz w:val="28"/>
+          <w:szCs w:val="28"/>
+        </w:rPr>
+        <w:t xml:space="preserve"> BoiSoCua3.cpp:</w:t>
+      </w:r>
+    </w:p>
+    <w:p>
+      <w:pPr>
+        <w:pStyle w:val="ListParagraph"/>
+        <w:numPr>
+          <w:ilvl w:val="1"/>
+          <w:numId w:val="1"/>
+        </w:numPr>
+        <w:jc w:val="both"/>
+        <w:rPr>
+          <w:rFonts w:ascii="Times New Roman" w:hAnsi="Times New Roman" w:cs="Times New Roman"/>
+          <w:sz w:val="28"/>
+          <w:szCs w:val="28"/>
+        </w:rPr>
+      </w:pPr>
+      <w:proofErr w:type="spellStart"/>
+      <w:r>
+        <w:rPr>
+          <w:rFonts w:ascii="Times New Roman" w:hAnsi="Times New Roman" w:cs="Times New Roman"/>
+          <w:sz w:val="28"/>
+          <w:szCs w:val="28"/>
+        </w:rPr>
+        <w:t>Bước</w:t>
+      </w:r>
+      <w:proofErr w:type="spellEnd"/>
+      <w:r>
+        <w:rPr>
+          <w:rFonts w:ascii="Times New Roman" w:hAnsi="Times New Roman" w:cs="Times New Roman"/>
+          <w:sz w:val="28"/>
+          <w:szCs w:val="28"/>
+        </w:rPr>
+        <w:t xml:space="preserve"> 1: </w:t>
+      </w:r>
+      <w:proofErr w:type="spellStart"/>
+      <w:r>
+        <w:rPr>
+          <w:rFonts w:ascii="Times New Roman" w:hAnsi="Times New Roman" w:cs="Times New Roman"/>
+          <w:sz w:val="28"/>
+          <w:szCs w:val="28"/>
+        </w:rPr>
+        <w:t>Mở</w:t>
+      </w:r>
+      <w:proofErr w:type="spellEnd"/>
+      <w:r>
+        <w:rPr>
+          <w:rFonts w:ascii="Times New Roman" w:hAnsi="Times New Roman" w:cs="Times New Roman"/>
+          <w:sz w:val="28"/>
+          <w:szCs w:val="28"/>
+        </w:rPr>
+        <w:t xml:space="preserve"> visual studio </w:t>
+      </w:r>
+      <w:proofErr w:type="spellStart"/>
+      <w:r>
+        <w:rPr>
+          <w:rFonts w:ascii="Times New Roman" w:hAnsi="Times New Roman" w:cs="Times New Roman"/>
+          <w:sz w:val="28"/>
+          <w:szCs w:val="28"/>
+        </w:rPr>
+        <w:t>và</w:t>
+      </w:r>
+      <w:proofErr w:type="spellEnd"/>
+      <w:r>
+        <w:rPr>
+          <w:rFonts w:ascii="Times New Roman" w:hAnsi="Times New Roman" w:cs="Times New Roman"/>
+          <w:sz w:val="28"/>
+          <w:szCs w:val="28"/>
+        </w:rPr>
+        <w:t xml:space="preserve"> </w:t>
+      </w:r>
+      <w:proofErr w:type="spellStart"/>
+      <w:r>
+        <w:rPr>
+          <w:rFonts w:ascii="Times New Roman" w:hAnsi="Times New Roman" w:cs="Times New Roman"/>
+          <w:sz w:val="28"/>
+          <w:szCs w:val="28"/>
+        </w:rPr>
+        <w:t>tạo</w:t>
+      </w:r>
+      <w:proofErr w:type="spellEnd"/>
+      <w:r>
+        <w:rPr>
+          <w:rFonts w:ascii="Times New Roman" w:hAnsi="Times New Roman" w:cs="Times New Roman"/>
+          <w:sz w:val="28"/>
+          <w:szCs w:val="28"/>
+        </w:rPr>
+        <w:t xml:space="preserve"> 1 project C++.</w:t>
+      </w:r>
+    </w:p>
+    <w:p>
+      <w:pPr>
+        <w:ind w:left="1080"/>
+        <w:jc w:val="both"/>
+        <w:rPr>
+          <w:rFonts w:ascii="Times New Roman" w:hAnsi="Times New Roman" w:cs="Times New Roman"/>
+          <w:sz w:val="28"/>
+          <w:szCs w:val="28"/>
+        </w:rPr>
+      </w:pPr>
+      <w:r>
+        <w:lastRenderedPageBreak/>
+        <w:drawing>
+          <wp:inline distT="0" distB="0" distL="0" distR="0" wp14:anchorId="5FE32E73" wp14:editId="120A5CE1">
+            <wp:extent cx="5943600" cy="3180715"/>
+            <wp:effectExtent l="0" t="0" r="0" b="635"/>
+            <wp:docPr id="1593561368" name="Picture 1" descr="A screenshot of a computer&#10;&#10;Description automatically generated"/>
+            <wp:cNvGraphicFramePr>
+              <a:graphicFrameLocks xmlns:a="http://schemas.openxmlformats.org/drawingml/2006/main" noChangeAspect="1"/>
+            </wp:cNvGraphicFramePr>
+            <a:graphic xmlns:a="http://schemas.openxmlformats.org/drawingml/2006/main">
+              <a:graphicData uri="http://schemas.openxmlformats.org/drawingml/2006/picture">
+                <pic:pic xmlns:pic="http://schemas.openxmlformats.org/drawingml/2006/picture">
+                  <pic:nvPicPr>
+                    <pic:cNvPr id="1593561368" name="Picture 1" descr="A screenshot of a computer&#10;&#10;Description automatically generated"/>
+                    <pic:cNvPicPr/>
+                  </pic:nvPicPr>
+                  <pic:blipFill>
+                    <a:blip r:embed="rId11"/>
+                    <a:stretch>
+                      <a:fillRect/>
+                    </a:stretch>
+                  </pic:blipFill>
+                  <pic:spPr>
+                    <a:xfrm>
+                      <a:off x="0" y="0"/>
+                      <a:ext cx="5943600" cy="3180715"/>
+                    </a:xfrm>
+                    <a:prstGeom prst="rect">
+                      <a:avLst/>
+                    </a:prstGeom>
+                  </pic:spPr>
+                </pic:pic>
+              </a:graphicData>
+            </a:graphic>
+          </wp:inline>
+        </w:drawing>
+      </w:r>
+    </w:p>
+    <w:p>
+      <w:pPr>
+        <w:pStyle w:val="ListParagraph"/>
+        <w:numPr>
+          <w:ilvl w:val="1"/>
+          <w:numId w:val="1"/>
+        </w:numPr>
+        <w:jc w:val="both"/>
+        <w:rPr>
+          <w:rFonts w:ascii="Times New Roman" w:hAnsi="Times New Roman" w:cs="Times New Roman"/>
+          <w:sz w:val="28"/>
+          <w:szCs w:val="28"/>
+        </w:rPr>
+      </w:pPr>
+      <w:proofErr w:type="spellStart"/>
+      <w:r>
+        <w:rPr>
+          <w:rFonts w:ascii="Times New Roman" w:hAnsi="Times New Roman" w:cs="Times New Roman"/>
+          <w:sz w:val="28"/>
+          <w:szCs w:val="28"/>
+        </w:rPr>
+        <w:t>Bước</w:t>
+      </w:r>
+      <w:proofErr w:type="spellEnd"/>
+      <w:r>
+        <w:rPr>
+          <w:rFonts w:ascii="Times New Roman" w:hAnsi="Times New Roman" w:cs="Times New Roman"/>
+          <w:sz w:val="28"/>
+          <w:szCs w:val="28"/>
+        </w:rPr>
+        <w:t xml:space="preserve"> 2: </w:t>
+      </w:r>
+      <w:proofErr w:type="spellStart"/>
+      <w:r>
+        <w:rPr>
+          <w:rFonts w:ascii="Times New Roman" w:hAnsi="Times New Roman" w:cs="Times New Roman"/>
+          <w:sz w:val="28"/>
+          <w:szCs w:val="28"/>
+        </w:rPr>
+        <w:t>Đem</w:t>
+      </w:r>
+      <w:proofErr w:type="spellEnd"/>
+      <w:r>
+        <w:rPr>
+          <w:rFonts w:ascii="Times New Roman" w:hAnsi="Times New Roman" w:cs="Times New Roman"/>
+          <w:sz w:val="28"/>
+          <w:szCs w:val="28"/>
+        </w:rPr>
+        <w:t xml:space="preserve"> file BoiSoCua3.cpp </w:t>
+      </w:r>
+      <w:proofErr w:type="spellStart"/>
+      <w:r>
+        <w:rPr>
+          <w:rFonts w:ascii="Times New Roman" w:hAnsi="Times New Roman" w:cs="Times New Roman"/>
+          <w:sz w:val="28"/>
+          <w:szCs w:val="28"/>
+        </w:rPr>
+        <w:t>vào</w:t>
+      </w:r>
+      <w:proofErr w:type="spellEnd"/>
+      <w:r>
+        <w:rPr>
+          <w:rFonts w:ascii="Times New Roman" w:hAnsi="Times New Roman" w:cs="Times New Roman"/>
+          <w:sz w:val="28"/>
+          <w:szCs w:val="28"/>
+        </w:rPr>
+        <w:t xml:space="preserve"> project.</w:t>
+      </w:r>
+    </w:p>
+    <w:p>
+      <w:pPr>
+        <w:ind w:left="360" w:firstLine="720"/>
+        <w:jc w:val="both"/>
+        <w:rPr>
+          <w:rFonts w:ascii="Times New Roman" w:hAnsi="Times New Roman" w:cs="Times New Roman"/>
+          <w:sz w:val="28"/>
+          <w:szCs w:val="28"/>
+        </w:rPr>
+      </w:pPr>
+      <w:r>
+        <w:rPr>
+          <w:rFonts w:ascii="Times New Roman" w:hAnsi="Times New Roman" w:cs="Times New Roman"/>
+          <w:sz w:val="28"/>
+          <w:szCs w:val="28"/>
+        </w:rPr>
+        <w:drawing>
+          <wp:inline distT="0" distB="0" distL="0" distR="0" wp14:anchorId="5DB620AE" wp14:editId="27DC75A4">
+            <wp:extent cx="5943600" cy="3167380"/>
+            <wp:effectExtent l="0" t="0" r="0" b="0"/>
+            <wp:docPr id="1196619786" name="Picture 1" descr="A screenshot of a computer&#10;&#10;Description automatically generated"/>
+            <wp:cNvGraphicFramePr>
+              <a:graphicFrameLocks xmlns:a="http://schemas.openxmlformats.org/drawingml/2006/main" noChangeAspect="1"/>
+            </wp:cNvGraphicFramePr>
+            <a:graphic xmlns:a="http://schemas.openxmlformats.org/drawingml/2006/main">
+              <a:graphicData uri="http://schemas.openxmlformats.org/drawingml/2006/picture">
+                <pic:pic xmlns:pic="http://schemas.openxmlformats.org/drawingml/2006/picture">
+                  <pic:nvPicPr>
+                    <pic:cNvPr id="1196619786" name="Picture 1" descr="A screenshot of a computer&#10;&#10;Description automatically generated"/>
+                    <pic:cNvPicPr/>
+                  </pic:nvPicPr>
+                  <pic:blipFill>
+                    <a:blip r:embed="rId12"/>
+                    <a:stretch>
+                      <a:fillRect/>
+                    </a:stretch>
+                  </pic:blipFill>
+                  <pic:spPr>
+                    <a:xfrm>
+                      <a:off x="0" y="0"/>
+                      <a:ext cx="5943600" cy="3167380"/>
+                    </a:xfrm>
+                    <a:prstGeom prst="rect">
+                      <a:avLst/>
+                    </a:prstGeom>
+                  </pic:spPr>
+                </pic:pic>
+              </a:graphicData>
+            </a:graphic>
+          </wp:inline>
+        </w:drawing>
+      </w:r>
+    </w:p>
+    <w:p>
+      <w:pPr>
+        <w:pStyle w:val="ListParagraph"/>
+        <w:numPr>
+          <w:ilvl w:val="1"/>
+          <w:numId w:val="1"/>
+        </w:numPr>
+        <w:jc w:val="both"/>
+        <w:rPr>
+          <w:rFonts w:ascii="Times New Roman" w:hAnsi="Times New Roman" w:cs="Times New Roman"/>
+          <w:sz w:val="28"/>
+          <w:szCs w:val="28"/>
+        </w:rPr>
+      </w:pPr>
+      <w:proofErr w:type="spellStart"/>
+      <w:r>
+        <w:rPr>
+          <w:rFonts w:ascii="Times New Roman" w:hAnsi="Times New Roman" w:cs="Times New Roman"/>
+          <w:sz w:val="28"/>
+          <w:szCs w:val="28"/>
+        </w:rPr>
+        <w:t>Bước</w:t>
+      </w:r>
+      <w:proofErr w:type="spellEnd"/>
+      <w:r>
+        <w:rPr>
+          <w:rFonts w:ascii="Times New Roman" w:hAnsi="Times New Roman" w:cs="Times New Roman"/>
+          <w:sz w:val="28"/>
+          <w:szCs w:val="28"/>
+        </w:rPr>
+        <w:t xml:space="preserve"> 3: </w:t>
+      </w:r>
+      <w:proofErr w:type="spellStart"/>
+      <w:r>
+        <w:rPr>
+          <w:rFonts w:ascii="Times New Roman" w:hAnsi="Times New Roman" w:cs="Times New Roman"/>
+          <w:sz w:val="28"/>
+          <w:szCs w:val="28"/>
+        </w:rPr>
+        <w:t>Bấm</w:t>
+      </w:r>
+      <w:proofErr w:type="spellEnd"/>
+      <w:r>
+        <w:rPr>
+          <w:rFonts w:ascii="Times New Roman" w:hAnsi="Times New Roman" w:cs="Times New Roman"/>
+          <w:sz w:val="28"/>
+          <w:szCs w:val="28"/>
+        </w:rPr>
+        <w:t xml:space="preserve"> F5 </w:t>
+      </w:r>
+      <w:proofErr w:type="spellStart"/>
+      <w:r>
+        <w:rPr>
+          <w:rFonts w:ascii="Times New Roman" w:hAnsi="Times New Roman" w:cs="Times New Roman"/>
+          <w:sz w:val="28"/>
+          <w:szCs w:val="28"/>
+        </w:rPr>
+        <w:t>để</w:t>
+      </w:r>
+      <w:proofErr w:type="spellEnd"/>
+      <w:r>
+        <w:rPr>
+          <w:rFonts w:ascii="Times New Roman" w:hAnsi="Times New Roman" w:cs="Times New Roman"/>
+          <w:sz w:val="28"/>
+          <w:szCs w:val="28"/>
+        </w:rPr>
+        <w:t xml:space="preserve"> </w:t>
+      </w:r>
+      <w:proofErr w:type="spellStart"/>
+      <w:r>
+        <w:rPr>
+          <w:rFonts w:ascii="Times New Roman" w:hAnsi="Times New Roman" w:cs="Times New Roman"/>
+          <w:sz w:val="28"/>
+          <w:szCs w:val="28"/>
+        </w:rPr>
+        <w:t>tiến</w:t>
+      </w:r>
+      <w:proofErr w:type="spellEnd"/>
+      <w:r>
+        <w:rPr>
+          <w:rFonts w:ascii="Times New Roman" w:hAnsi="Times New Roman" w:cs="Times New Roman"/>
+          <w:sz w:val="28"/>
+          <w:szCs w:val="28"/>
+        </w:rPr>
+        <w:t xml:space="preserve"> </w:t>
+      </w:r>
+      <w:proofErr w:type="spellStart"/>
+      <w:r>
+        <w:rPr>
+          <w:rFonts w:ascii="Times New Roman" w:hAnsi="Times New Roman" w:cs="Times New Roman"/>
+          <w:sz w:val="28"/>
+          <w:szCs w:val="28"/>
+        </w:rPr>
+        <w:t>hành</w:t>
+      </w:r>
+      <w:proofErr w:type="spellEnd"/>
+      <w:r>
+        <w:rPr>
+          <w:rFonts w:ascii="Times New Roman" w:hAnsi="Times New Roman" w:cs="Times New Roman"/>
+          <w:sz w:val="28"/>
+          <w:szCs w:val="28"/>
+        </w:rPr>
+        <w:t xml:space="preserve"> build. Sau </w:t>
+      </w:r>
+      <w:proofErr w:type="spellStart"/>
+      <w:r>
+        <w:rPr>
+          <w:rFonts w:ascii="Times New Roman" w:hAnsi="Times New Roman" w:cs="Times New Roman"/>
+          <w:sz w:val="28"/>
+          <w:szCs w:val="28"/>
+        </w:rPr>
+        <w:t>đó</w:t>
+      </w:r>
+      <w:proofErr w:type="spellEnd"/>
+      <w:r>
+        <w:rPr>
+          <w:rFonts w:ascii="Times New Roman" w:hAnsi="Times New Roman" w:cs="Times New Roman"/>
+          <w:sz w:val="28"/>
+          <w:szCs w:val="28"/>
+        </w:rPr>
+        <w:t xml:space="preserve">, </w:t>
+      </w:r>
+      <w:proofErr w:type="spellStart"/>
+      <w:r>
+        <w:rPr>
+          <w:rFonts w:ascii="Times New Roman" w:hAnsi="Times New Roman" w:cs="Times New Roman"/>
+          <w:sz w:val="28"/>
+          <w:szCs w:val="28"/>
+        </w:rPr>
+        <w:t>nhập</w:t>
+      </w:r>
+      <w:proofErr w:type="spellEnd"/>
+      <w:r>
+        <w:rPr>
+          <w:rFonts w:ascii="Times New Roman" w:hAnsi="Times New Roman" w:cs="Times New Roman"/>
+          <w:sz w:val="28"/>
+          <w:szCs w:val="28"/>
+        </w:rPr>
+        <w:t xml:space="preserve"> </w:t>
+      </w:r>
+      <w:proofErr w:type="spellStart"/>
+      <w:r>
+        <w:rPr>
+          <w:rFonts w:ascii="Times New Roman" w:hAnsi="Times New Roman" w:cs="Times New Roman"/>
+          <w:sz w:val="28"/>
+          <w:szCs w:val="28"/>
+        </w:rPr>
+        <w:t>vào</w:t>
+      </w:r>
+      <w:proofErr w:type="spellEnd"/>
+      <w:r>
+        <w:rPr>
+          <w:rFonts w:ascii="Times New Roman" w:hAnsi="Times New Roman" w:cs="Times New Roman"/>
+          <w:sz w:val="28"/>
+          <w:szCs w:val="28"/>
+        </w:rPr>
+        <w:t xml:space="preserve"> </w:t>
+      </w:r>
+      <w:proofErr w:type="spellStart"/>
+      <w:r>
+        <w:rPr>
+          <w:rFonts w:ascii="Times New Roman" w:hAnsi="Times New Roman" w:cs="Times New Roman"/>
+          <w:sz w:val="28"/>
+          <w:szCs w:val="28"/>
+        </w:rPr>
+        <w:t>một</w:t>
+      </w:r>
+      <w:proofErr w:type="spellEnd"/>
+      <w:r>
+        <w:rPr>
+          <w:rFonts w:ascii="Times New Roman" w:hAnsi="Times New Roman" w:cs="Times New Roman"/>
+          <w:sz w:val="28"/>
+          <w:szCs w:val="28"/>
+        </w:rPr>
+        <w:t xml:space="preserve"> </w:t>
+      </w:r>
+      <w:proofErr w:type="spellStart"/>
+      <w:r>
+        <w:rPr>
+          <w:rFonts w:ascii="Times New Roman" w:hAnsi="Times New Roman" w:cs="Times New Roman"/>
+          <w:sz w:val="28"/>
+          <w:szCs w:val="28"/>
+        </w:rPr>
+        <w:t>số</w:t>
+      </w:r>
+      <w:proofErr w:type="spellEnd"/>
+      <w:r>
+        <w:rPr>
+          <w:rFonts w:ascii="Times New Roman" w:hAnsi="Times New Roman" w:cs="Times New Roman"/>
+          <w:sz w:val="28"/>
+          <w:szCs w:val="28"/>
+        </w:rPr>
+        <w:t xml:space="preserve"> </w:t>
+      </w:r>
+      <w:proofErr w:type="spellStart"/>
+      <w:r>
+        <w:rPr>
+          <w:rFonts w:ascii="Times New Roman" w:hAnsi="Times New Roman" w:cs="Times New Roman"/>
+          <w:sz w:val="28"/>
+          <w:szCs w:val="28"/>
+        </w:rPr>
+        <w:t>nguyên</w:t>
+      </w:r>
+      <w:proofErr w:type="spellEnd"/>
+      <w:r>
+        <w:rPr>
+          <w:rFonts w:ascii="Times New Roman" w:hAnsi="Times New Roman" w:cs="Times New Roman"/>
+          <w:sz w:val="28"/>
+          <w:szCs w:val="28"/>
+        </w:rPr>
+        <w:t xml:space="preserve"> </w:t>
+      </w:r>
+      <w:proofErr w:type="spellStart"/>
+      <w:r>
+        <w:rPr>
+          <w:rFonts w:ascii="Times New Roman" w:hAnsi="Times New Roman" w:cs="Times New Roman"/>
+          <w:sz w:val="28"/>
+          <w:szCs w:val="28"/>
+        </w:rPr>
+        <w:t>để</w:t>
+      </w:r>
+      <w:proofErr w:type="spellEnd"/>
+      <w:r>
+        <w:rPr>
+          <w:rFonts w:ascii="Times New Roman" w:hAnsi="Times New Roman" w:cs="Times New Roman"/>
+          <w:sz w:val="28"/>
+          <w:szCs w:val="28"/>
+        </w:rPr>
+        <w:t xml:space="preserve"> </w:t>
+      </w:r>
+      <w:proofErr w:type="spellStart"/>
+      <w:r>
+        <w:rPr>
+          <w:rFonts w:ascii="Times New Roman" w:hAnsi="Times New Roman" w:cs="Times New Roman"/>
+          <w:sz w:val="28"/>
+          <w:szCs w:val="28"/>
+        </w:rPr>
+        <w:t>chương</w:t>
+      </w:r>
+      <w:proofErr w:type="spellEnd"/>
+      <w:r>
+        <w:rPr>
+          <w:rFonts w:ascii="Times New Roman" w:hAnsi="Times New Roman" w:cs="Times New Roman"/>
+          <w:sz w:val="28"/>
+          <w:szCs w:val="28"/>
+        </w:rPr>
+        <w:t xml:space="preserve"> </w:t>
+      </w:r>
+      <w:proofErr w:type="spellStart"/>
+      <w:r>
+        <w:rPr>
+          <w:rFonts w:ascii="Times New Roman" w:hAnsi="Times New Roman" w:cs="Times New Roman"/>
+          <w:sz w:val="28"/>
+          <w:szCs w:val="28"/>
+        </w:rPr>
+        <w:t>trình</w:t>
+      </w:r>
+      <w:proofErr w:type="spellEnd"/>
+      <w:r>
+        <w:rPr>
+          <w:rFonts w:ascii="Times New Roman" w:hAnsi="Times New Roman" w:cs="Times New Roman"/>
+          <w:sz w:val="28"/>
+          <w:szCs w:val="28"/>
+        </w:rPr>
+        <w:t xml:space="preserve"> </w:t>
+      </w:r>
+      <w:proofErr w:type="spellStart"/>
+      <w:r>
+        <w:rPr>
+          <w:rFonts w:ascii="Times New Roman" w:hAnsi="Times New Roman" w:cs="Times New Roman"/>
+          <w:sz w:val="28"/>
+          <w:szCs w:val="28"/>
+        </w:rPr>
+        <w:t>kiểm</w:t>
+      </w:r>
+      <w:proofErr w:type="spellEnd"/>
+      <w:r>
+        <w:rPr>
+          <w:rFonts w:ascii="Times New Roman" w:hAnsi="Times New Roman" w:cs="Times New Roman"/>
+          <w:sz w:val="28"/>
+          <w:szCs w:val="28"/>
+        </w:rPr>
+        <w:t xml:space="preserve"> </w:t>
+      </w:r>
+      <w:proofErr w:type="spellStart"/>
+      <w:r>
+        <w:rPr>
+          <w:rFonts w:ascii="Times New Roman" w:hAnsi="Times New Roman" w:cs="Times New Roman"/>
+          <w:sz w:val="28"/>
+          <w:szCs w:val="28"/>
+        </w:rPr>
+        <w:t>tra</w:t>
+      </w:r>
+      <w:proofErr w:type="spellEnd"/>
+      <w:r>
+        <w:rPr>
+          <w:rFonts w:ascii="Times New Roman" w:hAnsi="Times New Roman" w:cs="Times New Roman"/>
+          <w:sz w:val="28"/>
+          <w:szCs w:val="28"/>
+        </w:rPr>
+        <w:t xml:space="preserve"> </w:t>
+      </w:r>
+      <w:proofErr w:type="spellStart"/>
+      <w:r>
+        <w:rPr>
+          <w:rFonts w:ascii="Times New Roman" w:hAnsi="Times New Roman" w:cs="Times New Roman"/>
+          <w:sz w:val="28"/>
+          <w:szCs w:val="28"/>
+        </w:rPr>
+        <w:t>xem</w:t>
+      </w:r>
+      <w:proofErr w:type="spellEnd"/>
+      <w:r>
+        <w:rPr>
+          <w:rFonts w:ascii="Times New Roman" w:hAnsi="Times New Roman" w:cs="Times New Roman"/>
+          <w:sz w:val="28"/>
+          <w:szCs w:val="28"/>
+        </w:rPr>
+        <w:t xml:space="preserve"> </w:t>
+      </w:r>
+      <w:proofErr w:type="spellStart"/>
+      <w:r>
+        <w:rPr>
+          <w:rFonts w:ascii="Times New Roman" w:hAnsi="Times New Roman" w:cs="Times New Roman"/>
+          <w:sz w:val="28"/>
+          <w:szCs w:val="28"/>
+        </w:rPr>
+        <w:t>số</w:t>
+      </w:r>
+      <w:proofErr w:type="spellEnd"/>
+      <w:r>
+        <w:rPr>
+          <w:rFonts w:ascii="Times New Roman" w:hAnsi="Times New Roman" w:cs="Times New Roman"/>
+          <w:sz w:val="28"/>
+          <w:szCs w:val="28"/>
+        </w:rPr>
+        <w:t xml:space="preserve"> </w:t>
+      </w:r>
+      <w:proofErr w:type="spellStart"/>
+      <w:r>
+        <w:rPr>
+          <w:rFonts w:ascii="Times New Roman" w:hAnsi="Times New Roman" w:cs="Times New Roman"/>
+          <w:sz w:val="28"/>
+          <w:szCs w:val="28"/>
+        </w:rPr>
+        <w:t>nguyên</w:t>
+      </w:r>
+      <w:proofErr w:type="spellEnd"/>
+      <w:r>
+        <w:rPr>
+          <w:rFonts w:ascii="Times New Roman" w:hAnsi="Times New Roman" w:cs="Times New Roman"/>
+          <w:sz w:val="28"/>
+          <w:szCs w:val="28"/>
+        </w:rPr>
+        <w:t xml:space="preserve"> </w:t>
+      </w:r>
+      <w:proofErr w:type="spellStart"/>
+      <w:r>
+        <w:rPr>
+          <w:rFonts w:ascii="Times New Roman" w:hAnsi="Times New Roman" w:cs="Times New Roman"/>
+          <w:sz w:val="28"/>
+          <w:szCs w:val="28"/>
+        </w:rPr>
+        <w:t>được</w:t>
+      </w:r>
+      <w:proofErr w:type="spellEnd"/>
+      <w:r>
+        <w:rPr>
+          <w:rFonts w:ascii="Times New Roman" w:hAnsi="Times New Roman" w:cs="Times New Roman"/>
+          <w:sz w:val="28"/>
+          <w:szCs w:val="28"/>
+        </w:rPr>
+        <w:t xml:space="preserve"> </w:t>
+      </w:r>
+      <w:proofErr w:type="spellStart"/>
+      <w:r>
+        <w:rPr>
+          <w:rFonts w:ascii="Times New Roman" w:hAnsi="Times New Roman" w:cs="Times New Roman"/>
+          <w:sz w:val="28"/>
+          <w:szCs w:val="28"/>
+        </w:rPr>
+        <w:t>nhập</w:t>
+      </w:r>
+      <w:proofErr w:type="spellEnd"/>
+      <w:r>
+        <w:rPr>
+          <w:rFonts w:ascii="Times New Roman" w:hAnsi="Times New Roman" w:cs="Times New Roman"/>
+          <w:sz w:val="28"/>
+          <w:szCs w:val="28"/>
+        </w:rPr>
+        <w:t xml:space="preserve"> </w:t>
+      </w:r>
+      <w:proofErr w:type="spellStart"/>
+      <w:r>
+        <w:rPr>
+          <w:rFonts w:ascii="Times New Roman" w:hAnsi="Times New Roman" w:cs="Times New Roman"/>
+          <w:sz w:val="28"/>
+          <w:szCs w:val="28"/>
+        </w:rPr>
+        <w:t>có</w:t>
+      </w:r>
+      <w:proofErr w:type="spellEnd"/>
+      <w:r>
+        <w:rPr>
+          <w:rFonts w:ascii="Times New Roman" w:hAnsi="Times New Roman" w:cs="Times New Roman"/>
+          <w:sz w:val="28"/>
+          <w:szCs w:val="28"/>
+        </w:rPr>
+        <w:t xml:space="preserve"> </w:t>
+      </w:r>
+      <w:proofErr w:type="spellStart"/>
+      <w:r>
+        <w:rPr>
+          <w:rFonts w:ascii="Times New Roman" w:hAnsi="Times New Roman" w:cs="Times New Roman"/>
+          <w:sz w:val="28"/>
+          <w:szCs w:val="28"/>
+        </w:rPr>
+        <w:t>phải</w:t>
+      </w:r>
+      <w:proofErr w:type="spellEnd"/>
+      <w:r>
+        <w:rPr>
+          <w:rFonts w:ascii="Times New Roman" w:hAnsi="Times New Roman" w:cs="Times New Roman"/>
+          <w:sz w:val="28"/>
+          <w:szCs w:val="28"/>
+        </w:rPr>
+        <w:t xml:space="preserve"> </w:t>
+      </w:r>
+      <w:proofErr w:type="spellStart"/>
+      <w:r>
+        <w:rPr>
+          <w:rFonts w:ascii="Times New Roman" w:hAnsi="Times New Roman" w:cs="Times New Roman"/>
+          <w:sz w:val="28"/>
+          <w:szCs w:val="28"/>
+        </w:rPr>
+        <w:t>bội</w:t>
+      </w:r>
+      <w:proofErr w:type="spellEnd"/>
+      <w:r>
+        <w:rPr>
+          <w:rFonts w:ascii="Times New Roman" w:hAnsi="Times New Roman" w:cs="Times New Roman"/>
+          <w:sz w:val="28"/>
+          <w:szCs w:val="28"/>
+        </w:rPr>
+        <w:t xml:space="preserve"> </w:t>
+      </w:r>
+      <w:proofErr w:type="spellStart"/>
+      <w:r>
+        <w:rPr>
+          <w:rFonts w:ascii="Times New Roman" w:hAnsi="Times New Roman" w:cs="Times New Roman"/>
+          <w:sz w:val="28"/>
+          <w:szCs w:val="28"/>
+        </w:rPr>
+        <w:t>số</w:t>
+      </w:r>
+      <w:proofErr w:type="spellEnd"/>
+      <w:r>
+        <w:rPr>
+          <w:rFonts w:ascii="Times New Roman" w:hAnsi="Times New Roman" w:cs="Times New Roman"/>
+          <w:sz w:val="28"/>
+          <w:szCs w:val="28"/>
+        </w:rPr>
+        <w:t xml:space="preserve"> </w:t>
+      </w:r>
+      <w:proofErr w:type="spellStart"/>
+      <w:r>
+        <w:rPr>
+          <w:rFonts w:ascii="Times New Roman" w:hAnsi="Times New Roman" w:cs="Times New Roman"/>
+          <w:sz w:val="28"/>
+          <w:szCs w:val="28"/>
+        </w:rPr>
+        <w:t>của</w:t>
+      </w:r>
+      <w:proofErr w:type="spellEnd"/>
+      <w:r>
+        <w:rPr>
+          <w:rFonts w:ascii="Times New Roman" w:hAnsi="Times New Roman" w:cs="Times New Roman"/>
+          <w:sz w:val="28"/>
+          <w:szCs w:val="28"/>
+        </w:rPr>
+        <w:t xml:space="preserve"> 3 hay </w:t>
+      </w:r>
+      <w:proofErr w:type="spellStart"/>
+      <w:r>
+        <w:rPr>
+          <w:rFonts w:ascii="Times New Roman" w:hAnsi="Times New Roman" w:cs="Times New Roman"/>
+          <w:sz w:val="28"/>
+          <w:szCs w:val="28"/>
+        </w:rPr>
+        <w:t>không</w:t>
+      </w:r>
+      <w:proofErr w:type="spellEnd"/>
+      <w:r>
+        <w:rPr>
+          <w:rFonts w:ascii="Times New Roman" w:hAnsi="Times New Roman" w:cs="Times New Roman"/>
+          <w:sz w:val="28"/>
+          <w:szCs w:val="28"/>
+        </w:rPr>
+        <w:t>.</w:t>
+      </w:r>
+    </w:p>
+    <w:p>
+      <w:pPr>
+        <w:ind w:firstLine="720"/>
+        <w:jc w:val="both"/>
+        <w:rPr>
+          <w:rFonts w:ascii="Times New Roman" w:hAnsi="Times New Roman" w:cs="Times New Roman"/>
+          <w:sz w:val="28"/>
+          <w:szCs w:val="28"/>
+        </w:rPr>
+      </w:pPr>
+      <w:r>
+        <w:rPr>
+          <w:rFonts w:ascii="Times New Roman" w:hAnsi="Times New Roman" w:cs="Times New Roman"/>
+          <w:sz w:val="28"/>
+          <w:szCs w:val="28"/>
+        </w:rPr>
+        <w:lastRenderedPageBreak/>
+        <w:drawing>
+          <wp:inline distT="0" distB="0" distL="0" distR="0" wp14:anchorId="03ABC2C7" wp14:editId="56EB983C">
+            <wp:extent cx="5943600" cy="3105785"/>
+            <wp:effectExtent l="0" t="0" r="0" b="0"/>
+            <wp:docPr id="213243982" name="Picture 1" descr="A computer screen with white text&#10;&#10;Description automatically generated"/>
+            <wp:cNvGraphicFramePr>
+              <a:graphicFrameLocks xmlns:a="http://schemas.openxmlformats.org/drawingml/2006/main" noChangeAspect="1"/>
+            </wp:cNvGraphicFramePr>
+            <a:graphic xmlns:a="http://schemas.openxmlformats.org/drawingml/2006/main">
+              <a:graphicData uri="http://schemas.openxmlformats.org/drawingml/2006/picture">
+                <pic:pic xmlns:pic="http://schemas.openxmlformats.org/drawingml/2006/picture">
+                  <pic:nvPicPr>
+                    <pic:cNvPr id="213243982" name="Picture 1" descr="A computer screen with white text&#10;&#10;Description automatically generated"/>
+                    <pic:cNvPicPr/>
+                  </pic:nvPicPr>
+                  <pic:blipFill>
+                    <a:blip r:embed="rId13"/>
+                    <a:stretch>
+                      <a:fillRect/>
+                    </a:stretch>
+                  </pic:blipFill>
+                  <pic:spPr>
+                    <a:xfrm>
+                      <a:off x="0" y="0"/>
+                      <a:ext cx="5943600" cy="3105785"/>
+                    </a:xfrm>
+                    <a:prstGeom prst="rect">
+                      <a:avLst/>
+                    </a:prstGeom>
+                  </pic:spPr>
+                </pic:pic>
+              </a:graphicData>
+            </a:graphic>
+          </wp:inline>
+        </w:drawing>
+      </w:r>
+    </w:p>
+    <w:p>
+      <w:pPr>
+        <w:ind w:firstLine="720"/>
+        <w:jc w:val="both"/>
+        <w:rPr>
+          <w:rFonts w:ascii="Times New Roman" w:hAnsi="Times New Roman" w:cs="Times New Roman"/>
+          <w:sz w:val="28"/>
+          <w:szCs w:val="28"/>
+        </w:rPr>
+      </w:pPr>
+      <w:r>
+        <w:rPr>
+          <w:rFonts w:ascii="Times New Roman" w:hAnsi="Times New Roman" w:cs="Times New Roman"/>
+          <w:sz w:val="28"/>
+          <w:szCs w:val="28"/>
+        </w:rPr>
+        <w:drawing>
+          <wp:inline distT="0" distB="0" distL="0" distR="0" wp14:anchorId="62D5DCBA" wp14:editId="2D7C3DEA">
+            <wp:extent cx="5943600" cy="3105150"/>
+            <wp:effectExtent l="0" t="0" r="0" b="0"/>
+            <wp:docPr id="383486855" name="Picture 1" descr="A computer screen with white text&#10;&#10;Description automatically generated"/>
+            <wp:cNvGraphicFramePr>
+              <a:graphicFrameLocks xmlns:a="http://schemas.openxmlformats.org/drawingml/2006/main" noChangeAspect="1"/>
+            </wp:cNvGraphicFramePr>
+            <a:graphic xmlns:a="http://schemas.openxmlformats.org/drawingml/2006/main">
+              <a:graphicData uri="http://schemas.openxmlformats.org/drawingml/2006/picture">
+                <pic:pic xmlns:pic="http://schemas.openxmlformats.org/drawingml/2006/picture">
+                  <pic:nvPicPr>
+                    <pic:cNvPr id="383486855" name="Picture 1" descr="A computer screen with white text&#10;&#10;Description automatically generated"/>
+                    <pic:cNvPicPr/>
+                  </pic:nvPicPr>
+                  <pic:blipFill>
+                    <a:blip r:embed="rId14"/>
+                    <a:stretch>
+                      <a:fillRect/>
+                    </a:stretch>
+                  </pic:blipFill>
+                  <pic:spPr>
+                    <a:xfrm>
+                      <a:off x="0" y="0"/>
+                      <a:ext cx="5943600" cy="3105150"/>
+                    </a:xfrm>
+                    <a:prstGeom prst="rect">
+                      <a:avLst/>
+                    </a:prstGeom>
+                  </pic:spPr>
+                </pic:pic>
+              </a:graphicData>
+            </a:graphic>
+          </wp:inline>
+        </w:drawing>
+      </w:r>
+    </w:p>
+    <w:p>
+      <w:pPr>
+        <w:pStyle w:val="ListParagraph"/>
+        <w:numPr>
+          <w:ilvl w:val="0"/>
+          <w:numId w:val="1"/>
+        </w:numPr>
+        <w:jc w:val="both"/>
+        <w:rPr>
+          <w:rFonts w:ascii="Times New Roman" w:hAnsi="Times New Roman" w:cs="Times New Roman"/>
+          <w:sz w:val="28"/>
+          <w:szCs w:val="28"/>
+        </w:rPr>
+      </w:pPr>
+      <w:proofErr w:type="spellStart"/>
+      <w:r>
+        <w:rPr>
+          <w:rFonts w:ascii="Times New Roman" w:hAnsi="Times New Roman" w:cs="Times New Roman"/>
+          <w:sz w:val="28"/>
+          <w:szCs w:val="28"/>
+        </w:rPr>
+        <w:t>Hướng</w:t>
+      </w:r>
+      <w:proofErr w:type="spellEnd"/>
+      <w:r>
+        <w:rPr>
+          <w:rFonts w:ascii="Times New Roman" w:hAnsi="Times New Roman" w:cs="Times New Roman"/>
+          <w:sz w:val="28"/>
+          <w:szCs w:val="28"/>
+        </w:rPr>
+        <w:t xml:space="preserve"> </w:t>
+      </w:r>
+      <w:proofErr w:type="spellStart"/>
+      <w:r>
+        <w:rPr>
+          <w:rFonts w:ascii="Times New Roman" w:hAnsi="Times New Roman" w:cs="Times New Roman"/>
+          <w:sz w:val="28"/>
+          <w:szCs w:val="28"/>
+        </w:rPr>
+        <w:t>dẫn</w:t>
+      </w:r>
+      <w:proofErr w:type="spellEnd"/>
+      <w:r>
+        <w:rPr>
+          <w:rFonts w:ascii="Times New Roman" w:hAnsi="Times New Roman" w:cs="Times New Roman"/>
+          <w:sz w:val="28"/>
+          <w:szCs w:val="28"/>
+        </w:rPr>
+        <w:t xml:space="preserve"> </w:t>
+      </w:r>
+      <w:proofErr w:type="spellStart"/>
+      <w:r>
+        <w:rPr>
+          <w:rFonts w:ascii="Times New Roman" w:hAnsi="Times New Roman" w:cs="Times New Roman"/>
+          <w:sz w:val="28"/>
+          <w:szCs w:val="28"/>
+        </w:rPr>
+        <w:t>chạy</w:t>
+      </w:r>
+      <w:proofErr w:type="spellEnd"/>
+      <w:r>
+        <w:rPr>
+          <w:rFonts w:ascii="Times New Roman" w:hAnsi="Times New Roman" w:cs="Times New Roman"/>
+          <w:sz w:val="28"/>
+          <w:szCs w:val="28"/>
+        </w:rPr>
+        <w:t xml:space="preserve"> file</w:t>
+      </w:r>
+      <w:r>
+        <w:rPr>
+          <w:rFonts w:ascii="Times New Roman" w:hAnsi="Times New Roman" w:cs="Times New Roman"/>
+          <w:sz w:val="28"/>
+          <w:szCs w:val="28"/>
+        </w:rPr>
+        <w:t xml:space="preserve"> BoiSoCua3.</w:t>
+      </w:r>
+      <w:r>
+        <w:rPr>
+          <w:rFonts w:ascii="Times New Roman" w:hAnsi="Times New Roman" w:cs="Times New Roman"/>
+          <w:sz w:val="28"/>
+          <w:szCs w:val="28"/>
+        </w:rPr>
+        <w:t>sh</w:t>
+      </w:r>
+      <w:r>
+        <w:rPr>
+          <w:rFonts w:ascii="Times New Roman" w:hAnsi="Times New Roman" w:cs="Times New Roman"/>
+          <w:sz w:val="28"/>
+          <w:szCs w:val="28"/>
+        </w:rPr>
+        <w:t>:</w:t>
+      </w:r>
+    </w:p>
+    <w:p>
+      <w:pPr>
+        <w:pStyle w:val="ListParagraph"/>
+        <w:numPr>
+          <w:ilvl w:val="1"/>
+          <w:numId w:val="1"/>
+        </w:numPr>
+        <w:jc w:val="both"/>
+        <w:rPr>
+          <w:rFonts w:ascii="Times New Roman" w:hAnsi="Times New Roman" w:cs="Times New Roman"/>
+          <w:sz w:val="28"/>
+          <w:szCs w:val="28"/>
+        </w:rPr>
+      </w:pPr>
+    </w:p>
+    <w:p>
+      <w:pPr>
+        <w:jc w:val="both"/>
+        <w:rPr>
+          <w:rFonts w:ascii="Times New Roman" w:hAnsi="Times New Roman" w:cs="Times New Roman"/>
           <w:sz w:val="28"/>
           <w:szCs w:val="28"/>
         </w:rPr>
@@ -2667,7 +3780,7 @@
   <w:abstractNum w:abstractNumId="0" w15:restartNumberingAfterBreak="0">
     <w:nsid w:val="38DC1065"/>
     <w:multiLevelType w:val="hybridMultilevel"/>
-    <w:tmpl w:val="86BECD02"/>
+    <w:tmpl w:val="E5B6FB32"/>
     <w:lvl w:ilvl="0" w:tplc="04090001">
       <w:start w:val="1"/>
       <w:numFmt w:val="bullet"/>
@@ -2680,7 +3793,7 @@
         <w:rFonts w:ascii="Symbol" w:hAnsi="Symbol" w:hint="default"/>
       </w:rPr>
     </w:lvl>
-    <w:lvl w:ilvl="1" w:tplc="04090003" w:tentative="1">
+    <w:lvl w:ilvl="1" w:tplc="04090003">
       <w:start w:val="1"/>
       <w:numFmt w:val="bullet"/>
       <w:lvlText w:val="o"/>

</xml_diff>

<commit_message>
Xong giải thích 2 câu
</commit_message>
<xml_diff>
--- a/Git stash.docx
+++ b/Git stash.docx
@@ -14,6 +14,7 @@
           <w:u w:val="single"/>
         </w:rPr>
       </w:pPr>
+      <w:proofErr w:type="spellStart"/>
       <w:r>
         <w:rPr>
           <w:rFonts w:ascii="Times New Roman" w:hAnsi="Times New Roman" w:cs="Times New Roman"/>
@@ -23,7 +24,19 @@
           <w:szCs w:val="28"/>
           <w:u w:val="single"/>
         </w:rPr>
-        <w:t>Câu 1:</w:t>
+        <w:t>Câu</w:t>
+      </w:r>
+      <w:proofErr w:type="spellEnd"/>
+      <w:r>
+        <w:rPr>
+          <w:rFonts w:ascii="Times New Roman" w:hAnsi="Times New Roman" w:cs="Times New Roman"/>
+          <w:b/>
+          <w:bCs/>
+          <w:sz w:val="28"/>
+          <w:szCs w:val="28"/>
+          <w:u w:val="single"/>
+        </w:rPr>
+        <w:t xml:space="preserve"> 1:</w:t>
       </w:r>
     </w:p>
     <w:p>
@@ -41,47 +54,815 @@
           <w:sz w:val="28"/>
           <w:szCs w:val="28"/>
         </w:rPr>
-        <w:t>Git stash là lệnh để tạm lưu các thay đổi trong nhánh hiện tại</w:t>
-      </w:r>
-      <w:r>
-        <w:rPr>
-          <w:rFonts w:ascii="Times New Roman" w:hAnsi="Times New Roman" w:cs="Times New Roman"/>
-          <w:sz w:val="28"/>
-          <w:szCs w:val="28"/>
-        </w:rPr>
-        <w:t xml:space="preserve"> vào trong 1 stack</w:t>
-      </w:r>
-      <w:r>
-        <w:rPr>
-          <w:rFonts w:ascii="Times New Roman" w:hAnsi="Times New Roman" w:cs="Times New Roman"/>
-          <w:sz w:val="28"/>
-          <w:szCs w:val="28"/>
-        </w:rPr>
-        <w:t xml:space="preserve"> để tránh các xung đột xảy ra khi push thay đổi lên</w:t>
-      </w:r>
-      <w:r>
-        <w:rPr>
-          <w:rFonts w:ascii="Times New Roman" w:hAnsi="Times New Roman" w:cs="Times New Roman"/>
-          <w:sz w:val="28"/>
-          <w:szCs w:val="28"/>
-        </w:rPr>
-        <w:t xml:space="preserve"> hoặc pull thay đổi về từ</w:t>
-      </w:r>
-      <w:r>
-        <w:rPr>
-          <w:rFonts w:ascii="Times New Roman" w:hAnsi="Times New Roman" w:cs="Times New Roman"/>
-          <w:sz w:val="28"/>
-          <w:szCs w:val="28"/>
-        </w:rPr>
-        <w:t xml:space="preserve"> repo chung.</w:t>
-      </w:r>
-      <w:r>
-        <w:rPr>
-          <w:rFonts w:ascii="Times New Roman" w:hAnsi="Times New Roman" w:cs="Times New Roman"/>
-          <w:sz w:val="28"/>
-          <w:szCs w:val="28"/>
-        </w:rPr>
-        <w:t xml:space="preserve"> Những file được tạm lưu sẽ tạm thời biến mất khỏi local repo của người dùng.</w:t>
+        <w:t xml:space="preserve">Git stash </w:t>
+      </w:r>
+      <w:proofErr w:type="spellStart"/>
+      <w:r>
+        <w:rPr>
+          <w:rFonts w:ascii="Times New Roman" w:hAnsi="Times New Roman" w:cs="Times New Roman"/>
+          <w:sz w:val="28"/>
+          <w:szCs w:val="28"/>
+        </w:rPr>
+        <w:t>là</w:t>
+      </w:r>
+      <w:proofErr w:type="spellEnd"/>
+      <w:r>
+        <w:rPr>
+          <w:rFonts w:ascii="Times New Roman" w:hAnsi="Times New Roman" w:cs="Times New Roman"/>
+          <w:sz w:val="28"/>
+          <w:szCs w:val="28"/>
+        </w:rPr>
+        <w:t xml:space="preserve"> </w:t>
+      </w:r>
+      <w:proofErr w:type="spellStart"/>
+      <w:r>
+        <w:rPr>
+          <w:rFonts w:ascii="Times New Roman" w:hAnsi="Times New Roman" w:cs="Times New Roman"/>
+          <w:sz w:val="28"/>
+          <w:szCs w:val="28"/>
+        </w:rPr>
+        <w:t>lệnh</w:t>
+      </w:r>
+      <w:proofErr w:type="spellEnd"/>
+      <w:r>
+        <w:rPr>
+          <w:rFonts w:ascii="Times New Roman" w:hAnsi="Times New Roman" w:cs="Times New Roman"/>
+          <w:sz w:val="28"/>
+          <w:szCs w:val="28"/>
+        </w:rPr>
+        <w:t xml:space="preserve"> </w:t>
+      </w:r>
+      <w:proofErr w:type="spellStart"/>
+      <w:r>
+        <w:rPr>
+          <w:rFonts w:ascii="Times New Roman" w:hAnsi="Times New Roman" w:cs="Times New Roman"/>
+          <w:sz w:val="28"/>
+          <w:szCs w:val="28"/>
+        </w:rPr>
+        <w:t>để</w:t>
+      </w:r>
+      <w:proofErr w:type="spellEnd"/>
+      <w:r>
+        <w:rPr>
+          <w:rFonts w:ascii="Times New Roman" w:hAnsi="Times New Roman" w:cs="Times New Roman"/>
+          <w:sz w:val="28"/>
+          <w:szCs w:val="28"/>
+        </w:rPr>
+        <w:t xml:space="preserve"> </w:t>
+      </w:r>
+      <w:proofErr w:type="spellStart"/>
+      <w:r>
+        <w:rPr>
+          <w:rFonts w:ascii="Times New Roman" w:hAnsi="Times New Roman" w:cs="Times New Roman"/>
+          <w:sz w:val="28"/>
+          <w:szCs w:val="28"/>
+        </w:rPr>
+        <w:t>tạm</w:t>
+      </w:r>
+      <w:proofErr w:type="spellEnd"/>
+      <w:r>
+        <w:rPr>
+          <w:rFonts w:ascii="Times New Roman" w:hAnsi="Times New Roman" w:cs="Times New Roman"/>
+          <w:sz w:val="28"/>
+          <w:szCs w:val="28"/>
+        </w:rPr>
+        <w:t xml:space="preserve"> </w:t>
+      </w:r>
+      <w:proofErr w:type="spellStart"/>
+      <w:r>
+        <w:rPr>
+          <w:rFonts w:ascii="Times New Roman" w:hAnsi="Times New Roman" w:cs="Times New Roman"/>
+          <w:sz w:val="28"/>
+          <w:szCs w:val="28"/>
+        </w:rPr>
+        <w:t>lưu</w:t>
+      </w:r>
+      <w:proofErr w:type="spellEnd"/>
+      <w:r>
+        <w:rPr>
+          <w:rFonts w:ascii="Times New Roman" w:hAnsi="Times New Roman" w:cs="Times New Roman"/>
+          <w:sz w:val="28"/>
+          <w:szCs w:val="28"/>
+        </w:rPr>
+        <w:t xml:space="preserve"> </w:t>
+      </w:r>
+      <w:proofErr w:type="spellStart"/>
+      <w:r>
+        <w:rPr>
+          <w:rFonts w:ascii="Times New Roman" w:hAnsi="Times New Roman" w:cs="Times New Roman"/>
+          <w:sz w:val="28"/>
+          <w:szCs w:val="28"/>
+        </w:rPr>
+        <w:t>các</w:t>
+      </w:r>
+      <w:proofErr w:type="spellEnd"/>
+      <w:r>
+        <w:rPr>
+          <w:rFonts w:ascii="Times New Roman" w:hAnsi="Times New Roman" w:cs="Times New Roman"/>
+          <w:sz w:val="28"/>
+          <w:szCs w:val="28"/>
+        </w:rPr>
+        <w:t xml:space="preserve"> </w:t>
+      </w:r>
+      <w:proofErr w:type="spellStart"/>
+      <w:r>
+        <w:rPr>
+          <w:rFonts w:ascii="Times New Roman" w:hAnsi="Times New Roman" w:cs="Times New Roman"/>
+          <w:sz w:val="28"/>
+          <w:szCs w:val="28"/>
+        </w:rPr>
+        <w:t>thay</w:t>
+      </w:r>
+      <w:proofErr w:type="spellEnd"/>
+      <w:r>
+        <w:rPr>
+          <w:rFonts w:ascii="Times New Roman" w:hAnsi="Times New Roman" w:cs="Times New Roman"/>
+          <w:sz w:val="28"/>
+          <w:szCs w:val="28"/>
+        </w:rPr>
+        <w:t xml:space="preserve"> </w:t>
+      </w:r>
+      <w:proofErr w:type="spellStart"/>
+      <w:r>
+        <w:rPr>
+          <w:rFonts w:ascii="Times New Roman" w:hAnsi="Times New Roman" w:cs="Times New Roman"/>
+          <w:sz w:val="28"/>
+          <w:szCs w:val="28"/>
+        </w:rPr>
+        <w:t>đổi</w:t>
+      </w:r>
+      <w:proofErr w:type="spellEnd"/>
+      <w:r>
+        <w:rPr>
+          <w:rFonts w:ascii="Times New Roman" w:hAnsi="Times New Roman" w:cs="Times New Roman"/>
+          <w:sz w:val="28"/>
+          <w:szCs w:val="28"/>
+        </w:rPr>
+        <w:t xml:space="preserve"> </w:t>
+      </w:r>
+      <w:proofErr w:type="spellStart"/>
+      <w:r>
+        <w:rPr>
+          <w:rFonts w:ascii="Times New Roman" w:hAnsi="Times New Roman" w:cs="Times New Roman"/>
+          <w:sz w:val="28"/>
+          <w:szCs w:val="28"/>
+        </w:rPr>
+        <w:t>trong</w:t>
+      </w:r>
+      <w:proofErr w:type="spellEnd"/>
+      <w:r>
+        <w:rPr>
+          <w:rFonts w:ascii="Times New Roman" w:hAnsi="Times New Roman" w:cs="Times New Roman"/>
+          <w:sz w:val="28"/>
+          <w:szCs w:val="28"/>
+        </w:rPr>
+        <w:t xml:space="preserve"> </w:t>
+      </w:r>
+      <w:proofErr w:type="spellStart"/>
+      <w:r>
+        <w:rPr>
+          <w:rFonts w:ascii="Times New Roman" w:hAnsi="Times New Roman" w:cs="Times New Roman"/>
+          <w:sz w:val="28"/>
+          <w:szCs w:val="28"/>
+        </w:rPr>
+        <w:t>nhánh</w:t>
+      </w:r>
+      <w:proofErr w:type="spellEnd"/>
+      <w:r>
+        <w:rPr>
+          <w:rFonts w:ascii="Times New Roman" w:hAnsi="Times New Roman" w:cs="Times New Roman"/>
+          <w:sz w:val="28"/>
+          <w:szCs w:val="28"/>
+        </w:rPr>
+        <w:t xml:space="preserve"> </w:t>
+      </w:r>
+      <w:proofErr w:type="spellStart"/>
+      <w:r>
+        <w:rPr>
+          <w:rFonts w:ascii="Times New Roman" w:hAnsi="Times New Roman" w:cs="Times New Roman"/>
+          <w:sz w:val="28"/>
+          <w:szCs w:val="28"/>
+        </w:rPr>
+        <w:t>hiện</w:t>
+      </w:r>
+      <w:proofErr w:type="spellEnd"/>
+      <w:r>
+        <w:rPr>
+          <w:rFonts w:ascii="Times New Roman" w:hAnsi="Times New Roman" w:cs="Times New Roman"/>
+          <w:sz w:val="28"/>
+          <w:szCs w:val="28"/>
+        </w:rPr>
+        <w:t xml:space="preserve"> </w:t>
+      </w:r>
+      <w:proofErr w:type="spellStart"/>
+      <w:r>
+        <w:rPr>
+          <w:rFonts w:ascii="Times New Roman" w:hAnsi="Times New Roman" w:cs="Times New Roman"/>
+          <w:sz w:val="28"/>
+          <w:szCs w:val="28"/>
+        </w:rPr>
+        <w:t>tại</w:t>
+      </w:r>
+      <w:proofErr w:type="spellEnd"/>
+      <w:r>
+        <w:rPr>
+          <w:rFonts w:ascii="Times New Roman" w:hAnsi="Times New Roman" w:cs="Times New Roman"/>
+          <w:sz w:val="28"/>
+          <w:szCs w:val="28"/>
+        </w:rPr>
+        <w:t xml:space="preserve"> </w:t>
+      </w:r>
+      <w:proofErr w:type="spellStart"/>
+      <w:r>
+        <w:rPr>
+          <w:rFonts w:ascii="Times New Roman" w:hAnsi="Times New Roman" w:cs="Times New Roman"/>
+          <w:sz w:val="28"/>
+          <w:szCs w:val="28"/>
+        </w:rPr>
+        <w:t>vào</w:t>
+      </w:r>
+      <w:proofErr w:type="spellEnd"/>
+      <w:r>
+        <w:rPr>
+          <w:rFonts w:ascii="Times New Roman" w:hAnsi="Times New Roman" w:cs="Times New Roman"/>
+          <w:sz w:val="28"/>
+          <w:szCs w:val="28"/>
+        </w:rPr>
+        <w:t xml:space="preserve"> </w:t>
+      </w:r>
+      <w:proofErr w:type="spellStart"/>
+      <w:r>
+        <w:rPr>
+          <w:rFonts w:ascii="Times New Roman" w:hAnsi="Times New Roman" w:cs="Times New Roman"/>
+          <w:sz w:val="28"/>
+          <w:szCs w:val="28"/>
+        </w:rPr>
+        <w:t>trong</w:t>
+      </w:r>
+      <w:proofErr w:type="spellEnd"/>
+      <w:r>
+        <w:rPr>
+          <w:rFonts w:ascii="Times New Roman" w:hAnsi="Times New Roman" w:cs="Times New Roman"/>
+          <w:sz w:val="28"/>
+          <w:szCs w:val="28"/>
+        </w:rPr>
+        <w:t xml:space="preserve"> 1 stack</w:t>
+      </w:r>
+      <w:r>
+        <w:rPr>
+          <w:rFonts w:ascii="Times New Roman" w:hAnsi="Times New Roman" w:cs="Times New Roman"/>
+          <w:sz w:val="28"/>
+          <w:szCs w:val="28"/>
+        </w:rPr>
+        <w:t xml:space="preserve"> </w:t>
+      </w:r>
+      <w:proofErr w:type="spellStart"/>
+      <w:r>
+        <w:rPr>
+          <w:rFonts w:ascii="Times New Roman" w:hAnsi="Times New Roman" w:cs="Times New Roman"/>
+          <w:sz w:val="28"/>
+          <w:szCs w:val="28"/>
+        </w:rPr>
+        <w:t>để</w:t>
+      </w:r>
+      <w:proofErr w:type="spellEnd"/>
+      <w:r>
+        <w:rPr>
+          <w:rFonts w:ascii="Times New Roman" w:hAnsi="Times New Roman" w:cs="Times New Roman"/>
+          <w:sz w:val="28"/>
+          <w:szCs w:val="28"/>
+        </w:rPr>
+        <w:t xml:space="preserve"> </w:t>
+      </w:r>
+      <w:proofErr w:type="spellStart"/>
+      <w:r>
+        <w:rPr>
+          <w:rFonts w:ascii="Times New Roman" w:hAnsi="Times New Roman" w:cs="Times New Roman"/>
+          <w:sz w:val="28"/>
+          <w:szCs w:val="28"/>
+        </w:rPr>
+        <w:t>tránh</w:t>
+      </w:r>
+      <w:proofErr w:type="spellEnd"/>
+      <w:r>
+        <w:rPr>
+          <w:rFonts w:ascii="Times New Roman" w:hAnsi="Times New Roman" w:cs="Times New Roman"/>
+          <w:sz w:val="28"/>
+          <w:szCs w:val="28"/>
+        </w:rPr>
+        <w:t xml:space="preserve"> </w:t>
+      </w:r>
+      <w:proofErr w:type="spellStart"/>
+      <w:r>
+        <w:rPr>
+          <w:rFonts w:ascii="Times New Roman" w:hAnsi="Times New Roman" w:cs="Times New Roman"/>
+          <w:sz w:val="28"/>
+          <w:szCs w:val="28"/>
+        </w:rPr>
+        <w:t>các</w:t>
+      </w:r>
+      <w:proofErr w:type="spellEnd"/>
+      <w:r>
+        <w:rPr>
+          <w:rFonts w:ascii="Times New Roman" w:hAnsi="Times New Roman" w:cs="Times New Roman"/>
+          <w:sz w:val="28"/>
+          <w:szCs w:val="28"/>
+        </w:rPr>
+        <w:t xml:space="preserve"> </w:t>
+      </w:r>
+      <w:proofErr w:type="spellStart"/>
+      <w:r>
+        <w:rPr>
+          <w:rFonts w:ascii="Times New Roman" w:hAnsi="Times New Roman" w:cs="Times New Roman"/>
+          <w:sz w:val="28"/>
+          <w:szCs w:val="28"/>
+        </w:rPr>
+        <w:t>xung</w:t>
+      </w:r>
+      <w:proofErr w:type="spellEnd"/>
+      <w:r>
+        <w:rPr>
+          <w:rFonts w:ascii="Times New Roman" w:hAnsi="Times New Roman" w:cs="Times New Roman"/>
+          <w:sz w:val="28"/>
+          <w:szCs w:val="28"/>
+        </w:rPr>
+        <w:t xml:space="preserve"> </w:t>
+      </w:r>
+      <w:proofErr w:type="spellStart"/>
+      <w:r>
+        <w:rPr>
+          <w:rFonts w:ascii="Times New Roman" w:hAnsi="Times New Roman" w:cs="Times New Roman"/>
+          <w:sz w:val="28"/>
+          <w:szCs w:val="28"/>
+        </w:rPr>
+        <w:t>đột</w:t>
+      </w:r>
+      <w:proofErr w:type="spellEnd"/>
+      <w:r>
+        <w:rPr>
+          <w:rFonts w:ascii="Times New Roman" w:hAnsi="Times New Roman" w:cs="Times New Roman"/>
+          <w:sz w:val="28"/>
+          <w:szCs w:val="28"/>
+        </w:rPr>
+        <w:t xml:space="preserve"> </w:t>
+      </w:r>
+      <w:proofErr w:type="spellStart"/>
+      <w:r>
+        <w:rPr>
+          <w:rFonts w:ascii="Times New Roman" w:hAnsi="Times New Roman" w:cs="Times New Roman"/>
+          <w:sz w:val="28"/>
+          <w:szCs w:val="28"/>
+        </w:rPr>
+        <w:t>xảy</w:t>
+      </w:r>
+      <w:proofErr w:type="spellEnd"/>
+      <w:r>
+        <w:rPr>
+          <w:rFonts w:ascii="Times New Roman" w:hAnsi="Times New Roman" w:cs="Times New Roman"/>
+          <w:sz w:val="28"/>
+          <w:szCs w:val="28"/>
+        </w:rPr>
+        <w:t xml:space="preserve"> </w:t>
+      </w:r>
+      <w:proofErr w:type="spellStart"/>
+      <w:r>
+        <w:rPr>
+          <w:rFonts w:ascii="Times New Roman" w:hAnsi="Times New Roman" w:cs="Times New Roman"/>
+          <w:sz w:val="28"/>
+          <w:szCs w:val="28"/>
+        </w:rPr>
+        <w:t>ra</w:t>
+      </w:r>
+      <w:proofErr w:type="spellEnd"/>
+      <w:r>
+        <w:rPr>
+          <w:rFonts w:ascii="Times New Roman" w:hAnsi="Times New Roman" w:cs="Times New Roman"/>
+          <w:sz w:val="28"/>
+          <w:szCs w:val="28"/>
+        </w:rPr>
+        <w:t xml:space="preserve"> </w:t>
+      </w:r>
+      <w:proofErr w:type="spellStart"/>
+      <w:r>
+        <w:rPr>
+          <w:rFonts w:ascii="Times New Roman" w:hAnsi="Times New Roman" w:cs="Times New Roman"/>
+          <w:sz w:val="28"/>
+          <w:szCs w:val="28"/>
+        </w:rPr>
+        <w:t>khi</w:t>
+      </w:r>
+      <w:proofErr w:type="spellEnd"/>
+      <w:r>
+        <w:rPr>
+          <w:rFonts w:ascii="Times New Roman" w:hAnsi="Times New Roman" w:cs="Times New Roman"/>
+          <w:sz w:val="28"/>
+          <w:szCs w:val="28"/>
+        </w:rPr>
+        <w:t xml:space="preserve"> push </w:t>
+      </w:r>
+      <w:proofErr w:type="spellStart"/>
+      <w:r>
+        <w:rPr>
+          <w:rFonts w:ascii="Times New Roman" w:hAnsi="Times New Roman" w:cs="Times New Roman"/>
+          <w:sz w:val="28"/>
+          <w:szCs w:val="28"/>
+        </w:rPr>
+        <w:t>thay</w:t>
+      </w:r>
+      <w:proofErr w:type="spellEnd"/>
+      <w:r>
+        <w:rPr>
+          <w:rFonts w:ascii="Times New Roman" w:hAnsi="Times New Roman" w:cs="Times New Roman"/>
+          <w:sz w:val="28"/>
+          <w:szCs w:val="28"/>
+        </w:rPr>
+        <w:t xml:space="preserve"> </w:t>
+      </w:r>
+      <w:proofErr w:type="spellStart"/>
+      <w:r>
+        <w:rPr>
+          <w:rFonts w:ascii="Times New Roman" w:hAnsi="Times New Roman" w:cs="Times New Roman"/>
+          <w:sz w:val="28"/>
+          <w:szCs w:val="28"/>
+        </w:rPr>
+        <w:t>đổi</w:t>
+      </w:r>
+      <w:proofErr w:type="spellEnd"/>
+      <w:r>
+        <w:rPr>
+          <w:rFonts w:ascii="Times New Roman" w:hAnsi="Times New Roman" w:cs="Times New Roman"/>
+          <w:sz w:val="28"/>
+          <w:szCs w:val="28"/>
+        </w:rPr>
+        <w:t xml:space="preserve"> </w:t>
+      </w:r>
+      <w:proofErr w:type="spellStart"/>
+      <w:r>
+        <w:rPr>
+          <w:rFonts w:ascii="Times New Roman" w:hAnsi="Times New Roman" w:cs="Times New Roman"/>
+          <w:sz w:val="28"/>
+          <w:szCs w:val="28"/>
+        </w:rPr>
+        <w:t>lên</w:t>
+      </w:r>
+      <w:proofErr w:type="spellEnd"/>
+      <w:r>
+        <w:rPr>
+          <w:rFonts w:ascii="Times New Roman" w:hAnsi="Times New Roman" w:cs="Times New Roman"/>
+          <w:sz w:val="28"/>
+          <w:szCs w:val="28"/>
+        </w:rPr>
+        <w:t xml:space="preserve"> </w:t>
+      </w:r>
+      <w:proofErr w:type="spellStart"/>
+      <w:r>
+        <w:rPr>
+          <w:rFonts w:ascii="Times New Roman" w:hAnsi="Times New Roman" w:cs="Times New Roman"/>
+          <w:sz w:val="28"/>
+          <w:szCs w:val="28"/>
+        </w:rPr>
+        <w:t>hoặc</w:t>
+      </w:r>
+      <w:proofErr w:type="spellEnd"/>
+      <w:r>
+        <w:rPr>
+          <w:rFonts w:ascii="Times New Roman" w:hAnsi="Times New Roman" w:cs="Times New Roman"/>
+          <w:sz w:val="28"/>
+          <w:szCs w:val="28"/>
+        </w:rPr>
+        <w:t xml:space="preserve"> pull </w:t>
+      </w:r>
+      <w:proofErr w:type="spellStart"/>
+      <w:r>
+        <w:rPr>
+          <w:rFonts w:ascii="Times New Roman" w:hAnsi="Times New Roman" w:cs="Times New Roman"/>
+          <w:sz w:val="28"/>
+          <w:szCs w:val="28"/>
+        </w:rPr>
+        <w:t>thay</w:t>
+      </w:r>
+      <w:proofErr w:type="spellEnd"/>
+      <w:r>
+        <w:rPr>
+          <w:rFonts w:ascii="Times New Roman" w:hAnsi="Times New Roman" w:cs="Times New Roman"/>
+          <w:sz w:val="28"/>
+          <w:szCs w:val="28"/>
+        </w:rPr>
+        <w:t xml:space="preserve"> </w:t>
+      </w:r>
+      <w:proofErr w:type="spellStart"/>
+      <w:r>
+        <w:rPr>
+          <w:rFonts w:ascii="Times New Roman" w:hAnsi="Times New Roman" w:cs="Times New Roman"/>
+          <w:sz w:val="28"/>
+          <w:szCs w:val="28"/>
+        </w:rPr>
+        <w:t>đổi</w:t>
+      </w:r>
+      <w:proofErr w:type="spellEnd"/>
+      <w:r>
+        <w:rPr>
+          <w:rFonts w:ascii="Times New Roman" w:hAnsi="Times New Roman" w:cs="Times New Roman"/>
+          <w:sz w:val="28"/>
+          <w:szCs w:val="28"/>
+        </w:rPr>
+        <w:t xml:space="preserve"> </w:t>
+      </w:r>
+      <w:proofErr w:type="spellStart"/>
+      <w:r>
+        <w:rPr>
+          <w:rFonts w:ascii="Times New Roman" w:hAnsi="Times New Roman" w:cs="Times New Roman"/>
+          <w:sz w:val="28"/>
+          <w:szCs w:val="28"/>
+        </w:rPr>
+        <w:t>về</w:t>
+      </w:r>
+      <w:proofErr w:type="spellEnd"/>
+      <w:r>
+        <w:rPr>
+          <w:rFonts w:ascii="Times New Roman" w:hAnsi="Times New Roman" w:cs="Times New Roman"/>
+          <w:sz w:val="28"/>
+          <w:szCs w:val="28"/>
+        </w:rPr>
+        <w:t xml:space="preserve"> </w:t>
+      </w:r>
+      <w:proofErr w:type="spellStart"/>
+      <w:r>
+        <w:rPr>
+          <w:rFonts w:ascii="Times New Roman" w:hAnsi="Times New Roman" w:cs="Times New Roman"/>
+          <w:sz w:val="28"/>
+          <w:szCs w:val="28"/>
+        </w:rPr>
+        <w:t>từ</w:t>
+      </w:r>
+      <w:proofErr w:type="spellEnd"/>
+      <w:r>
+        <w:rPr>
+          <w:rFonts w:ascii="Times New Roman" w:hAnsi="Times New Roman" w:cs="Times New Roman"/>
+          <w:sz w:val="28"/>
+          <w:szCs w:val="28"/>
+        </w:rPr>
+        <w:t xml:space="preserve"> repo </w:t>
+      </w:r>
+      <w:proofErr w:type="spellStart"/>
+      <w:r>
+        <w:rPr>
+          <w:rFonts w:ascii="Times New Roman" w:hAnsi="Times New Roman" w:cs="Times New Roman"/>
+          <w:sz w:val="28"/>
+          <w:szCs w:val="28"/>
+        </w:rPr>
+        <w:t>chung</w:t>
+      </w:r>
+      <w:proofErr w:type="spellEnd"/>
+      <w:r>
+        <w:rPr>
+          <w:rFonts w:ascii="Times New Roman" w:hAnsi="Times New Roman" w:cs="Times New Roman"/>
+          <w:sz w:val="28"/>
+          <w:szCs w:val="28"/>
+        </w:rPr>
+        <w:t>.</w:t>
+      </w:r>
+      <w:r>
+        <w:rPr>
+          <w:rFonts w:ascii="Times New Roman" w:hAnsi="Times New Roman" w:cs="Times New Roman"/>
+          <w:sz w:val="28"/>
+          <w:szCs w:val="28"/>
+        </w:rPr>
+        <w:t xml:space="preserve"> </w:t>
+      </w:r>
+      <w:proofErr w:type="spellStart"/>
+      <w:r>
+        <w:rPr>
+          <w:rFonts w:ascii="Times New Roman" w:hAnsi="Times New Roman" w:cs="Times New Roman"/>
+          <w:sz w:val="28"/>
+          <w:szCs w:val="28"/>
+        </w:rPr>
+        <w:t>Những</w:t>
+      </w:r>
+      <w:proofErr w:type="spellEnd"/>
+      <w:r>
+        <w:rPr>
+          <w:rFonts w:ascii="Times New Roman" w:hAnsi="Times New Roman" w:cs="Times New Roman"/>
+          <w:sz w:val="28"/>
+          <w:szCs w:val="28"/>
+        </w:rPr>
+        <w:t xml:space="preserve"> file </w:t>
+      </w:r>
+      <w:proofErr w:type="spellStart"/>
+      <w:r>
+        <w:rPr>
+          <w:rFonts w:ascii="Times New Roman" w:hAnsi="Times New Roman" w:cs="Times New Roman"/>
+          <w:sz w:val="28"/>
+          <w:szCs w:val="28"/>
+        </w:rPr>
+        <w:t>được</w:t>
+      </w:r>
+      <w:proofErr w:type="spellEnd"/>
+      <w:r>
+        <w:rPr>
+          <w:rFonts w:ascii="Times New Roman" w:hAnsi="Times New Roman" w:cs="Times New Roman"/>
+          <w:sz w:val="28"/>
+          <w:szCs w:val="28"/>
+        </w:rPr>
+        <w:t xml:space="preserve"> </w:t>
+      </w:r>
+      <w:proofErr w:type="spellStart"/>
+      <w:r>
+        <w:rPr>
+          <w:rFonts w:ascii="Times New Roman" w:hAnsi="Times New Roman" w:cs="Times New Roman"/>
+          <w:sz w:val="28"/>
+          <w:szCs w:val="28"/>
+        </w:rPr>
+        <w:t>tạm</w:t>
+      </w:r>
+      <w:proofErr w:type="spellEnd"/>
+      <w:r>
+        <w:rPr>
+          <w:rFonts w:ascii="Times New Roman" w:hAnsi="Times New Roman" w:cs="Times New Roman"/>
+          <w:sz w:val="28"/>
+          <w:szCs w:val="28"/>
+        </w:rPr>
+        <w:t xml:space="preserve"> </w:t>
+      </w:r>
+      <w:proofErr w:type="spellStart"/>
+      <w:r>
+        <w:rPr>
+          <w:rFonts w:ascii="Times New Roman" w:hAnsi="Times New Roman" w:cs="Times New Roman"/>
+          <w:sz w:val="28"/>
+          <w:szCs w:val="28"/>
+        </w:rPr>
+        <w:t>lưu</w:t>
+      </w:r>
+      <w:proofErr w:type="spellEnd"/>
+      <w:r>
+        <w:rPr>
+          <w:rFonts w:ascii="Times New Roman" w:hAnsi="Times New Roman" w:cs="Times New Roman"/>
+          <w:sz w:val="28"/>
+          <w:szCs w:val="28"/>
+        </w:rPr>
+        <w:t xml:space="preserve"> </w:t>
+      </w:r>
+      <w:proofErr w:type="spellStart"/>
+      <w:r>
+        <w:rPr>
+          <w:rFonts w:ascii="Times New Roman" w:hAnsi="Times New Roman" w:cs="Times New Roman"/>
+          <w:sz w:val="28"/>
+          <w:szCs w:val="28"/>
+        </w:rPr>
+        <w:t>sẽ</w:t>
+      </w:r>
+      <w:proofErr w:type="spellEnd"/>
+      <w:r>
+        <w:rPr>
+          <w:rFonts w:ascii="Times New Roman" w:hAnsi="Times New Roman" w:cs="Times New Roman"/>
+          <w:sz w:val="28"/>
+          <w:szCs w:val="28"/>
+        </w:rPr>
+        <w:t xml:space="preserve"> </w:t>
+      </w:r>
+      <w:proofErr w:type="spellStart"/>
+      <w:r>
+        <w:rPr>
+          <w:rFonts w:ascii="Times New Roman" w:hAnsi="Times New Roman" w:cs="Times New Roman"/>
+          <w:sz w:val="28"/>
+          <w:szCs w:val="28"/>
+        </w:rPr>
+        <w:t>tạm</w:t>
+      </w:r>
+      <w:proofErr w:type="spellEnd"/>
+      <w:r>
+        <w:rPr>
+          <w:rFonts w:ascii="Times New Roman" w:hAnsi="Times New Roman" w:cs="Times New Roman"/>
+          <w:sz w:val="28"/>
+          <w:szCs w:val="28"/>
+        </w:rPr>
+        <w:t xml:space="preserve"> </w:t>
+      </w:r>
+      <w:proofErr w:type="spellStart"/>
+      <w:r>
+        <w:rPr>
+          <w:rFonts w:ascii="Times New Roman" w:hAnsi="Times New Roman" w:cs="Times New Roman"/>
+          <w:sz w:val="28"/>
+          <w:szCs w:val="28"/>
+        </w:rPr>
+        <w:t>thời</w:t>
+      </w:r>
+      <w:proofErr w:type="spellEnd"/>
+      <w:r>
+        <w:rPr>
+          <w:rFonts w:ascii="Times New Roman" w:hAnsi="Times New Roman" w:cs="Times New Roman"/>
+          <w:sz w:val="28"/>
+          <w:szCs w:val="28"/>
+        </w:rPr>
+        <w:t xml:space="preserve"> </w:t>
+      </w:r>
+      <w:proofErr w:type="spellStart"/>
+      <w:r>
+        <w:rPr>
+          <w:rFonts w:ascii="Times New Roman" w:hAnsi="Times New Roman" w:cs="Times New Roman"/>
+          <w:sz w:val="28"/>
+          <w:szCs w:val="28"/>
+        </w:rPr>
+        <w:t>biến</w:t>
+      </w:r>
+      <w:proofErr w:type="spellEnd"/>
+      <w:r>
+        <w:rPr>
+          <w:rFonts w:ascii="Times New Roman" w:hAnsi="Times New Roman" w:cs="Times New Roman"/>
+          <w:sz w:val="28"/>
+          <w:szCs w:val="28"/>
+        </w:rPr>
+        <w:t xml:space="preserve"> </w:t>
+      </w:r>
+      <w:proofErr w:type="spellStart"/>
+      <w:r>
+        <w:rPr>
+          <w:rFonts w:ascii="Times New Roman" w:hAnsi="Times New Roman" w:cs="Times New Roman"/>
+          <w:sz w:val="28"/>
+          <w:szCs w:val="28"/>
+        </w:rPr>
+        <w:t>mất</w:t>
+      </w:r>
+      <w:proofErr w:type="spellEnd"/>
+      <w:r>
+        <w:rPr>
+          <w:rFonts w:ascii="Times New Roman" w:hAnsi="Times New Roman" w:cs="Times New Roman"/>
+          <w:sz w:val="28"/>
+          <w:szCs w:val="28"/>
+        </w:rPr>
+        <w:t xml:space="preserve"> </w:t>
+      </w:r>
+      <w:proofErr w:type="spellStart"/>
+      <w:r>
+        <w:rPr>
+          <w:rFonts w:ascii="Times New Roman" w:hAnsi="Times New Roman" w:cs="Times New Roman"/>
+          <w:sz w:val="28"/>
+          <w:szCs w:val="28"/>
+        </w:rPr>
+        <w:t>khỏi</w:t>
+      </w:r>
+      <w:proofErr w:type="spellEnd"/>
+      <w:r>
+        <w:rPr>
+          <w:rFonts w:ascii="Times New Roman" w:hAnsi="Times New Roman" w:cs="Times New Roman"/>
+          <w:sz w:val="28"/>
+          <w:szCs w:val="28"/>
+        </w:rPr>
+        <w:t xml:space="preserve"> local repo </w:t>
+      </w:r>
+      <w:proofErr w:type="spellStart"/>
+      <w:r>
+        <w:rPr>
+          <w:rFonts w:ascii="Times New Roman" w:hAnsi="Times New Roman" w:cs="Times New Roman"/>
+          <w:sz w:val="28"/>
+          <w:szCs w:val="28"/>
+        </w:rPr>
+        <w:t>của</w:t>
+      </w:r>
+      <w:proofErr w:type="spellEnd"/>
+      <w:r>
+        <w:rPr>
+          <w:rFonts w:ascii="Times New Roman" w:hAnsi="Times New Roman" w:cs="Times New Roman"/>
+          <w:sz w:val="28"/>
+          <w:szCs w:val="28"/>
+        </w:rPr>
+        <w:t xml:space="preserve"> </w:t>
+      </w:r>
+      <w:proofErr w:type="spellStart"/>
+      <w:r>
+        <w:rPr>
+          <w:rFonts w:ascii="Times New Roman" w:hAnsi="Times New Roman" w:cs="Times New Roman"/>
+          <w:sz w:val="28"/>
+          <w:szCs w:val="28"/>
+        </w:rPr>
+        <w:t>người</w:t>
+      </w:r>
+      <w:proofErr w:type="spellEnd"/>
+      <w:r>
+        <w:rPr>
+          <w:rFonts w:ascii="Times New Roman" w:hAnsi="Times New Roman" w:cs="Times New Roman"/>
+          <w:sz w:val="28"/>
+          <w:szCs w:val="28"/>
+        </w:rPr>
+        <w:t xml:space="preserve"> </w:t>
+      </w:r>
+      <w:proofErr w:type="spellStart"/>
+      <w:r>
+        <w:rPr>
+          <w:rFonts w:ascii="Times New Roman" w:hAnsi="Times New Roman" w:cs="Times New Roman"/>
+          <w:sz w:val="28"/>
+          <w:szCs w:val="28"/>
+        </w:rPr>
+        <w:t>dùng</w:t>
+      </w:r>
+      <w:proofErr w:type="spellEnd"/>
+      <w:r>
+        <w:rPr>
+          <w:rFonts w:ascii="Times New Roman" w:hAnsi="Times New Roman" w:cs="Times New Roman"/>
+          <w:sz w:val="28"/>
+          <w:szCs w:val="28"/>
+        </w:rPr>
+        <w:t>.</w:t>
       </w:r>
     </w:p>
     <w:p>
@@ -99,7 +880,79 @@
           <w:sz w:val="28"/>
           <w:szCs w:val="28"/>
         </w:rPr>
-        <w:t>Các lệnh có liên quan:</w:t>
+        <w:t xml:space="preserve">Các </w:t>
+      </w:r>
+      <w:proofErr w:type="spellStart"/>
+      <w:r>
+        <w:rPr>
+          <w:rFonts w:ascii="Times New Roman" w:hAnsi="Times New Roman" w:cs="Times New Roman"/>
+          <w:sz w:val="28"/>
+          <w:szCs w:val="28"/>
+        </w:rPr>
+        <w:t>lệnh</w:t>
+      </w:r>
+      <w:proofErr w:type="spellEnd"/>
+      <w:r>
+        <w:rPr>
+          <w:rFonts w:ascii="Times New Roman" w:hAnsi="Times New Roman" w:cs="Times New Roman"/>
+          <w:sz w:val="28"/>
+          <w:szCs w:val="28"/>
+        </w:rPr>
+        <w:t xml:space="preserve"> </w:t>
+      </w:r>
+      <w:proofErr w:type="spellStart"/>
+      <w:r>
+        <w:rPr>
+          <w:rFonts w:ascii="Times New Roman" w:hAnsi="Times New Roman" w:cs="Times New Roman"/>
+          <w:sz w:val="28"/>
+          <w:szCs w:val="28"/>
+        </w:rPr>
+        <w:t>có</w:t>
+      </w:r>
+      <w:proofErr w:type="spellEnd"/>
+      <w:r>
+        <w:rPr>
+          <w:rFonts w:ascii="Times New Roman" w:hAnsi="Times New Roman" w:cs="Times New Roman"/>
+          <w:sz w:val="28"/>
+          <w:szCs w:val="28"/>
+        </w:rPr>
+        <w:t xml:space="preserve"> </w:t>
+      </w:r>
+      <w:proofErr w:type="spellStart"/>
+      <w:r>
+        <w:rPr>
+          <w:rFonts w:ascii="Times New Roman" w:hAnsi="Times New Roman" w:cs="Times New Roman"/>
+          <w:sz w:val="28"/>
+          <w:szCs w:val="28"/>
+        </w:rPr>
+        <w:t>liên</w:t>
+      </w:r>
+      <w:proofErr w:type="spellEnd"/>
+      <w:r>
+        <w:rPr>
+          <w:rFonts w:ascii="Times New Roman" w:hAnsi="Times New Roman" w:cs="Times New Roman"/>
+          <w:sz w:val="28"/>
+          <w:szCs w:val="28"/>
+        </w:rPr>
+        <w:t xml:space="preserve"> </w:t>
+      </w:r>
+      <w:proofErr w:type="spellStart"/>
+      <w:r>
+        <w:rPr>
+          <w:rFonts w:ascii="Times New Roman" w:hAnsi="Times New Roman" w:cs="Times New Roman"/>
+          <w:sz w:val="28"/>
+          <w:szCs w:val="28"/>
+        </w:rPr>
+        <w:t>quan</w:t>
+      </w:r>
+      <w:proofErr w:type="spellEnd"/>
+      <w:r>
+        <w:rPr>
+          <w:rFonts w:ascii="Times New Roman" w:hAnsi="Times New Roman" w:cs="Times New Roman"/>
+          <w:sz w:val="28"/>
+          <w:szCs w:val="28"/>
+        </w:rPr>
+        <w:t>:</w:t>
       </w:r>
     </w:p>
     <w:p>
@@ -122,7 +975,331 @@
           <w:sz w:val="28"/>
           <w:szCs w:val="28"/>
         </w:rPr>
-        <w:t>Git stash: Đẩy thay đổi đã được add lên 1 stack trong git. Lệnh này sẽ unlink và đem hết toàn bộ thay đổi vào stack</w:t>
+        <w:t xml:space="preserve">Git stash: </w:t>
+      </w:r>
+      <w:proofErr w:type="spellStart"/>
+      <w:r>
+        <w:rPr>
+          <w:rFonts w:ascii="Times New Roman" w:hAnsi="Times New Roman" w:cs="Times New Roman"/>
+          <w:sz w:val="28"/>
+          <w:szCs w:val="28"/>
+        </w:rPr>
+        <w:t>Đẩy</w:t>
+      </w:r>
+      <w:proofErr w:type="spellEnd"/>
+      <w:r>
+        <w:rPr>
+          <w:rFonts w:ascii="Times New Roman" w:hAnsi="Times New Roman" w:cs="Times New Roman"/>
+          <w:sz w:val="28"/>
+          <w:szCs w:val="28"/>
+        </w:rPr>
+        <w:t xml:space="preserve"> </w:t>
+      </w:r>
+      <w:proofErr w:type="spellStart"/>
+      <w:r>
+        <w:rPr>
+          <w:rFonts w:ascii="Times New Roman" w:hAnsi="Times New Roman" w:cs="Times New Roman"/>
+          <w:sz w:val="28"/>
+          <w:szCs w:val="28"/>
+        </w:rPr>
+        <w:t>thay</w:t>
+      </w:r>
+      <w:proofErr w:type="spellEnd"/>
+      <w:r>
+        <w:rPr>
+          <w:rFonts w:ascii="Times New Roman" w:hAnsi="Times New Roman" w:cs="Times New Roman"/>
+          <w:sz w:val="28"/>
+          <w:szCs w:val="28"/>
+        </w:rPr>
+        <w:t xml:space="preserve"> </w:t>
+      </w:r>
+      <w:proofErr w:type="spellStart"/>
+      <w:r>
+        <w:rPr>
+          <w:rFonts w:ascii="Times New Roman" w:hAnsi="Times New Roman" w:cs="Times New Roman"/>
+          <w:sz w:val="28"/>
+          <w:szCs w:val="28"/>
+        </w:rPr>
+        <w:t>đổi</w:t>
+      </w:r>
+      <w:proofErr w:type="spellEnd"/>
+      <w:r>
+        <w:rPr>
+          <w:rFonts w:ascii="Times New Roman" w:hAnsi="Times New Roman" w:cs="Times New Roman"/>
+          <w:sz w:val="28"/>
+          <w:szCs w:val="28"/>
+        </w:rPr>
+        <w:t xml:space="preserve"> </w:t>
+      </w:r>
+      <w:proofErr w:type="spellStart"/>
+      <w:r>
+        <w:rPr>
+          <w:rFonts w:ascii="Times New Roman" w:hAnsi="Times New Roman" w:cs="Times New Roman"/>
+          <w:sz w:val="28"/>
+          <w:szCs w:val="28"/>
+        </w:rPr>
+        <w:t>đã</w:t>
+      </w:r>
+      <w:proofErr w:type="spellEnd"/>
+      <w:r>
+        <w:rPr>
+          <w:rFonts w:ascii="Times New Roman" w:hAnsi="Times New Roman" w:cs="Times New Roman"/>
+          <w:sz w:val="28"/>
+          <w:szCs w:val="28"/>
+        </w:rPr>
+        <w:t xml:space="preserve"> </w:t>
+      </w:r>
+      <w:proofErr w:type="spellStart"/>
+      <w:r>
+        <w:rPr>
+          <w:rFonts w:ascii="Times New Roman" w:hAnsi="Times New Roman" w:cs="Times New Roman"/>
+          <w:sz w:val="28"/>
+          <w:szCs w:val="28"/>
+        </w:rPr>
+        <w:t>được</w:t>
+      </w:r>
+      <w:proofErr w:type="spellEnd"/>
+      <w:r>
+        <w:rPr>
+          <w:rFonts w:ascii="Times New Roman" w:hAnsi="Times New Roman" w:cs="Times New Roman"/>
+          <w:sz w:val="28"/>
+          <w:szCs w:val="28"/>
+        </w:rPr>
+        <w:t xml:space="preserve"> add </w:t>
+      </w:r>
+      <w:proofErr w:type="spellStart"/>
+      <w:r>
+        <w:rPr>
+          <w:rFonts w:ascii="Times New Roman" w:hAnsi="Times New Roman" w:cs="Times New Roman"/>
+          <w:sz w:val="28"/>
+          <w:szCs w:val="28"/>
+        </w:rPr>
+        <w:t>lên</w:t>
+      </w:r>
+      <w:proofErr w:type="spellEnd"/>
+      <w:r>
+        <w:rPr>
+          <w:rFonts w:ascii="Times New Roman" w:hAnsi="Times New Roman" w:cs="Times New Roman"/>
+          <w:sz w:val="28"/>
+          <w:szCs w:val="28"/>
+        </w:rPr>
+        <w:t xml:space="preserve"> 1 stack </w:t>
+      </w:r>
+      <w:proofErr w:type="spellStart"/>
+      <w:r>
+        <w:rPr>
+          <w:rFonts w:ascii="Times New Roman" w:hAnsi="Times New Roman" w:cs="Times New Roman"/>
+          <w:sz w:val="28"/>
+          <w:szCs w:val="28"/>
+        </w:rPr>
+        <w:t>trong</w:t>
+      </w:r>
+      <w:proofErr w:type="spellEnd"/>
+      <w:r>
+        <w:rPr>
+          <w:rFonts w:ascii="Times New Roman" w:hAnsi="Times New Roman" w:cs="Times New Roman"/>
+          <w:sz w:val="28"/>
+          <w:szCs w:val="28"/>
+        </w:rPr>
+        <w:t xml:space="preserve"> git. </w:t>
+      </w:r>
+      <w:proofErr w:type="spellStart"/>
+      <w:r>
+        <w:rPr>
+          <w:rFonts w:ascii="Times New Roman" w:hAnsi="Times New Roman" w:cs="Times New Roman"/>
+          <w:sz w:val="28"/>
+          <w:szCs w:val="28"/>
+        </w:rPr>
+        <w:t>Lệnh</w:t>
+      </w:r>
+      <w:proofErr w:type="spellEnd"/>
+      <w:r>
+        <w:rPr>
+          <w:rFonts w:ascii="Times New Roman" w:hAnsi="Times New Roman" w:cs="Times New Roman"/>
+          <w:sz w:val="28"/>
+          <w:szCs w:val="28"/>
+        </w:rPr>
+        <w:t xml:space="preserve"> </w:t>
+      </w:r>
+      <w:proofErr w:type="spellStart"/>
+      <w:r>
+        <w:rPr>
+          <w:rFonts w:ascii="Times New Roman" w:hAnsi="Times New Roman" w:cs="Times New Roman"/>
+          <w:sz w:val="28"/>
+          <w:szCs w:val="28"/>
+        </w:rPr>
+        <w:t>này</w:t>
+      </w:r>
+      <w:proofErr w:type="spellEnd"/>
+      <w:r>
+        <w:rPr>
+          <w:rFonts w:ascii="Times New Roman" w:hAnsi="Times New Roman" w:cs="Times New Roman"/>
+          <w:sz w:val="28"/>
+          <w:szCs w:val="28"/>
+        </w:rPr>
+        <w:t xml:space="preserve"> </w:t>
+      </w:r>
+      <w:proofErr w:type="spellStart"/>
+      <w:r>
+        <w:rPr>
+          <w:rFonts w:ascii="Times New Roman" w:hAnsi="Times New Roman" w:cs="Times New Roman"/>
+          <w:sz w:val="28"/>
+          <w:szCs w:val="28"/>
+        </w:rPr>
+        <w:t>sẽ</w:t>
+      </w:r>
+      <w:proofErr w:type="spellEnd"/>
+      <w:r>
+        <w:rPr>
+          <w:rFonts w:ascii="Times New Roman" w:hAnsi="Times New Roman" w:cs="Times New Roman"/>
+          <w:sz w:val="28"/>
+          <w:szCs w:val="28"/>
+        </w:rPr>
+        <w:t xml:space="preserve"> unlink </w:t>
+      </w:r>
+      <w:proofErr w:type="spellStart"/>
+      <w:r>
+        <w:rPr>
+          <w:rFonts w:ascii="Times New Roman" w:hAnsi="Times New Roman" w:cs="Times New Roman"/>
+          <w:sz w:val="28"/>
+          <w:szCs w:val="28"/>
+        </w:rPr>
+        <w:t>và</w:t>
+      </w:r>
+      <w:proofErr w:type="spellEnd"/>
+      <w:r>
+        <w:rPr>
+          <w:rFonts w:ascii="Times New Roman" w:hAnsi="Times New Roman" w:cs="Times New Roman"/>
+          <w:sz w:val="28"/>
+          <w:szCs w:val="28"/>
+        </w:rPr>
+        <w:t xml:space="preserve"> </w:t>
+      </w:r>
+      <w:proofErr w:type="spellStart"/>
+      <w:r>
+        <w:rPr>
+          <w:rFonts w:ascii="Times New Roman" w:hAnsi="Times New Roman" w:cs="Times New Roman"/>
+          <w:sz w:val="28"/>
+          <w:szCs w:val="28"/>
+        </w:rPr>
+        <w:t>đem</w:t>
+      </w:r>
+      <w:proofErr w:type="spellEnd"/>
+      <w:r>
+        <w:rPr>
+          <w:rFonts w:ascii="Times New Roman" w:hAnsi="Times New Roman" w:cs="Times New Roman"/>
+          <w:sz w:val="28"/>
+          <w:szCs w:val="28"/>
+        </w:rPr>
+        <w:t xml:space="preserve"> </w:t>
+      </w:r>
+      <w:proofErr w:type="spellStart"/>
+      <w:r>
+        <w:rPr>
+          <w:rFonts w:ascii="Times New Roman" w:hAnsi="Times New Roman" w:cs="Times New Roman"/>
+          <w:sz w:val="28"/>
+          <w:szCs w:val="28"/>
+        </w:rPr>
+        <w:t>hết</w:t>
+      </w:r>
+      <w:proofErr w:type="spellEnd"/>
+      <w:r>
+        <w:rPr>
+          <w:rFonts w:ascii="Times New Roman" w:hAnsi="Times New Roman" w:cs="Times New Roman"/>
+          <w:sz w:val="28"/>
+          <w:szCs w:val="28"/>
+        </w:rPr>
+        <w:t xml:space="preserve"> </w:t>
+      </w:r>
+      <w:proofErr w:type="spellStart"/>
+      <w:r>
+        <w:rPr>
+          <w:rFonts w:ascii="Times New Roman" w:hAnsi="Times New Roman" w:cs="Times New Roman"/>
+          <w:sz w:val="28"/>
+          <w:szCs w:val="28"/>
+        </w:rPr>
+        <w:t>toàn</w:t>
+      </w:r>
+      <w:proofErr w:type="spellEnd"/>
+      <w:r>
+        <w:rPr>
+          <w:rFonts w:ascii="Times New Roman" w:hAnsi="Times New Roman" w:cs="Times New Roman"/>
+          <w:sz w:val="28"/>
+          <w:szCs w:val="28"/>
+        </w:rPr>
+        <w:t xml:space="preserve"> </w:t>
+      </w:r>
+      <w:proofErr w:type="spellStart"/>
+      <w:r>
+        <w:rPr>
+          <w:rFonts w:ascii="Times New Roman" w:hAnsi="Times New Roman" w:cs="Times New Roman"/>
+          <w:sz w:val="28"/>
+          <w:szCs w:val="28"/>
+        </w:rPr>
+        <w:t>bộ</w:t>
+      </w:r>
+      <w:proofErr w:type="spellEnd"/>
+      <w:r>
+        <w:rPr>
+          <w:rFonts w:ascii="Times New Roman" w:hAnsi="Times New Roman" w:cs="Times New Roman"/>
+          <w:sz w:val="28"/>
+          <w:szCs w:val="28"/>
+        </w:rPr>
+        <w:t xml:space="preserve"> </w:t>
+      </w:r>
+      <w:proofErr w:type="spellStart"/>
+      <w:r>
+        <w:rPr>
+          <w:rFonts w:ascii="Times New Roman" w:hAnsi="Times New Roman" w:cs="Times New Roman"/>
+          <w:sz w:val="28"/>
+          <w:szCs w:val="28"/>
+        </w:rPr>
+        <w:t>thay</w:t>
+      </w:r>
+      <w:proofErr w:type="spellEnd"/>
+      <w:r>
+        <w:rPr>
+          <w:rFonts w:ascii="Times New Roman" w:hAnsi="Times New Roman" w:cs="Times New Roman"/>
+          <w:sz w:val="28"/>
+          <w:szCs w:val="28"/>
+        </w:rPr>
+        <w:t xml:space="preserve"> </w:t>
+      </w:r>
+      <w:proofErr w:type="spellStart"/>
+      <w:r>
+        <w:rPr>
+          <w:rFonts w:ascii="Times New Roman" w:hAnsi="Times New Roman" w:cs="Times New Roman"/>
+          <w:sz w:val="28"/>
+          <w:szCs w:val="28"/>
+        </w:rPr>
+        <w:t>đổi</w:t>
+      </w:r>
+      <w:proofErr w:type="spellEnd"/>
+      <w:r>
+        <w:rPr>
+          <w:rFonts w:ascii="Times New Roman" w:hAnsi="Times New Roman" w:cs="Times New Roman"/>
+          <w:sz w:val="28"/>
+          <w:szCs w:val="28"/>
+        </w:rPr>
+        <w:t xml:space="preserve"> </w:t>
+      </w:r>
+      <w:proofErr w:type="spellStart"/>
+      <w:r>
+        <w:rPr>
+          <w:rFonts w:ascii="Times New Roman" w:hAnsi="Times New Roman" w:cs="Times New Roman"/>
+          <w:sz w:val="28"/>
+          <w:szCs w:val="28"/>
+        </w:rPr>
+        <w:t>vào</w:t>
+      </w:r>
+      <w:proofErr w:type="spellEnd"/>
+      <w:r>
+        <w:rPr>
+          <w:rFonts w:ascii="Times New Roman" w:hAnsi="Times New Roman" w:cs="Times New Roman"/>
+          <w:sz w:val="28"/>
+          <w:szCs w:val="28"/>
+        </w:rPr>
+        <w:t xml:space="preserve"> stack</w:t>
       </w:r>
       <w:r>
         <w:rPr>
@@ -209,37 +1386,435 @@
         </w:rPr>
         <w:t xml:space="preserve">Git stash show: </w:t>
       </w:r>
-      <w:r>
-        <w:rPr>
-          <w:rFonts w:ascii="Times New Roman" w:hAnsi="Times New Roman" w:cs="Times New Roman"/>
-          <w:sz w:val="28"/>
-          <w:szCs w:val="28"/>
-        </w:rPr>
-        <w:t xml:space="preserve">Là lệnh cho phép người dùng xem danh sách các </w:t>
-      </w:r>
-      <w:r>
-        <w:rPr>
-          <w:rFonts w:ascii="Times New Roman" w:hAnsi="Times New Roman" w:cs="Times New Roman"/>
-          <w:sz w:val="28"/>
-          <w:szCs w:val="28"/>
-        </w:rPr>
-        <w:t>file được</w:t>
-      </w:r>
-      <w:r>
-        <w:rPr>
-          <w:rFonts w:ascii="Times New Roman" w:hAnsi="Times New Roman" w:cs="Times New Roman"/>
-          <w:sz w:val="28"/>
-          <w:szCs w:val="28"/>
-        </w:rPr>
-        <w:t xml:space="preserve"> đẩy lên stack.</w:t>
-      </w:r>
-      <w:r>
-        <w:rPr>
-          <w:rFonts w:ascii="Times New Roman" w:hAnsi="Times New Roman" w:cs="Times New Roman"/>
-          <w:sz w:val="28"/>
-          <w:szCs w:val="28"/>
-        </w:rPr>
-        <w:t xml:space="preserve"> Có thể chọn xem dữ liệu bên trong stack nhất định.</w:t>
+      <w:proofErr w:type="spellStart"/>
+      <w:r>
+        <w:rPr>
+          <w:rFonts w:ascii="Times New Roman" w:hAnsi="Times New Roman" w:cs="Times New Roman"/>
+          <w:sz w:val="28"/>
+          <w:szCs w:val="28"/>
+        </w:rPr>
+        <w:t>Là</w:t>
+      </w:r>
+      <w:proofErr w:type="spellEnd"/>
+      <w:r>
+        <w:rPr>
+          <w:rFonts w:ascii="Times New Roman" w:hAnsi="Times New Roman" w:cs="Times New Roman"/>
+          <w:sz w:val="28"/>
+          <w:szCs w:val="28"/>
+        </w:rPr>
+        <w:t xml:space="preserve"> </w:t>
+      </w:r>
+      <w:proofErr w:type="spellStart"/>
+      <w:r>
+        <w:rPr>
+          <w:rFonts w:ascii="Times New Roman" w:hAnsi="Times New Roman" w:cs="Times New Roman"/>
+          <w:sz w:val="28"/>
+          <w:szCs w:val="28"/>
+        </w:rPr>
+        <w:t>lệnh</w:t>
+      </w:r>
+      <w:proofErr w:type="spellEnd"/>
+      <w:r>
+        <w:rPr>
+          <w:rFonts w:ascii="Times New Roman" w:hAnsi="Times New Roman" w:cs="Times New Roman"/>
+          <w:sz w:val="28"/>
+          <w:szCs w:val="28"/>
+        </w:rPr>
+        <w:t xml:space="preserve"> </w:t>
+      </w:r>
+      <w:proofErr w:type="spellStart"/>
+      <w:r>
+        <w:rPr>
+          <w:rFonts w:ascii="Times New Roman" w:hAnsi="Times New Roman" w:cs="Times New Roman"/>
+          <w:sz w:val="28"/>
+          <w:szCs w:val="28"/>
+        </w:rPr>
+        <w:t>cho</w:t>
+      </w:r>
+      <w:proofErr w:type="spellEnd"/>
+      <w:r>
+        <w:rPr>
+          <w:rFonts w:ascii="Times New Roman" w:hAnsi="Times New Roman" w:cs="Times New Roman"/>
+          <w:sz w:val="28"/>
+          <w:szCs w:val="28"/>
+        </w:rPr>
+        <w:t xml:space="preserve"> </w:t>
+      </w:r>
+      <w:proofErr w:type="spellStart"/>
+      <w:r>
+        <w:rPr>
+          <w:rFonts w:ascii="Times New Roman" w:hAnsi="Times New Roman" w:cs="Times New Roman"/>
+          <w:sz w:val="28"/>
+          <w:szCs w:val="28"/>
+        </w:rPr>
+        <w:t>phép</w:t>
+      </w:r>
+      <w:proofErr w:type="spellEnd"/>
+      <w:r>
+        <w:rPr>
+          <w:rFonts w:ascii="Times New Roman" w:hAnsi="Times New Roman" w:cs="Times New Roman"/>
+          <w:sz w:val="28"/>
+          <w:szCs w:val="28"/>
+        </w:rPr>
+        <w:t xml:space="preserve"> </w:t>
+      </w:r>
+      <w:proofErr w:type="spellStart"/>
+      <w:r>
+        <w:rPr>
+          <w:rFonts w:ascii="Times New Roman" w:hAnsi="Times New Roman" w:cs="Times New Roman"/>
+          <w:sz w:val="28"/>
+          <w:szCs w:val="28"/>
+        </w:rPr>
+        <w:t>người</w:t>
+      </w:r>
+      <w:proofErr w:type="spellEnd"/>
+      <w:r>
+        <w:rPr>
+          <w:rFonts w:ascii="Times New Roman" w:hAnsi="Times New Roman" w:cs="Times New Roman"/>
+          <w:sz w:val="28"/>
+          <w:szCs w:val="28"/>
+        </w:rPr>
+        <w:t xml:space="preserve"> </w:t>
+      </w:r>
+      <w:proofErr w:type="spellStart"/>
+      <w:r>
+        <w:rPr>
+          <w:rFonts w:ascii="Times New Roman" w:hAnsi="Times New Roman" w:cs="Times New Roman"/>
+          <w:sz w:val="28"/>
+          <w:szCs w:val="28"/>
+        </w:rPr>
+        <w:t>dùng</w:t>
+      </w:r>
+      <w:proofErr w:type="spellEnd"/>
+      <w:r>
+        <w:rPr>
+          <w:rFonts w:ascii="Times New Roman" w:hAnsi="Times New Roman" w:cs="Times New Roman"/>
+          <w:sz w:val="28"/>
+          <w:szCs w:val="28"/>
+        </w:rPr>
+        <w:t xml:space="preserve"> </w:t>
+      </w:r>
+      <w:proofErr w:type="spellStart"/>
+      <w:r>
+        <w:rPr>
+          <w:rFonts w:ascii="Times New Roman" w:hAnsi="Times New Roman" w:cs="Times New Roman"/>
+          <w:sz w:val="28"/>
+          <w:szCs w:val="28"/>
+        </w:rPr>
+        <w:t>xem</w:t>
+      </w:r>
+      <w:proofErr w:type="spellEnd"/>
+      <w:r>
+        <w:rPr>
+          <w:rFonts w:ascii="Times New Roman" w:hAnsi="Times New Roman" w:cs="Times New Roman"/>
+          <w:sz w:val="28"/>
+          <w:szCs w:val="28"/>
+        </w:rPr>
+        <w:t xml:space="preserve"> </w:t>
+      </w:r>
+      <w:proofErr w:type="spellStart"/>
+      <w:r>
+        <w:rPr>
+          <w:rFonts w:ascii="Times New Roman" w:hAnsi="Times New Roman" w:cs="Times New Roman"/>
+          <w:sz w:val="28"/>
+          <w:szCs w:val="28"/>
+        </w:rPr>
+        <w:t>danh</w:t>
+      </w:r>
+      <w:proofErr w:type="spellEnd"/>
+      <w:r>
+        <w:rPr>
+          <w:rFonts w:ascii="Times New Roman" w:hAnsi="Times New Roman" w:cs="Times New Roman"/>
+          <w:sz w:val="28"/>
+          <w:szCs w:val="28"/>
+        </w:rPr>
+        <w:t xml:space="preserve"> </w:t>
+      </w:r>
+      <w:proofErr w:type="spellStart"/>
+      <w:r>
+        <w:rPr>
+          <w:rFonts w:ascii="Times New Roman" w:hAnsi="Times New Roman" w:cs="Times New Roman"/>
+          <w:sz w:val="28"/>
+          <w:szCs w:val="28"/>
+        </w:rPr>
+        <w:t>sách</w:t>
+      </w:r>
+      <w:proofErr w:type="spellEnd"/>
+      <w:r>
+        <w:rPr>
+          <w:rFonts w:ascii="Times New Roman" w:hAnsi="Times New Roman" w:cs="Times New Roman"/>
+          <w:sz w:val="28"/>
+          <w:szCs w:val="28"/>
+        </w:rPr>
+        <w:t xml:space="preserve"> </w:t>
+      </w:r>
+      <w:proofErr w:type="spellStart"/>
+      <w:r>
+        <w:rPr>
+          <w:rFonts w:ascii="Times New Roman" w:hAnsi="Times New Roman" w:cs="Times New Roman"/>
+          <w:sz w:val="28"/>
+          <w:szCs w:val="28"/>
+        </w:rPr>
+        <w:t>các</w:t>
+      </w:r>
+      <w:proofErr w:type="spellEnd"/>
+      <w:r>
+        <w:rPr>
+          <w:rFonts w:ascii="Times New Roman" w:hAnsi="Times New Roman" w:cs="Times New Roman"/>
+          <w:sz w:val="28"/>
+          <w:szCs w:val="28"/>
+        </w:rPr>
+        <w:t xml:space="preserve"> </w:t>
+      </w:r>
+      <w:r>
+        <w:rPr>
+          <w:rFonts w:ascii="Times New Roman" w:hAnsi="Times New Roman" w:cs="Times New Roman"/>
+          <w:sz w:val="28"/>
+          <w:szCs w:val="28"/>
+        </w:rPr>
+        <w:t xml:space="preserve">file </w:t>
+      </w:r>
+      <w:proofErr w:type="spellStart"/>
+      <w:r>
+        <w:rPr>
+          <w:rFonts w:ascii="Times New Roman" w:hAnsi="Times New Roman" w:cs="Times New Roman"/>
+          <w:sz w:val="28"/>
+          <w:szCs w:val="28"/>
+        </w:rPr>
+        <w:t>được</w:t>
+      </w:r>
+      <w:proofErr w:type="spellEnd"/>
+      <w:r>
+        <w:rPr>
+          <w:rFonts w:ascii="Times New Roman" w:hAnsi="Times New Roman" w:cs="Times New Roman"/>
+          <w:sz w:val="28"/>
+          <w:szCs w:val="28"/>
+        </w:rPr>
+        <w:t xml:space="preserve"> </w:t>
+      </w:r>
+      <w:proofErr w:type="spellStart"/>
+      <w:r>
+        <w:rPr>
+          <w:rFonts w:ascii="Times New Roman" w:hAnsi="Times New Roman" w:cs="Times New Roman"/>
+          <w:sz w:val="28"/>
+          <w:szCs w:val="28"/>
+        </w:rPr>
+        <w:t>đẩy</w:t>
+      </w:r>
+      <w:proofErr w:type="spellEnd"/>
+      <w:r>
+        <w:rPr>
+          <w:rFonts w:ascii="Times New Roman" w:hAnsi="Times New Roman" w:cs="Times New Roman"/>
+          <w:sz w:val="28"/>
+          <w:szCs w:val="28"/>
+        </w:rPr>
+        <w:t xml:space="preserve"> </w:t>
+      </w:r>
+      <w:proofErr w:type="spellStart"/>
+      <w:r>
+        <w:rPr>
+          <w:rFonts w:ascii="Times New Roman" w:hAnsi="Times New Roman" w:cs="Times New Roman"/>
+          <w:sz w:val="28"/>
+          <w:szCs w:val="28"/>
+        </w:rPr>
+        <w:t>lên</w:t>
+      </w:r>
+      <w:proofErr w:type="spellEnd"/>
+      <w:r>
+        <w:rPr>
+          <w:rFonts w:ascii="Times New Roman" w:hAnsi="Times New Roman" w:cs="Times New Roman"/>
+          <w:sz w:val="28"/>
+          <w:szCs w:val="28"/>
+        </w:rPr>
+        <w:t xml:space="preserve"> stack.</w:t>
+      </w:r>
+      <w:r>
+        <w:rPr>
+          <w:rFonts w:ascii="Times New Roman" w:hAnsi="Times New Roman" w:cs="Times New Roman"/>
+          <w:sz w:val="28"/>
+          <w:szCs w:val="28"/>
+        </w:rPr>
+        <w:t xml:space="preserve"> </w:t>
+      </w:r>
+      <w:proofErr w:type="spellStart"/>
+      <w:r>
+        <w:rPr>
+          <w:rFonts w:ascii="Times New Roman" w:hAnsi="Times New Roman" w:cs="Times New Roman"/>
+          <w:sz w:val="28"/>
+          <w:szCs w:val="28"/>
+        </w:rPr>
+        <w:t>Có</w:t>
+      </w:r>
+      <w:proofErr w:type="spellEnd"/>
+      <w:r>
+        <w:rPr>
+          <w:rFonts w:ascii="Times New Roman" w:hAnsi="Times New Roman" w:cs="Times New Roman"/>
+          <w:sz w:val="28"/>
+          <w:szCs w:val="28"/>
+        </w:rPr>
+        <w:t xml:space="preserve"> </w:t>
+      </w:r>
+      <w:proofErr w:type="spellStart"/>
+      <w:r>
+        <w:rPr>
+          <w:rFonts w:ascii="Times New Roman" w:hAnsi="Times New Roman" w:cs="Times New Roman"/>
+          <w:sz w:val="28"/>
+          <w:szCs w:val="28"/>
+        </w:rPr>
+        <w:t>thể</w:t>
+      </w:r>
+      <w:proofErr w:type="spellEnd"/>
+      <w:r>
+        <w:rPr>
+          <w:rFonts w:ascii="Times New Roman" w:hAnsi="Times New Roman" w:cs="Times New Roman"/>
+          <w:sz w:val="28"/>
+          <w:szCs w:val="28"/>
+        </w:rPr>
+        <w:t xml:space="preserve"> </w:t>
+      </w:r>
+      <w:proofErr w:type="spellStart"/>
+      <w:r>
+        <w:rPr>
+          <w:rFonts w:ascii="Times New Roman" w:hAnsi="Times New Roman" w:cs="Times New Roman"/>
+          <w:sz w:val="28"/>
+          <w:szCs w:val="28"/>
+        </w:rPr>
+        <w:t>chọn</w:t>
+      </w:r>
+      <w:proofErr w:type="spellEnd"/>
+      <w:r>
+        <w:rPr>
+          <w:rFonts w:ascii="Times New Roman" w:hAnsi="Times New Roman" w:cs="Times New Roman"/>
+          <w:sz w:val="28"/>
+          <w:szCs w:val="28"/>
+        </w:rPr>
+        <w:t xml:space="preserve"> </w:t>
+      </w:r>
+      <w:proofErr w:type="spellStart"/>
+      <w:r>
+        <w:rPr>
+          <w:rFonts w:ascii="Times New Roman" w:hAnsi="Times New Roman" w:cs="Times New Roman"/>
+          <w:sz w:val="28"/>
+          <w:szCs w:val="28"/>
+        </w:rPr>
+        <w:t>xem</w:t>
+      </w:r>
+      <w:proofErr w:type="spellEnd"/>
+      <w:r>
+        <w:rPr>
+          <w:rFonts w:ascii="Times New Roman" w:hAnsi="Times New Roman" w:cs="Times New Roman"/>
+          <w:sz w:val="28"/>
+          <w:szCs w:val="28"/>
+        </w:rPr>
+        <w:t xml:space="preserve"> </w:t>
+      </w:r>
+      <w:proofErr w:type="spellStart"/>
+      <w:r>
+        <w:rPr>
+          <w:rFonts w:ascii="Times New Roman" w:hAnsi="Times New Roman" w:cs="Times New Roman"/>
+          <w:sz w:val="28"/>
+          <w:szCs w:val="28"/>
+        </w:rPr>
+        <w:t>dữ</w:t>
+      </w:r>
+      <w:proofErr w:type="spellEnd"/>
+      <w:r>
+        <w:rPr>
+          <w:rFonts w:ascii="Times New Roman" w:hAnsi="Times New Roman" w:cs="Times New Roman"/>
+          <w:sz w:val="28"/>
+          <w:szCs w:val="28"/>
+        </w:rPr>
+        <w:t xml:space="preserve"> </w:t>
+      </w:r>
+      <w:proofErr w:type="spellStart"/>
+      <w:r>
+        <w:rPr>
+          <w:rFonts w:ascii="Times New Roman" w:hAnsi="Times New Roman" w:cs="Times New Roman"/>
+          <w:sz w:val="28"/>
+          <w:szCs w:val="28"/>
+        </w:rPr>
+        <w:t>liệu</w:t>
+      </w:r>
+      <w:proofErr w:type="spellEnd"/>
+      <w:r>
+        <w:rPr>
+          <w:rFonts w:ascii="Times New Roman" w:hAnsi="Times New Roman" w:cs="Times New Roman"/>
+          <w:sz w:val="28"/>
+          <w:szCs w:val="28"/>
+        </w:rPr>
+        <w:t xml:space="preserve"> </w:t>
+      </w:r>
+      <w:proofErr w:type="spellStart"/>
+      <w:r>
+        <w:rPr>
+          <w:rFonts w:ascii="Times New Roman" w:hAnsi="Times New Roman" w:cs="Times New Roman"/>
+          <w:sz w:val="28"/>
+          <w:szCs w:val="28"/>
+        </w:rPr>
+        <w:t>bên</w:t>
+      </w:r>
+      <w:proofErr w:type="spellEnd"/>
+      <w:r>
+        <w:rPr>
+          <w:rFonts w:ascii="Times New Roman" w:hAnsi="Times New Roman" w:cs="Times New Roman"/>
+          <w:sz w:val="28"/>
+          <w:szCs w:val="28"/>
+        </w:rPr>
+        <w:t xml:space="preserve"> </w:t>
+      </w:r>
+      <w:proofErr w:type="spellStart"/>
+      <w:r>
+        <w:rPr>
+          <w:rFonts w:ascii="Times New Roman" w:hAnsi="Times New Roman" w:cs="Times New Roman"/>
+          <w:sz w:val="28"/>
+          <w:szCs w:val="28"/>
+        </w:rPr>
+        <w:t>trong</w:t>
+      </w:r>
+      <w:proofErr w:type="spellEnd"/>
+      <w:r>
+        <w:rPr>
+          <w:rFonts w:ascii="Times New Roman" w:hAnsi="Times New Roman" w:cs="Times New Roman"/>
+          <w:sz w:val="28"/>
+          <w:szCs w:val="28"/>
+        </w:rPr>
+        <w:t xml:space="preserve"> stack </w:t>
+      </w:r>
+      <w:proofErr w:type="spellStart"/>
+      <w:r>
+        <w:rPr>
+          <w:rFonts w:ascii="Times New Roman" w:hAnsi="Times New Roman" w:cs="Times New Roman"/>
+          <w:sz w:val="28"/>
+          <w:szCs w:val="28"/>
+        </w:rPr>
+        <w:t>nhất</w:t>
+      </w:r>
+      <w:proofErr w:type="spellEnd"/>
+      <w:r>
+        <w:rPr>
+          <w:rFonts w:ascii="Times New Roman" w:hAnsi="Times New Roman" w:cs="Times New Roman"/>
+          <w:sz w:val="28"/>
+          <w:szCs w:val="28"/>
+        </w:rPr>
+        <w:t xml:space="preserve"> </w:t>
+      </w:r>
+      <w:proofErr w:type="spellStart"/>
+      <w:r>
+        <w:rPr>
+          <w:rFonts w:ascii="Times New Roman" w:hAnsi="Times New Roman" w:cs="Times New Roman"/>
+          <w:sz w:val="28"/>
+          <w:szCs w:val="28"/>
+        </w:rPr>
+        <w:t>định</w:t>
+      </w:r>
+      <w:proofErr w:type="spellEnd"/>
+      <w:r>
+        <w:rPr>
+          <w:rFonts w:ascii="Times New Roman" w:hAnsi="Times New Roman" w:cs="Times New Roman"/>
+          <w:sz w:val="28"/>
+          <w:szCs w:val="28"/>
+        </w:rPr>
+        <w:t>.</w:t>
       </w:r>
     </w:p>
     <w:p>
@@ -370,7 +1945,151 @@
           <w:sz w:val="28"/>
           <w:szCs w:val="28"/>
         </w:rPr>
-        <w:t>Git stash list: Cho phép xem danh sách các phần tử trong stack.</w:t>
+        <w:t xml:space="preserve">Git stash list: Cho </w:t>
+      </w:r>
+      <w:proofErr w:type="spellStart"/>
+      <w:r>
+        <w:rPr>
+          <w:rFonts w:ascii="Times New Roman" w:hAnsi="Times New Roman" w:cs="Times New Roman"/>
+          <w:sz w:val="28"/>
+          <w:szCs w:val="28"/>
+        </w:rPr>
+        <w:t>phép</w:t>
+      </w:r>
+      <w:proofErr w:type="spellEnd"/>
+      <w:r>
+        <w:rPr>
+          <w:rFonts w:ascii="Times New Roman" w:hAnsi="Times New Roman" w:cs="Times New Roman"/>
+          <w:sz w:val="28"/>
+          <w:szCs w:val="28"/>
+        </w:rPr>
+        <w:t xml:space="preserve"> </w:t>
+      </w:r>
+      <w:proofErr w:type="spellStart"/>
+      <w:r>
+        <w:rPr>
+          <w:rFonts w:ascii="Times New Roman" w:hAnsi="Times New Roman" w:cs="Times New Roman"/>
+          <w:sz w:val="28"/>
+          <w:szCs w:val="28"/>
+        </w:rPr>
+        <w:t>xem</w:t>
+      </w:r>
+      <w:proofErr w:type="spellEnd"/>
+      <w:r>
+        <w:rPr>
+          <w:rFonts w:ascii="Times New Roman" w:hAnsi="Times New Roman" w:cs="Times New Roman"/>
+          <w:sz w:val="28"/>
+          <w:szCs w:val="28"/>
+        </w:rPr>
+        <w:t xml:space="preserve"> </w:t>
+      </w:r>
+      <w:proofErr w:type="spellStart"/>
+      <w:r>
+        <w:rPr>
+          <w:rFonts w:ascii="Times New Roman" w:hAnsi="Times New Roman" w:cs="Times New Roman"/>
+          <w:sz w:val="28"/>
+          <w:szCs w:val="28"/>
+        </w:rPr>
+        <w:t>danh</w:t>
+      </w:r>
+      <w:proofErr w:type="spellEnd"/>
+      <w:r>
+        <w:rPr>
+          <w:rFonts w:ascii="Times New Roman" w:hAnsi="Times New Roman" w:cs="Times New Roman"/>
+          <w:sz w:val="28"/>
+          <w:szCs w:val="28"/>
+        </w:rPr>
+        <w:t xml:space="preserve"> </w:t>
+      </w:r>
+      <w:proofErr w:type="spellStart"/>
+      <w:r>
+        <w:rPr>
+          <w:rFonts w:ascii="Times New Roman" w:hAnsi="Times New Roman" w:cs="Times New Roman"/>
+          <w:sz w:val="28"/>
+          <w:szCs w:val="28"/>
+        </w:rPr>
+        <w:t>sách</w:t>
+      </w:r>
+      <w:proofErr w:type="spellEnd"/>
+      <w:r>
+        <w:rPr>
+          <w:rFonts w:ascii="Times New Roman" w:hAnsi="Times New Roman" w:cs="Times New Roman"/>
+          <w:sz w:val="28"/>
+          <w:szCs w:val="28"/>
+        </w:rPr>
+        <w:t xml:space="preserve"> </w:t>
+      </w:r>
+      <w:proofErr w:type="spellStart"/>
+      <w:r>
+        <w:rPr>
+          <w:rFonts w:ascii="Times New Roman" w:hAnsi="Times New Roman" w:cs="Times New Roman"/>
+          <w:sz w:val="28"/>
+          <w:szCs w:val="28"/>
+        </w:rPr>
+        <w:t>các</w:t>
+      </w:r>
+      <w:proofErr w:type="spellEnd"/>
+      <w:r>
+        <w:rPr>
+          <w:rFonts w:ascii="Times New Roman" w:hAnsi="Times New Roman" w:cs="Times New Roman"/>
+          <w:sz w:val="28"/>
+          <w:szCs w:val="28"/>
+        </w:rPr>
+        <w:t xml:space="preserve"> </w:t>
+      </w:r>
+      <w:proofErr w:type="spellStart"/>
+      <w:r>
+        <w:rPr>
+          <w:rFonts w:ascii="Times New Roman" w:hAnsi="Times New Roman" w:cs="Times New Roman"/>
+          <w:sz w:val="28"/>
+          <w:szCs w:val="28"/>
+        </w:rPr>
+        <w:t>phần</w:t>
+      </w:r>
+      <w:proofErr w:type="spellEnd"/>
+      <w:r>
+        <w:rPr>
+          <w:rFonts w:ascii="Times New Roman" w:hAnsi="Times New Roman" w:cs="Times New Roman"/>
+          <w:sz w:val="28"/>
+          <w:szCs w:val="28"/>
+        </w:rPr>
+        <w:t xml:space="preserve"> </w:t>
+      </w:r>
+      <w:proofErr w:type="spellStart"/>
+      <w:r>
+        <w:rPr>
+          <w:rFonts w:ascii="Times New Roman" w:hAnsi="Times New Roman" w:cs="Times New Roman"/>
+          <w:sz w:val="28"/>
+          <w:szCs w:val="28"/>
+        </w:rPr>
+        <w:t>tử</w:t>
+      </w:r>
+      <w:proofErr w:type="spellEnd"/>
+      <w:r>
+        <w:rPr>
+          <w:rFonts w:ascii="Times New Roman" w:hAnsi="Times New Roman" w:cs="Times New Roman"/>
+          <w:sz w:val="28"/>
+          <w:szCs w:val="28"/>
+        </w:rPr>
+        <w:t xml:space="preserve"> </w:t>
+      </w:r>
+      <w:proofErr w:type="spellStart"/>
+      <w:r>
+        <w:rPr>
+          <w:rFonts w:ascii="Times New Roman" w:hAnsi="Times New Roman" w:cs="Times New Roman"/>
+          <w:sz w:val="28"/>
+          <w:szCs w:val="28"/>
+        </w:rPr>
+        <w:t>trong</w:t>
+      </w:r>
+      <w:proofErr w:type="spellEnd"/>
+      <w:r>
+        <w:rPr>
+          <w:rFonts w:ascii="Times New Roman" w:hAnsi="Times New Roman" w:cs="Times New Roman"/>
+          <w:sz w:val="28"/>
+          <w:szCs w:val="28"/>
+        </w:rPr>
+        <w:t xml:space="preserve"> stack.</w:t>
       </w:r>
     </w:p>
     <w:p>
@@ -448,7 +2167,115 @@
           <w:sz w:val="28"/>
           <w:szCs w:val="28"/>
         </w:rPr>
-        <w:t xml:space="preserve">Git stash pop: Lấy những thay đổi trong lần </w:t>
+        <w:t xml:space="preserve">Git stash pop: </w:t>
+      </w:r>
+      <w:proofErr w:type="spellStart"/>
+      <w:r>
+        <w:rPr>
+          <w:rFonts w:ascii="Times New Roman" w:hAnsi="Times New Roman" w:cs="Times New Roman"/>
+          <w:sz w:val="28"/>
+          <w:szCs w:val="28"/>
+        </w:rPr>
+        <w:t>Lấy</w:t>
+      </w:r>
+      <w:proofErr w:type="spellEnd"/>
+      <w:r>
+        <w:rPr>
+          <w:rFonts w:ascii="Times New Roman" w:hAnsi="Times New Roman" w:cs="Times New Roman"/>
+          <w:sz w:val="28"/>
+          <w:szCs w:val="28"/>
+        </w:rPr>
+        <w:t xml:space="preserve"> </w:t>
+      </w:r>
+      <w:proofErr w:type="spellStart"/>
+      <w:r>
+        <w:rPr>
+          <w:rFonts w:ascii="Times New Roman" w:hAnsi="Times New Roman" w:cs="Times New Roman"/>
+          <w:sz w:val="28"/>
+          <w:szCs w:val="28"/>
+        </w:rPr>
+        <w:t>những</w:t>
+      </w:r>
+      <w:proofErr w:type="spellEnd"/>
+      <w:r>
+        <w:rPr>
+          <w:rFonts w:ascii="Times New Roman" w:hAnsi="Times New Roman" w:cs="Times New Roman"/>
+          <w:sz w:val="28"/>
+          <w:szCs w:val="28"/>
+        </w:rPr>
+        <w:t xml:space="preserve"> </w:t>
+      </w:r>
+      <w:proofErr w:type="spellStart"/>
+      <w:r>
+        <w:rPr>
+          <w:rFonts w:ascii="Times New Roman" w:hAnsi="Times New Roman" w:cs="Times New Roman"/>
+          <w:sz w:val="28"/>
+          <w:szCs w:val="28"/>
+        </w:rPr>
+        <w:t>thay</w:t>
+      </w:r>
+      <w:proofErr w:type="spellEnd"/>
+      <w:r>
+        <w:rPr>
+          <w:rFonts w:ascii="Times New Roman" w:hAnsi="Times New Roman" w:cs="Times New Roman"/>
+          <w:sz w:val="28"/>
+          <w:szCs w:val="28"/>
+        </w:rPr>
+        <w:t xml:space="preserve"> </w:t>
+      </w:r>
+      <w:proofErr w:type="spellStart"/>
+      <w:r>
+        <w:rPr>
+          <w:rFonts w:ascii="Times New Roman" w:hAnsi="Times New Roman" w:cs="Times New Roman"/>
+          <w:sz w:val="28"/>
+          <w:szCs w:val="28"/>
+        </w:rPr>
+        <w:t>đổi</w:t>
+      </w:r>
+      <w:proofErr w:type="spellEnd"/>
+      <w:r>
+        <w:rPr>
+          <w:rFonts w:ascii="Times New Roman" w:hAnsi="Times New Roman" w:cs="Times New Roman"/>
+          <w:sz w:val="28"/>
+          <w:szCs w:val="28"/>
+        </w:rPr>
+        <w:t xml:space="preserve"> </w:t>
+      </w:r>
+      <w:proofErr w:type="spellStart"/>
+      <w:r>
+        <w:rPr>
+          <w:rFonts w:ascii="Times New Roman" w:hAnsi="Times New Roman" w:cs="Times New Roman"/>
+          <w:sz w:val="28"/>
+          <w:szCs w:val="28"/>
+        </w:rPr>
+        <w:t>trong</w:t>
+      </w:r>
+      <w:proofErr w:type="spellEnd"/>
+      <w:r>
+        <w:rPr>
+          <w:rFonts w:ascii="Times New Roman" w:hAnsi="Times New Roman" w:cs="Times New Roman"/>
+          <w:sz w:val="28"/>
+          <w:szCs w:val="28"/>
+        </w:rPr>
+        <w:t xml:space="preserve"> </w:t>
+      </w:r>
+      <w:proofErr w:type="spellStart"/>
+      <w:r>
+        <w:rPr>
+          <w:rFonts w:ascii="Times New Roman" w:hAnsi="Times New Roman" w:cs="Times New Roman"/>
+          <w:sz w:val="28"/>
+          <w:szCs w:val="28"/>
+        </w:rPr>
+        <w:t>lần</w:t>
+      </w:r>
+      <w:proofErr w:type="spellEnd"/>
+      <w:r>
+        <w:rPr>
+          <w:rFonts w:ascii="Times New Roman" w:hAnsi="Times New Roman" w:cs="Times New Roman"/>
+          <w:sz w:val="28"/>
+          <w:szCs w:val="28"/>
+        </w:rPr>
+        <w:t xml:space="preserve"> </w:t>
       </w:r>
       <w:r>
         <w:rPr>
@@ -464,7 +2291,133 @@
           <w:sz w:val="28"/>
           <w:szCs w:val="28"/>
         </w:rPr>
-        <w:t xml:space="preserve"> mới nhất ra ngoài và xóa khỏi stack.</w:t>
+        <w:t xml:space="preserve"> </w:t>
+      </w:r>
+      <w:proofErr w:type="spellStart"/>
+      <w:r>
+        <w:rPr>
+          <w:rFonts w:ascii="Times New Roman" w:hAnsi="Times New Roman" w:cs="Times New Roman"/>
+          <w:sz w:val="28"/>
+          <w:szCs w:val="28"/>
+        </w:rPr>
+        <w:t>mới</w:t>
+      </w:r>
+      <w:proofErr w:type="spellEnd"/>
+      <w:r>
+        <w:rPr>
+          <w:rFonts w:ascii="Times New Roman" w:hAnsi="Times New Roman" w:cs="Times New Roman"/>
+          <w:sz w:val="28"/>
+          <w:szCs w:val="28"/>
+        </w:rPr>
+        <w:t xml:space="preserve"> </w:t>
+      </w:r>
+      <w:proofErr w:type="spellStart"/>
+      <w:r>
+        <w:rPr>
+          <w:rFonts w:ascii="Times New Roman" w:hAnsi="Times New Roman" w:cs="Times New Roman"/>
+          <w:sz w:val="28"/>
+          <w:szCs w:val="28"/>
+        </w:rPr>
+        <w:t>nhất</w:t>
+      </w:r>
+      <w:proofErr w:type="spellEnd"/>
+      <w:r>
+        <w:rPr>
+          <w:rFonts w:ascii="Times New Roman" w:hAnsi="Times New Roman" w:cs="Times New Roman"/>
+          <w:sz w:val="28"/>
+          <w:szCs w:val="28"/>
+        </w:rPr>
+        <w:t xml:space="preserve"> </w:t>
+      </w:r>
+      <w:proofErr w:type="spellStart"/>
+      <w:r>
+        <w:rPr>
+          <w:rFonts w:ascii="Times New Roman" w:hAnsi="Times New Roman" w:cs="Times New Roman"/>
+          <w:sz w:val="28"/>
+          <w:szCs w:val="28"/>
+        </w:rPr>
+        <w:t>ra</w:t>
+      </w:r>
+      <w:proofErr w:type="spellEnd"/>
+      <w:r>
+        <w:rPr>
+          <w:rFonts w:ascii="Times New Roman" w:hAnsi="Times New Roman" w:cs="Times New Roman"/>
+          <w:sz w:val="28"/>
+          <w:szCs w:val="28"/>
+        </w:rPr>
+        <w:t xml:space="preserve"> </w:t>
+      </w:r>
+      <w:proofErr w:type="spellStart"/>
+      <w:r>
+        <w:rPr>
+          <w:rFonts w:ascii="Times New Roman" w:hAnsi="Times New Roman" w:cs="Times New Roman"/>
+          <w:sz w:val="28"/>
+          <w:szCs w:val="28"/>
+        </w:rPr>
+        <w:t>ngoài</w:t>
+      </w:r>
+      <w:proofErr w:type="spellEnd"/>
+      <w:r>
+        <w:rPr>
+          <w:rFonts w:ascii="Times New Roman" w:hAnsi="Times New Roman" w:cs="Times New Roman"/>
+          <w:sz w:val="28"/>
+          <w:szCs w:val="28"/>
+        </w:rPr>
+        <w:t xml:space="preserve"> </w:t>
+      </w:r>
+      <w:proofErr w:type="spellStart"/>
+      <w:r>
+        <w:rPr>
+          <w:rFonts w:ascii="Times New Roman" w:hAnsi="Times New Roman" w:cs="Times New Roman"/>
+          <w:sz w:val="28"/>
+          <w:szCs w:val="28"/>
+        </w:rPr>
+        <w:t>và</w:t>
+      </w:r>
+      <w:proofErr w:type="spellEnd"/>
+      <w:r>
+        <w:rPr>
+          <w:rFonts w:ascii="Times New Roman" w:hAnsi="Times New Roman" w:cs="Times New Roman"/>
+          <w:sz w:val="28"/>
+          <w:szCs w:val="28"/>
+        </w:rPr>
+        <w:t xml:space="preserve"> </w:t>
+      </w:r>
+      <w:proofErr w:type="spellStart"/>
+      <w:r>
+        <w:rPr>
+          <w:rFonts w:ascii="Times New Roman" w:hAnsi="Times New Roman" w:cs="Times New Roman"/>
+          <w:sz w:val="28"/>
+          <w:szCs w:val="28"/>
+        </w:rPr>
+        <w:t>xóa</w:t>
+      </w:r>
+      <w:proofErr w:type="spellEnd"/>
+      <w:r>
+        <w:rPr>
+          <w:rFonts w:ascii="Times New Roman" w:hAnsi="Times New Roman" w:cs="Times New Roman"/>
+          <w:sz w:val="28"/>
+          <w:szCs w:val="28"/>
+        </w:rPr>
+        <w:t xml:space="preserve"> </w:t>
+      </w:r>
+      <w:proofErr w:type="spellStart"/>
+      <w:r>
+        <w:rPr>
+          <w:rFonts w:ascii="Times New Roman" w:hAnsi="Times New Roman" w:cs="Times New Roman"/>
+          <w:sz w:val="28"/>
+          <w:szCs w:val="28"/>
+        </w:rPr>
+        <w:t>khỏi</w:t>
+      </w:r>
+      <w:proofErr w:type="spellEnd"/>
+      <w:r>
+        <w:rPr>
+          <w:rFonts w:ascii="Times New Roman" w:hAnsi="Times New Roman" w:cs="Times New Roman"/>
+          <w:sz w:val="28"/>
+          <w:szCs w:val="28"/>
+        </w:rPr>
+        <w:t xml:space="preserve"> stack.</w:t>
       </w:r>
     </w:p>
     <w:p>
@@ -549,7 +2502,133 @@
           <w:sz w:val="28"/>
           <w:szCs w:val="28"/>
         </w:rPr>
-        <w:t xml:space="preserve"> drop: Loại bỏ một phần tử bên trong stack.</w:t>
+        <w:t xml:space="preserve"> drop: </w:t>
+      </w:r>
+      <w:proofErr w:type="spellStart"/>
+      <w:r>
+        <w:rPr>
+          <w:rFonts w:ascii="Times New Roman" w:hAnsi="Times New Roman" w:cs="Times New Roman"/>
+          <w:sz w:val="28"/>
+          <w:szCs w:val="28"/>
+        </w:rPr>
+        <w:t>Loại</w:t>
+      </w:r>
+      <w:proofErr w:type="spellEnd"/>
+      <w:r>
+        <w:rPr>
+          <w:rFonts w:ascii="Times New Roman" w:hAnsi="Times New Roman" w:cs="Times New Roman"/>
+          <w:sz w:val="28"/>
+          <w:szCs w:val="28"/>
+        </w:rPr>
+        <w:t xml:space="preserve"> </w:t>
+      </w:r>
+      <w:proofErr w:type="spellStart"/>
+      <w:r>
+        <w:rPr>
+          <w:rFonts w:ascii="Times New Roman" w:hAnsi="Times New Roman" w:cs="Times New Roman"/>
+          <w:sz w:val="28"/>
+          <w:szCs w:val="28"/>
+        </w:rPr>
+        <w:t>bỏ</w:t>
+      </w:r>
+      <w:proofErr w:type="spellEnd"/>
+      <w:r>
+        <w:rPr>
+          <w:rFonts w:ascii="Times New Roman" w:hAnsi="Times New Roman" w:cs="Times New Roman"/>
+          <w:sz w:val="28"/>
+          <w:szCs w:val="28"/>
+        </w:rPr>
+        <w:t xml:space="preserve"> </w:t>
+      </w:r>
+      <w:proofErr w:type="spellStart"/>
+      <w:r>
+        <w:rPr>
+          <w:rFonts w:ascii="Times New Roman" w:hAnsi="Times New Roman" w:cs="Times New Roman"/>
+          <w:sz w:val="28"/>
+          <w:szCs w:val="28"/>
+        </w:rPr>
+        <w:t>một</w:t>
+      </w:r>
+      <w:proofErr w:type="spellEnd"/>
+      <w:r>
+        <w:rPr>
+          <w:rFonts w:ascii="Times New Roman" w:hAnsi="Times New Roman" w:cs="Times New Roman"/>
+          <w:sz w:val="28"/>
+          <w:szCs w:val="28"/>
+        </w:rPr>
+        <w:t xml:space="preserve"> </w:t>
+      </w:r>
+      <w:proofErr w:type="spellStart"/>
+      <w:r>
+        <w:rPr>
+          <w:rFonts w:ascii="Times New Roman" w:hAnsi="Times New Roman" w:cs="Times New Roman"/>
+          <w:sz w:val="28"/>
+          <w:szCs w:val="28"/>
+        </w:rPr>
+        <w:t>phần</w:t>
+      </w:r>
+      <w:proofErr w:type="spellEnd"/>
+      <w:r>
+        <w:rPr>
+          <w:rFonts w:ascii="Times New Roman" w:hAnsi="Times New Roman" w:cs="Times New Roman"/>
+          <w:sz w:val="28"/>
+          <w:szCs w:val="28"/>
+        </w:rPr>
+        <w:t xml:space="preserve"> </w:t>
+      </w:r>
+      <w:proofErr w:type="spellStart"/>
+      <w:r>
+        <w:rPr>
+          <w:rFonts w:ascii="Times New Roman" w:hAnsi="Times New Roman" w:cs="Times New Roman"/>
+          <w:sz w:val="28"/>
+          <w:szCs w:val="28"/>
+        </w:rPr>
+        <w:t>tử</w:t>
+      </w:r>
+      <w:proofErr w:type="spellEnd"/>
+      <w:r>
+        <w:rPr>
+          <w:rFonts w:ascii="Times New Roman" w:hAnsi="Times New Roman" w:cs="Times New Roman"/>
+          <w:sz w:val="28"/>
+          <w:szCs w:val="28"/>
+        </w:rPr>
+        <w:t xml:space="preserve"> </w:t>
+      </w:r>
+      <w:proofErr w:type="spellStart"/>
+      <w:r>
+        <w:rPr>
+          <w:rFonts w:ascii="Times New Roman" w:hAnsi="Times New Roman" w:cs="Times New Roman"/>
+          <w:sz w:val="28"/>
+          <w:szCs w:val="28"/>
+        </w:rPr>
+        <w:t>bên</w:t>
+      </w:r>
+      <w:proofErr w:type="spellEnd"/>
+      <w:r>
+        <w:rPr>
+          <w:rFonts w:ascii="Times New Roman" w:hAnsi="Times New Roman" w:cs="Times New Roman"/>
+          <w:sz w:val="28"/>
+          <w:szCs w:val="28"/>
+        </w:rPr>
+        <w:t xml:space="preserve"> </w:t>
+      </w:r>
+      <w:proofErr w:type="spellStart"/>
+      <w:r>
+        <w:rPr>
+          <w:rFonts w:ascii="Times New Roman" w:hAnsi="Times New Roman" w:cs="Times New Roman"/>
+          <w:sz w:val="28"/>
+          <w:szCs w:val="28"/>
+        </w:rPr>
+        <w:t>trong</w:t>
+      </w:r>
+      <w:proofErr w:type="spellEnd"/>
+      <w:r>
+        <w:rPr>
+          <w:rFonts w:ascii="Times New Roman" w:hAnsi="Times New Roman" w:cs="Times New Roman"/>
+          <w:sz w:val="28"/>
+          <w:szCs w:val="28"/>
+        </w:rPr>
+        <w:t xml:space="preserve"> stack.</w:t>
       </w:r>
     </w:p>
     <w:p>
@@ -618,6 +2697,7 @@
           <w:u w:val="single"/>
         </w:rPr>
       </w:pPr>
+      <w:proofErr w:type="spellStart"/>
       <w:r>
         <w:rPr>
           <w:rFonts w:ascii="Times New Roman" w:hAnsi="Times New Roman" w:cs="Times New Roman"/>
@@ -627,7 +2707,19 @@
           <w:szCs w:val="28"/>
           <w:u w:val="single"/>
         </w:rPr>
-        <w:t>Câu 2:</w:t>
+        <w:t>Câu</w:t>
+      </w:r>
+      <w:proofErr w:type="spellEnd"/>
+      <w:r>
+        <w:rPr>
+          <w:rFonts w:ascii="Times New Roman" w:hAnsi="Times New Roman" w:cs="Times New Roman"/>
+          <w:b/>
+          <w:bCs/>
+          <w:sz w:val="28"/>
+          <w:szCs w:val="28"/>
+          <w:u w:val="single"/>
+        </w:rPr>
+        <w:t xml:space="preserve"> 2:</w:t>
       </w:r>
     </w:p>
     <w:p>
@@ -644,13 +2736,59 @@
           <w:szCs w:val="28"/>
         </w:rPr>
       </w:pPr>
-      <w:r>
-        <w:rPr>
-          <w:rFonts w:ascii="Times New Roman" w:hAnsi="Times New Roman" w:cs="Times New Roman"/>
-          <w:sz w:val="28"/>
-          <w:szCs w:val="28"/>
-        </w:rPr>
-        <w:t>Hướng dẫn chạy file</w:t>
+      <w:proofErr w:type="spellStart"/>
+      <w:r>
+        <w:rPr>
+          <w:rFonts w:ascii="Times New Roman" w:hAnsi="Times New Roman" w:cs="Times New Roman"/>
+          <w:sz w:val="28"/>
+          <w:szCs w:val="28"/>
+        </w:rPr>
+        <w:t>Hướng</w:t>
+      </w:r>
+      <w:proofErr w:type="spellEnd"/>
+      <w:r>
+        <w:rPr>
+          <w:rFonts w:ascii="Times New Roman" w:hAnsi="Times New Roman" w:cs="Times New Roman"/>
+          <w:sz w:val="28"/>
+          <w:szCs w:val="28"/>
+        </w:rPr>
+        <w:t xml:space="preserve"> </w:t>
+      </w:r>
+      <w:proofErr w:type="spellStart"/>
+      <w:r>
+        <w:rPr>
+          <w:rFonts w:ascii="Times New Roman" w:hAnsi="Times New Roman" w:cs="Times New Roman"/>
+          <w:sz w:val="28"/>
+          <w:szCs w:val="28"/>
+        </w:rPr>
+        <w:t>dẫn</w:t>
+      </w:r>
+      <w:proofErr w:type="spellEnd"/>
+      <w:r>
+        <w:rPr>
+          <w:rFonts w:ascii="Times New Roman" w:hAnsi="Times New Roman" w:cs="Times New Roman"/>
+          <w:sz w:val="28"/>
+          <w:szCs w:val="28"/>
+        </w:rPr>
+        <w:t xml:space="preserve"> </w:t>
+      </w:r>
+      <w:proofErr w:type="spellStart"/>
+      <w:r>
+        <w:rPr>
+          <w:rFonts w:ascii="Times New Roman" w:hAnsi="Times New Roman" w:cs="Times New Roman"/>
+          <w:sz w:val="28"/>
+          <w:szCs w:val="28"/>
+        </w:rPr>
+        <w:t>chạy</w:t>
+      </w:r>
+      <w:proofErr w:type="spellEnd"/>
+      <w:r>
+        <w:rPr>
+          <w:rFonts w:ascii="Times New Roman" w:hAnsi="Times New Roman" w:cs="Times New Roman"/>
+          <w:sz w:val="28"/>
+          <w:szCs w:val="28"/>
+        </w:rPr>
+        <w:t xml:space="preserve"> file</w:t>
       </w:r>
       <w:r>
         <w:rPr>
@@ -675,13 +2813,77 @@
           <w:szCs w:val="28"/>
         </w:rPr>
       </w:pPr>
-      <w:r>
-        <w:rPr>
-          <w:rFonts w:ascii="Times New Roman" w:hAnsi="Times New Roman" w:cs="Times New Roman"/>
-          <w:sz w:val="28"/>
-          <w:szCs w:val="28"/>
-        </w:rPr>
-        <w:t>Bước 1: Mở visual studio và tạo 1 project C++.</w:t>
+      <w:proofErr w:type="spellStart"/>
+      <w:r>
+        <w:rPr>
+          <w:rFonts w:ascii="Times New Roman" w:hAnsi="Times New Roman" w:cs="Times New Roman"/>
+          <w:sz w:val="28"/>
+          <w:szCs w:val="28"/>
+        </w:rPr>
+        <w:t>Bước</w:t>
+      </w:r>
+      <w:proofErr w:type="spellEnd"/>
+      <w:r>
+        <w:rPr>
+          <w:rFonts w:ascii="Times New Roman" w:hAnsi="Times New Roman" w:cs="Times New Roman"/>
+          <w:sz w:val="28"/>
+          <w:szCs w:val="28"/>
+        </w:rPr>
+        <w:t xml:space="preserve"> 1: </w:t>
+      </w:r>
+      <w:proofErr w:type="spellStart"/>
+      <w:r>
+        <w:rPr>
+          <w:rFonts w:ascii="Times New Roman" w:hAnsi="Times New Roman" w:cs="Times New Roman"/>
+          <w:sz w:val="28"/>
+          <w:szCs w:val="28"/>
+        </w:rPr>
+        <w:t>Mở</w:t>
+      </w:r>
+      <w:proofErr w:type="spellEnd"/>
+      <w:r>
+        <w:rPr>
+          <w:rFonts w:ascii="Times New Roman" w:hAnsi="Times New Roman" w:cs="Times New Roman"/>
+          <w:sz w:val="28"/>
+          <w:szCs w:val="28"/>
+        </w:rPr>
+        <w:t xml:space="preserve"> visual studio </w:t>
+      </w:r>
+      <w:proofErr w:type="spellStart"/>
+      <w:r>
+        <w:rPr>
+          <w:rFonts w:ascii="Times New Roman" w:hAnsi="Times New Roman" w:cs="Times New Roman"/>
+          <w:sz w:val="28"/>
+          <w:szCs w:val="28"/>
+        </w:rPr>
+        <w:t>và</w:t>
+      </w:r>
+      <w:proofErr w:type="spellEnd"/>
+      <w:r>
+        <w:rPr>
+          <w:rFonts w:ascii="Times New Roman" w:hAnsi="Times New Roman" w:cs="Times New Roman"/>
+          <w:sz w:val="28"/>
+          <w:szCs w:val="28"/>
+        </w:rPr>
+        <w:t xml:space="preserve"> </w:t>
+      </w:r>
+      <w:proofErr w:type="spellStart"/>
+      <w:r>
+        <w:rPr>
+          <w:rFonts w:ascii="Times New Roman" w:hAnsi="Times New Roman" w:cs="Times New Roman"/>
+          <w:sz w:val="28"/>
+          <w:szCs w:val="28"/>
+        </w:rPr>
+        <w:t>tạo</w:t>
+      </w:r>
+      <w:proofErr w:type="spellEnd"/>
+      <w:r>
+        <w:rPr>
+          <w:rFonts w:ascii="Times New Roman" w:hAnsi="Times New Roman" w:cs="Times New Roman"/>
+          <w:sz w:val="28"/>
+          <w:szCs w:val="28"/>
+        </w:rPr>
+        <w:t xml:space="preserve"> 1 project C++.</w:t>
       </w:r>
     </w:p>
     <w:p>
@@ -750,13 +2952,59 @@
           <w:szCs w:val="28"/>
         </w:rPr>
       </w:pPr>
-      <w:r>
-        <w:rPr>
-          <w:rFonts w:ascii="Times New Roman" w:hAnsi="Times New Roman" w:cs="Times New Roman"/>
-          <w:sz w:val="28"/>
-          <w:szCs w:val="28"/>
-        </w:rPr>
-        <w:t>Bước 2: Đem file BoiSoCua3.cpp vào project.</w:t>
+      <w:proofErr w:type="spellStart"/>
+      <w:r>
+        <w:rPr>
+          <w:rFonts w:ascii="Times New Roman" w:hAnsi="Times New Roman" w:cs="Times New Roman"/>
+          <w:sz w:val="28"/>
+          <w:szCs w:val="28"/>
+        </w:rPr>
+        <w:t>Bước</w:t>
+      </w:r>
+      <w:proofErr w:type="spellEnd"/>
+      <w:r>
+        <w:rPr>
+          <w:rFonts w:ascii="Times New Roman" w:hAnsi="Times New Roman" w:cs="Times New Roman"/>
+          <w:sz w:val="28"/>
+          <w:szCs w:val="28"/>
+        </w:rPr>
+        <w:t xml:space="preserve"> 2: </w:t>
+      </w:r>
+      <w:proofErr w:type="spellStart"/>
+      <w:r>
+        <w:rPr>
+          <w:rFonts w:ascii="Times New Roman" w:hAnsi="Times New Roman" w:cs="Times New Roman"/>
+          <w:sz w:val="28"/>
+          <w:szCs w:val="28"/>
+        </w:rPr>
+        <w:t>Đem</w:t>
+      </w:r>
+      <w:proofErr w:type="spellEnd"/>
+      <w:r>
+        <w:rPr>
+          <w:rFonts w:ascii="Times New Roman" w:hAnsi="Times New Roman" w:cs="Times New Roman"/>
+          <w:sz w:val="28"/>
+          <w:szCs w:val="28"/>
+        </w:rPr>
+        <w:t xml:space="preserve"> file BoiSoCua3.cpp </w:t>
+      </w:r>
+      <w:proofErr w:type="spellStart"/>
+      <w:r>
+        <w:rPr>
+          <w:rFonts w:ascii="Times New Roman" w:hAnsi="Times New Roman" w:cs="Times New Roman"/>
+          <w:sz w:val="28"/>
+          <w:szCs w:val="28"/>
+        </w:rPr>
+        <w:t>vào</w:t>
+      </w:r>
+      <w:proofErr w:type="spellEnd"/>
+      <w:r>
+        <w:rPr>
+          <w:rFonts w:ascii="Times New Roman" w:hAnsi="Times New Roman" w:cs="Times New Roman"/>
+          <w:sz w:val="28"/>
+          <w:szCs w:val="28"/>
+        </w:rPr>
+        <w:t xml:space="preserve"> project.</w:t>
       </w:r>
     </w:p>
     <w:p>
@@ -827,13 +3075,491 @@
           <w:szCs w:val="28"/>
         </w:rPr>
       </w:pPr>
-      <w:r>
-        <w:rPr>
-          <w:rFonts w:ascii="Times New Roman" w:hAnsi="Times New Roman" w:cs="Times New Roman"/>
-          <w:sz w:val="28"/>
-          <w:szCs w:val="28"/>
-        </w:rPr>
-        <w:t>Bước 3: Bấm F5 để tiến hành build. Sau đó, nhập vào một số nguyên để chương trình kiểm tra xem số nguyên được nhập có phải bội số của 3 hay không.</w:t>
+      <w:proofErr w:type="spellStart"/>
+      <w:r>
+        <w:rPr>
+          <w:rFonts w:ascii="Times New Roman" w:hAnsi="Times New Roman" w:cs="Times New Roman"/>
+          <w:sz w:val="28"/>
+          <w:szCs w:val="28"/>
+        </w:rPr>
+        <w:t>Bước</w:t>
+      </w:r>
+      <w:proofErr w:type="spellEnd"/>
+      <w:r>
+        <w:rPr>
+          <w:rFonts w:ascii="Times New Roman" w:hAnsi="Times New Roman" w:cs="Times New Roman"/>
+          <w:sz w:val="28"/>
+          <w:szCs w:val="28"/>
+        </w:rPr>
+        <w:t xml:space="preserve"> 3: </w:t>
+      </w:r>
+      <w:proofErr w:type="spellStart"/>
+      <w:r>
+        <w:rPr>
+          <w:rFonts w:ascii="Times New Roman" w:hAnsi="Times New Roman" w:cs="Times New Roman"/>
+          <w:sz w:val="28"/>
+          <w:szCs w:val="28"/>
+        </w:rPr>
+        <w:t>Bấm</w:t>
+      </w:r>
+      <w:proofErr w:type="spellEnd"/>
+      <w:r>
+        <w:rPr>
+          <w:rFonts w:ascii="Times New Roman" w:hAnsi="Times New Roman" w:cs="Times New Roman"/>
+          <w:sz w:val="28"/>
+          <w:szCs w:val="28"/>
+        </w:rPr>
+        <w:t xml:space="preserve"> F5 </w:t>
+      </w:r>
+      <w:proofErr w:type="spellStart"/>
+      <w:r>
+        <w:rPr>
+          <w:rFonts w:ascii="Times New Roman" w:hAnsi="Times New Roman" w:cs="Times New Roman"/>
+          <w:sz w:val="28"/>
+          <w:szCs w:val="28"/>
+        </w:rPr>
+        <w:t>để</w:t>
+      </w:r>
+      <w:proofErr w:type="spellEnd"/>
+      <w:r>
+        <w:rPr>
+          <w:rFonts w:ascii="Times New Roman" w:hAnsi="Times New Roman" w:cs="Times New Roman"/>
+          <w:sz w:val="28"/>
+          <w:szCs w:val="28"/>
+        </w:rPr>
+        <w:t xml:space="preserve"> </w:t>
+      </w:r>
+      <w:proofErr w:type="spellStart"/>
+      <w:r>
+        <w:rPr>
+          <w:rFonts w:ascii="Times New Roman" w:hAnsi="Times New Roman" w:cs="Times New Roman"/>
+          <w:sz w:val="28"/>
+          <w:szCs w:val="28"/>
+        </w:rPr>
+        <w:t>tiến</w:t>
+      </w:r>
+      <w:proofErr w:type="spellEnd"/>
+      <w:r>
+        <w:rPr>
+          <w:rFonts w:ascii="Times New Roman" w:hAnsi="Times New Roman" w:cs="Times New Roman"/>
+          <w:sz w:val="28"/>
+          <w:szCs w:val="28"/>
+        </w:rPr>
+        <w:t xml:space="preserve"> </w:t>
+      </w:r>
+      <w:proofErr w:type="spellStart"/>
+      <w:r>
+        <w:rPr>
+          <w:rFonts w:ascii="Times New Roman" w:hAnsi="Times New Roman" w:cs="Times New Roman"/>
+          <w:sz w:val="28"/>
+          <w:szCs w:val="28"/>
+        </w:rPr>
+        <w:t>hành</w:t>
+      </w:r>
+      <w:proofErr w:type="spellEnd"/>
+      <w:r>
+        <w:rPr>
+          <w:rFonts w:ascii="Times New Roman" w:hAnsi="Times New Roman" w:cs="Times New Roman"/>
+          <w:sz w:val="28"/>
+          <w:szCs w:val="28"/>
+        </w:rPr>
+        <w:t xml:space="preserve"> build. Sau </w:t>
+      </w:r>
+      <w:proofErr w:type="spellStart"/>
+      <w:r>
+        <w:rPr>
+          <w:rFonts w:ascii="Times New Roman" w:hAnsi="Times New Roman" w:cs="Times New Roman"/>
+          <w:sz w:val="28"/>
+          <w:szCs w:val="28"/>
+        </w:rPr>
+        <w:t>đó</w:t>
+      </w:r>
+      <w:proofErr w:type="spellEnd"/>
+      <w:r>
+        <w:rPr>
+          <w:rFonts w:ascii="Times New Roman" w:hAnsi="Times New Roman" w:cs="Times New Roman"/>
+          <w:sz w:val="28"/>
+          <w:szCs w:val="28"/>
+        </w:rPr>
+        <w:t xml:space="preserve">, </w:t>
+      </w:r>
+      <w:proofErr w:type="spellStart"/>
+      <w:r>
+        <w:rPr>
+          <w:rFonts w:ascii="Times New Roman" w:hAnsi="Times New Roman" w:cs="Times New Roman"/>
+          <w:sz w:val="28"/>
+          <w:szCs w:val="28"/>
+        </w:rPr>
+        <w:t>nhập</w:t>
+      </w:r>
+      <w:proofErr w:type="spellEnd"/>
+      <w:r>
+        <w:rPr>
+          <w:rFonts w:ascii="Times New Roman" w:hAnsi="Times New Roman" w:cs="Times New Roman"/>
+          <w:sz w:val="28"/>
+          <w:szCs w:val="28"/>
+        </w:rPr>
+        <w:t xml:space="preserve"> </w:t>
+      </w:r>
+      <w:proofErr w:type="spellStart"/>
+      <w:r>
+        <w:rPr>
+          <w:rFonts w:ascii="Times New Roman" w:hAnsi="Times New Roman" w:cs="Times New Roman"/>
+          <w:sz w:val="28"/>
+          <w:szCs w:val="28"/>
+        </w:rPr>
+        <w:t>vào</w:t>
+      </w:r>
+      <w:proofErr w:type="spellEnd"/>
+      <w:r>
+        <w:rPr>
+          <w:rFonts w:ascii="Times New Roman" w:hAnsi="Times New Roman" w:cs="Times New Roman"/>
+          <w:sz w:val="28"/>
+          <w:szCs w:val="28"/>
+        </w:rPr>
+        <w:t xml:space="preserve"> </w:t>
+      </w:r>
+      <w:proofErr w:type="spellStart"/>
+      <w:r>
+        <w:rPr>
+          <w:rFonts w:ascii="Times New Roman" w:hAnsi="Times New Roman" w:cs="Times New Roman"/>
+          <w:sz w:val="28"/>
+          <w:szCs w:val="28"/>
+        </w:rPr>
+        <w:t>một</w:t>
+      </w:r>
+      <w:proofErr w:type="spellEnd"/>
+      <w:r>
+        <w:rPr>
+          <w:rFonts w:ascii="Times New Roman" w:hAnsi="Times New Roman" w:cs="Times New Roman"/>
+          <w:sz w:val="28"/>
+          <w:szCs w:val="28"/>
+        </w:rPr>
+        <w:t xml:space="preserve"> </w:t>
+      </w:r>
+      <w:proofErr w:type="spellStart"/>
+      <w:r>
+        <w:rPr>
+          <w:rFonts w:ascii="Times New Roman" w:hAnsi="Times New Roman" w:cs="Times New Roman"/>
+          <w:sz w:val="28"/>
+          <w:szCs w:val="28"/>
+        </w:rPr>
+        <w:t>số</w:t>
+      </w:r>
+      <w:proofErr w:type="spellEnd"/>
+      <w:r>
+        <w:rPr>
+          <w:rFonts w:ascii="Times New Roman" w:hAnsi="Times New Roman" w:cs="Times New Roman"/>
+          <w:sz w:val="28"/>
+          <w:szCs w:val="28"/>
+        </w:rPr>
+        <w:t xml:space="preserve"> </w:t>
+      </w:r>
+      <w:proofErr w:type="spellStart"/>
+      <w:r>
+        <w:rPr>
+          <w:rFonts w:ascii="Times New Roman" w:hAnsi="Times New Roman" w:cs="Times New Roman"/>
+          <w:sz w:val="28"/>
+          <w:szCs w:val="28"/>
+        </w:rPr>
+        <w:t>nguyên</w:t>
+      </w:r>
+      <w:proofErr w:type="spellEnd"/>
+      <w:r>
+        <w:rPr>
+          <w:rFonts w:ascii="Times New Roman" w:hAnsi="Times New Roman" w:cs="Times New Roman"/>
+          <w:sz w:val="28"/>
+          <w:szCs w:val="28"/>
+        </w:rPr>
+        <w:t xml:space="preserve"> </w:t>
+      </w:r>
+      <w:proofErr w:type="spellStart"/>
+      <w:r>
+        <w:rPr>
+          <w:rFonts w:ascii="Times New Roman" w:hAnsi="Times New Roman" w:cs="Times New Roman"/>
+          <w:sz w:val="28"/>
+          <w:szCs w:val="28"/>
+        </w:rPr>
+        <w:t>để</w:t>
+      </w:r>
+      <w:proofErr w:type="spellEnd"/>
+      <w:r>
+        <w:rPr>
+          <w:rFonts w:ascii="Times New Roman" w:hAnsi="Times New Roman" w:cs="Times New Roman"/>
+          <w:sz w:val="28"/>
+          <w:szCs w:val="28"/>
+        </w:rPr>
+        <w:t xml:space="preserve"> </w:t>
+      </w:r>
+      <w:proofErr w:type="spellStart"/>
+      <w:r>
+        <w:rPr>
+          <w:rFonts w:ascii="Times New Roman" w:hAnsi="Times New Roman" w:cs="Times New Roman"/>
+          <w:sz w:val="28"/>
+          <w:szCs w:val="28"/>
+        </w:rPr>
+        <w:t>chương</w:t>
+      </w:r>
+      <w:proofErr w:type="spellEnd"/>
+      <w:r>
+        <w:rPr>
+          <w:rFonts w:ascii="Times New Roman" w:hAnsi="Times New Roman" w:cs="Times New Roman"/>
+          <w:sz w:val="28"/>
+          <w:szCs w:val="28"/>
+        </w:rPr>
+        <w:t xml:space="preserve"> </w:t>
+      </w:r>
+      <w:proofErr w:type="spellStart"/>
+      <w:r>
+        <w:rPr>
+          <w:rFonts w:ascii="Times New Roman" w:hAnsi="Times New Roman" w:cs="Times New Roman"/>
+          <w:sz w:val="28"/>
+          <w:szCs w:val="28"/>
+        </w:rPr>
+        <w:t>trình</w:t>
+      </w:r>
+      <w:proofErr w:type="spellEnd"/>
+      <w:r>
+        <w:rPr>
+          <w:rFonts w:ascii="Times New Roman" w:hAnsi="Times New Roman" w:cs="Times New Roman"/>
+          <w:sz w:val="28"/>
+          <w:szCs w:val="28"/>
+        </w:rPr>
+        <w:t xml:space="preserve"> </w:t>
+      </w:r>
+      <w:proofErr w:type="spellStart"/>
+      <w:r>
+        <w:rPr>
+          <w:rFonts w:ascii="Times New Roman" w:hAnsi="Times New Roman" w:cs="Times New Roman"/>
+          <w:sz w:val="28"/>
+          <w:szCs w:val="28"/>
+        </w:rPr>
+        <w:t>kiểm</w:t>
+      </w:r>
+      <w:proofErr w:type="spellEnd"/>
+      <w:r>
+        <w:rPr>
+          <w:rFonts w:ascii="Times New Roman" w:hAnsi="Times New Roman" w:cs="Times New Roman"/>
+          <w:sz w:val="28"/>
+          <w:szCs w:val="28"/>
+        </w:rPr>
+        <w:t xml:space="preserve"> </w:t>
+      </w:r>
+      <w:proofErr w:type="spellStart"/>
+      <w:r>
+        <w:rPr>
+          <w:rFonts w:ascii="Times New Roman" w:hAnsi="Times New Roman" w:cs="Times New Roman"/>
+          <w:sz w:val="28"/>
+          <w:szCs w:val="28"/>
+        </w:rPr>
+        <w:t>tra</w:t>
+      </w:r>
+      <w:proofErr w:type="spellEnd"/>
+      <w:r>
+        <w:rPr>
+          <w:rFonts w:ascii="Times New Roman" w:hAnsi="Times New Roman" w:cs="Times New Roman"/>
+          <w:sz w:val="28"/>
+          <w:szCs w:val="28"/>
+        </w:rPr>
+        <w:t xml:space="preserve"> </w:t>
+      </w:r>
+      <w:proofErr w:type="spellStart"/>
+      <w:r>
+        <w:rPr>
+          <w:rFonts w:ascii="Times New Roman" w:hAnsi="Times New Roman" w:cs="Times New Roman"/>
+          <w:sz w:val="28"/>
+          <w:szCs w:val="28"/>
+        </w:rPr>
+        <w:t>xem</w:t>
+      </w:r>
+      <w:proofErr w:type="spellEnd"/>
+      <w:r>
+        <w:rPr>
+          <w:rFonts w:ascii="Times New Roman" w:hAnsi="Times New Roman" w:cs="Times New Roman"/>
+          <w:sz w:val="28"/>
+          <w:szCs w:val="28"/>
+        </w:rPr>
+        <w:t xml:space="preserve"> </w:t>
+      </w:r>
+      <w:proofErr w:type="spellStart"/>
+      <w:r>
+        <w:rPr>
+          <w:rFonts w:ascii="Times New Roman" w:hAnsi="Times New Roman" w:cs="Times New Roman"/>
+          <w:sz w:val="28"/>
+          <w:szCs w:val="28"/>
+        </w:rPr>
+        <w:t>số</w:t>
+      </w:r>
+      <w:proofErr w:type="spellEnd"/>
+      <w:r>
+        <w:rPr>
+          <w:rFonts w:ascii="Times New Roman" w:hAnsi="Times New Roman" w:cs="Times New Roman"/>
+          <w:sz w:val="28"/>
+          <w:szCs w:val="28"/>
+        </w:rPr>
+        <w:t xml:space="preserve"> </w:t>
+      </w:r>
+      <w:proofErr w:type="spellStart"/>
+      <w:r>
+        <w:rPr>
+          <w:rFonts w:ascii="Times New Roman" w:hAnsi="Times New Roman" w:cs="Times New Roman"/>
+          <w:sz w:val="28"/>
+          <w:szCs w:val="28"/>
+        </w:rPr>
+        <w:t>nguyên</w:t>
+      </w:r>
+      <w:proofErr w:type="spellEnd"/>
+      <w:r>
+        <w:rPr>
+          <w:rFonts w:ascii="Times New Roman" w:hAnsi="Times New Roman" w:cs="Times New Roman"/>
+          <w:sz w:val="28"/>
+          <w:szCs w:val="28"/>
+        </w:rPr>
+        <w:t xml:space="preserve"> </w:t>
+      </w:r>
+      <w:proofErr w:type="spellStart"/>
+      <w:r>
+        <w:rPr>
+          <w:rFonts w:ascii="Times New Roman" w:hAnsi="Times New Roman" w:cs="Times New Roman"/>
+          <w:sz w:val="28"/>
+          <w:szCs w:val="28"/>
+        </w:rPr>
+        <w:t>được</w:t>
+      </w:r>
+      <w:proofErr w:type="spellEnd"/>
+      <w:r>
+        <w:rPr>
+          <w:rFonts w:ascii="Times New Roman" w:hAnsi="Times New Roman" w:cs="Times New Roman"/>
+          <w:sz w:val="28"/>
+          <w:szCs w:val="28"/>
+        </w:rPr>
+        <w:t xml:space="preserve"> </w:t>
+      </w:r>
+      <w:proofErr w:type="spellStart"/>
+      <w:r>
+        <w:rPr>
+          <w:rFonts w:ascii="Times New Roman" w:hAnsi="Times New Roman" w:cs="Times New Roman"/>
+          <w:sz w:val="28"/>
+          <w:szCs w:val="28"/>
+        </w:rPr>
+        <w:t>nhập</w:t>
+      </w:r>
+      <w:proofErr w:type="spellEnd"/>
+      <w:r>
+        <w:rPr>
+          <w:rFonts w:ascii="Times New Roman" w:hAnsi="Times New Roman" w:cs="Times New Roman"/>
+          <w:sz w:val="28"/>
+          <w:szCs w:val="28"/>
+        </w:rPr>
+        <w:t xml:space="preserve"> </w:t>
+      </w:r>
+      <w:proofErr w:type="spellStart"/>
+      <w:r>
+        <w:rPr>
+          <w:rFonts w:ascii="Times New Roman" w:hAnsi="Times New Roman" w:cs="Times New Roman"/>
+          <w:sz w:val="28"/>
+          <w:szCs w:val="28"/>
+        </w:rPr>
+        <w:t>có</w:t>
+      </w:r>
+      <w:proofErr w:type="spellEnd"/>
+      <w:r>
+        <w:rPr>
+          <w:rFonts w:ascii="Times New Roman" w:hAnsi="Times New Roman" w:cs="Times New Roman"/>
+          <w:sz w:val="28"/>
+          <w:szCs w:val="28"/>
+        </w:rPr>
+        <w:t xml:space="preserve"> </w:t>
+      </w:r>
+      <w:proofErr w:type="spellStart"/>
+      <w:r>
+        <w:rPr>
+          <w:rFonts w:ascii="Times New Roman" w:hAnsi="Times New Roman" w:cs="Times New Roman"/>
+          <w:sz w:val="28"/>
+          <w:szCs w:val="28"/>
+        </w:rPr>
+        <w:t>phải</w:t>
+      </w:r>
+      <w:proofErr w:type="spellEnd"/>
+      <w:r>
+        <w:rPr>
+          <w:rFonts w:ascii="Times New Roman" w:hAnsi="Times New Roman" w:cs="Times New Roman"/>
+          <w:sz w:val="28"/>
+          <w:szCs w:val="28"/>
+        </w:rPr>
+        <w:t xml:space="preserve"> </w:t>
+      </w:r>
+      <w:proofErr w:type="spellStart"/>
+      <w:r>
+        <w:rPr>
+          <w:rFonts w:ascii="Times New Roman" w:hAnsi="Times New Roman" w:cs="Times New Roman"/>
+          <w:sz w:val="28"/>
+          <w:szCs w:val="28"/>
+        </w:rPr>
+        <w:t>bội</w:t>
+      </w:r>
+      <w:proofErr w:type="spellEnd"/>
+      <w:r>
+        <w:rPr>
+          <w:rFonts w:ascii="Times New Roman" w:hAnsi="Times New Roman" w:cs="Times New Roman"/>
+          <w:sz w:val="28"/>
+          <w:szCs w:val="28"/>
+        </w:rPr>
+        <w:t xml:space="preserve"> </w:t>
+      </w:r>
+      <w:proofErr w:type="spellStart"/>
+      <w:r>
+        <w:rPr>
+          <w:rFonts w:ascii="Times New Roman" w:hAnsi="Times New Roman" w:cs="Times New Roman"/>
+          <w:sz w:val="28"/>
+          <w:szCs w:val="28"/>
+        </w:rPr>
+        <w:t>số</w:t>
+      </w:r>
+      <w:proofErr w:type="spellEnd"/>
+      <w:r>
+        <w:rPr>
+          <w:rFonts w:ascii="Times New Roman" w:hAnsi="Times New Roman" w:cs="Times New Roman"/>
+          <w:sz w:val="28"/>
+          <w:szCs w:val="28"/>
+        </w:rPr>
+        <w:t xml:space="preserve"> </w:t>
+      </w:r>
+      <w:proofErr w:type="spellStart"/>
+      <w:r>
+        <w:rPr>
+          <w:rFonts w:ascii="Times New Roman" w:hAnsi="Times New Roman" w:cs="Times New Roman"/>
+          <w:sz w:val="28"/>
+          <w:szCs w:val="28"/>
+        </w:rPr>
+        <w:t>của</w:t>
+      </w:r>
+      <w:proofErr w:type="spellEnd"/>
+      <w:r>
+        <w:rPr>
+          <w:rFonts w:ascii="Times New Roman" w:hAnsi="Times New Roman" w:cs="Times New Roman"/>
+          <w:sz w:val="28"/>
+          <w:szCs w:val="28"/>
+        </w:rPr>
+        <w:t xml:space="preserve"> 3 hay </w:t>
+      </w:r>
+      <w:proofErr w:type="spellStart"/>
+      <w:r>
+        <w:rPr>
+          <w:rFonts w:ascii="Times New Roman" w:hAnsi="Times New Roman" w:cs="Times New Roman"/>
+          <w:sz w:val="28"/>
+          <w:szCs w:val="28"/>
+        </w:rPr>
+        <w:t>không</w:t>
+      </w:r>
+      <w:proofErr w:type="spellEnd"/>
+      <w:r>
+        <w:rPr>
+          <w:rFonts w:ascii="Times New Roman" w:hAnsi="Times New Roman" w:cs="Times New Roman"/>
+          <w:sz w:val="28"/>
+          <w:szCs w:val="28"/>
+        </w:rPr>
+        <w:t>.</w:t>
       </w:r>
     </w:p>
     <w:p>
@@ -959,13 +3685,59 @@
           <w:szCs w:val="28"/>
         </w:rPr>
       </w:pPr>
-      <w:r>
-        <w:rPr>
-          <w:rFonts w:ascii="Times New Roman" w:hAnsi="Times New Roman" w:cs="Times New Roman"/>
-          <w:sz w:val="28"/>
-          <w:szCs w:val="28"/>
-        </w:rPr>
-        <w:t>Hướng dẫn chạy file</w:t>
+      <w:proofErr w:type="spellStart"/>
+      <w:r>
+        <w:rPr>
+          <w:rFonts w:ascii="Times New Roman" w:hAnsi="Times New Roman" w:cs="Times New Roman"/>
+          <w:sz w:val="28"/>
+          <w:szCs w:val="28"/>
+        </w:rPr>
+        <w:t>Hướng</w:t>
+      </w:r>
+      <w:proofErr w:type="spellEnd"/>
+      <w:r>
+        <w:rPr>
+          <w:rFonts w:ascii="Times New Roman" w:hAnsi="Times New Roman" w:cs="Times New Roman"/>
+          <w:sz w:val="28"/>
+          <w:szCs w:val="28"/>
+        </w:rPr>
+        <w:t xml:space="preserve"> </w:t>
+      </w:r>
+      <w:proofErr w:type="spellStart"/>
+      <w:r>
+        <w:rPr>
+          <w:rFonts w:ascii="Times New Roman" w:hAnsi="Times New Roman" w:cs="Times New Roman"/>
+          <w:sz w:val="28"/>
+          <w:szCs w:val="28"/>
+        </w:rPr>
+        <w:t>dẫn</w:t>
+      </w:r>
+      <w:proofErr w:type="spellEnd"/>
+      <w:r>
+        <w:rPr>
+          <w:rFonts w:ascii="Times New Roman" w:hAnsi="Times New Roman" w:cs="Times New Roman"/>
+          <w:sz w:val="28"/>
+          <w:szCs w:val="28"/>
+        </w:rPr>
+        <w:t xml:space="preserve"> </w:t>
+      </w:r>
+      <w:proofErr w:type="spellStart"/>
+      <w:r>
+        <w:rPr>
+          <w:rFonts w:ascii="Times New Roman" w:hAnsi="Times New Roman" w:cs="Times New Roman"/>
+          <w:sz w:val="28"/>
+          <w:szCs w:val="28"/>
+        </w:rPr>
+        <w:t>chạy</w:t>
+      </w:r>
+      <w:proofErr w:type="spellEnd"/>
+      <w:r>
+        <w:rPr>
+          <w:rFonts w:ascii="Times New Roman" w:hAnsi="Times New Roman" w:cs="Times New Roman"/>
+          <w:sz w:val="28"/>
+          <w:szCs w:val="28"/>
+        </w:rPr>
+        <w:t xml:space="preserve"> file</w:t>
       </w:r>
       <w:r>
         <w:rPr>
@@ -990,13 +3762,77 @@
           <w:szCs w:val="28"/>
         </w:rPr>
       </w:pPr>
-      <w:r>
-        <w:rPr>
-          <w:rFonts w:ascii="Times New Roman" w:hAnsi="Times New Roman" w:cs="Times New Roman"/>
-          <w:sz w:val="28"/>
-          <w:szCs w:val="28"/>
-        </w:rPr>
-        <w:t>Bước 1: Mở CMD và chạy file BoiSoCua3.sh.</w:t>
+      <w:proofErr w:type="spellStart"/>
+      <w:r>
+        <w:rPr>
+          <w:rFonts w:ascii="Times New Roman" w:hAnsi="Times New Roman" w:cs="Times New Roman"/>
+          <w:sz w:val="28"/>
+          <w:szCs w:val="28"/>
+        </w:rPr>
+        <w:t>Bước</w:t>
+      </w:r>
+      <w:proofErr w:type="spellEnd"/>
+      <w:r>
+        <w:rPr>
+          <w:rFonts w:ascii="Times New Roman" w:hAnsi="Times New Roman" w:cs="Times New Roman"/>
+          <w:sz w:val="28"/>
+          <w:szCs w:val="28"/>
+        </w:rPr>
+        <w:t xml:space="preserve"> 1: </w:t>
+      </w:r>
+      <w:proofErr w:type="spellStart"/>
+      <w:r>
+        <w:rPr>
+          <w:rFonts w:ascii="Times New Roman" w:hAnsi="Times New Roman" w:cs="Times New Roman"/>
+          <w:sz w:val="28"/>
+          <w:szCs w:val="28"/>
+        </w:rPr>
+        <w:t>Mở</w:t>
+      </w:r>
+      <w:proofErr w:type="spellEnd"/>
+      <w:r>
+        <w:rPr>
+          <w:rFonts w:ascii="Times New Roman" w:hAnsi="Times New Roman" w:cs="Times New Roman"/>
+          <w:sz w:val="28"/>
+          <w:szCs w:val="28"/>
+        </w:rPr>
+        <w:t xml:space="preserve"> CMD </w:t>
+      </w:r>
+      <w:proofErr w:type="spellStart"/>
+      <w:r>
+        <w:rPr>
+          <w:rFonts w:ascii="Times New Roman" w:hAnsi="Times New Roman" w:cs="Times New Roman"/>
+          <w:sz w:val="28"/>
+          <w:szCs w:val="28"/>
+        </w:rPr>
+        <w:t>và</w:t>
+      </w:r>
+      <w:proofErr w:type="spellEnd"/>
+      <w:r>
+        <w:rPr>
+          <w:rFonts w:ascii="Times New Roman" w:hAnsi="Times New Roman" w:cs="Times New Roman"/>
+          <w:sz w:val="28"/>
+          <w:szCs w:val="28"/>
+        </w:rPr>
+        <w:t xml:space="preserve"> </w:t>
+      </w:r>
+      <w:proofErr w:type="spellStart"/>
+      <w:r>
+        <w:rPr>
+          <w:rFonts w:ascii="Times New Roman" w:hAnsi="Times New Roman" w:cs="Times New Roman"/>
+          <w:sz w:val="28"/>
+          <w:szCs w:val="28"/>
+        </w:rPr>
+        <w:t>chạy</w:t>
+      </w:r>
+      <w:proofErr w:type="spellEnd"/>
+      <w:r>
+        <w:rPr>
+          <w:rFonts w:ascii="Times New Roman" w:hAnsi="Times New Roman" w:cs="Times New Roman"/>
+          <w:sz w:val="28"/>
+          <w:szCs w:val="28"/>
+        </w:rPr>
+        <w:t xml:space="preserve"> file BoiSoCua3.sh.</w:t>
       </w:r>
     </w:p>
     <w:p>
@@ -1115,13 +3951,131 @@
           <w:szCs w:val="28"/>
         </w:rPr>
       </w:pPr>
-      <w:r>
-        <w:rPr>
-          <w:rFonts w:ascii="Times New Roman" w:hAnsi="Times New Roman" w:cs="Times New Roman"/>
-          <w:sz w:val="28"/>
-          <w:szCs w:val="28"/>
-        </w:rPr>
-        <w:t>Bước 2: Nhập vào 1 số nguyên bất kì.</w:t>
+      <w:proofErr w:type="spellStart"/>
+      <w:r>
+        <w:rPr>
+          <w:rFonts w:ascii="Times New Roman" w:hAnsi="Times New Roman" w:cs="Times New Roman"/>
+          <w:sz w:val="28"/>
+          <w:szCs w:val="28"/>
+        </w:rPr>
+        <w:t>Bước</w:t>
+      </w:r>
+      <w:proofErr w:type="spellEnd"/>
+      <w:r>
+        <w:rPr>
+          <w:rFonts w:ascii="Times New Roman" w:hAnsi="Times New Roman" w:cs="Times New Roman"/>
+          <w:sz w:val="28"/>
+          <w:szCs w:val="28"/>
+        </w:rPr>
+        <w:t xml:space="preserve"> 2: </w:t>
+      </w:r>
+      <w:proofErr w:type="spellStart"/>
+      <w:r>
+        <w:rPr>
+          <w:rFonts w:ascii="Times New Roman" w:hAnsi="Times New Roman" w:cs="Times New Roman"/>
+          <w:sz w:val="28"/>
+          <w:szCs w:val="28"/>
+        </w:rPr>
+        <w:t>Nhập</w:t>
+      </w:r>
+      <w:proofErr w:type="spellEnd"/>
+      <w:r>
+        <w:rPr>
+          <w:rFonts w:ascii="Times New Roman" w:hAnsi="Times New Roman" w:cs="Times New Roman"/>
+          <w:sz w:val="28"/>
+          <w:szCs w:val="28"/>
+        </w:rPr>
+        <w:t xml:space="preserve"> </w:t>
+      </w:r>
+      <w:proofErr w:type="spellStart"/>
+      <w:r>
+        <w:rPr>
+          <w:rFonts w:ascii="Times New Roman" w:hAnsi="Times New Roman" w:cs="Times New Roman"/>
+          <w:sz w:val="28"/>
+          <w:szCs w:val="28"/>
+        </w:rPr>
+        <w:t>vào</w:t>
+      </w:r>
+      <w:proofErr w:type="spellEnd"/>
+      <w:r>
+        <w:rPr>
+          <w:rFonts w:ascii="Times New Roman" w:hAnsi="Times New Roman" w:cs="Times New Roman"/>
+          <w:sz w:val="28"/>
+          <w:szCs w:val="28"/>
+        </w:rPr>
+        <w:t xml:space="preserve"> 1 </w:t>
+      </w:r>
+      <w:proofErr w:type="spellStart"/>
+      <w:r>
+        <w:rPr>
+          <w:rFonts w:ascii="Times New Roman" w:hAnsi="Times New Roman" w:cs="Times New Roman"/>
+          <w:sz w:val="28"/>
+          <w:szCs w:val="28"/>
+        </w:rPr>
+        <w:t>số</w:t>
+      </w:r>
+      <w:proofErr w:type="spellEnd"/>
+      <w:r>
+        <w:rPr>
+          <w:rFonts w:ascii="Times New Roman" w:hAnsi="Times New Roman" w:cs="Times New Roman"/>
+          <w:sz w:val="28"/>
+          <w:szCs w:val="28"/>
+        </w:rPr>
+        <w:t xml:space="preserve"> </w:t>
+      </w:r>
+      <w:proofErr w:type="spellStart"/>
+      <w:r>
+        <w:rPr>
+          <w:rFonts w:ascii="Times New Roman" w:hAnsi="Times New Roman" w:cs="Times New Roman"/>
+          <w:sz w:val="28"/>
+          <w:szCs w:val="28"/>
+        </w:rPr>
+        <w:t>nguyên</w:t>
+      </w:r>
+      <w:proofErr w:type="spellEnd"/>
+      <w:r>
+        <w:rPr>
+          <w:rFonts w:ascii="Times New Roman" w:hAnsi="Times New Roman" w:cs="Times New Roman"/>
+          <w:sz w:val="28"/>
+          <w:szCs w:val="28"/>
+        </w:rPr>
+        <w:t xml:space="preserve"> </w:t>
+      </w:r>
+      <w:proofErr w:type="spellStart"/>
+      <w:r>
+        <w:rPr>
+          <w:rFonts w:ascii="Times New Roman" w:hAnsi="Times New Roman" w:cs="Times New Roman"/>
+          <w:sz w:val="28"/>
+          <w:szCs w:val="28"/>
+        </w:rPr>
+        <w:t>bất</w:t>
+      </w:r>
+      <w:proofErr w:type="spellEnd"/>
+      <w:r>
+        <w:rPr>
+          <w:rFonts w:ascii="Times New Roman" w:hAnsi="Times New Roman" w:cs="Times New Roman"/>
+          <w:sz w:val="28"/>
+          <w:szCs w:val="28"/>
+        </w:rPr>
+        <w:t xml:space="preserve"> </w:t>
+      </w:r>
+      <w:proofErr w:type="spellStart"/>
+      <w:r>
+        <w:rPr>
+          <w:rFonts w:ascii="Times New Roman" w:hAnsi="Times New Roman" w:cs="Times New Roman"/>
+          <w:sz w:val="28"/>
+          <w:szCs w:val="28"/>
+        </w:rPr>
+        <w:t>kì</w:t>
+      </w:r>
+      <w:proofErr w:type="spellEnd"/>
+      <w:r>
+        <w:rPr>
+          <w:rFonts w:ascii="Times New Roman" w:hAnsi="Times New Roman" w:cs="Times New Roman"/>
+          <w:sz w:val="28"/>
+          <w:szCs w:val="28"/>
+        </w:rPr>
+        <w:t>.</w:t>
       </w:r>
     </w:p>
     <w:p>
@@ -1191,13 +4145,221 @@
           <w:szCs w:val="28"/>
         </w:rPr>
       </w:pPr>
-      <w:r>
-        <w:rPr>
-          <w:rFonts w:ascii="Times New Roman" w:hAnsi="Times New Roman" w:cs="Times New Roman"/>
-          <w:sz w:val="28"/>
-          <w:szCs w:val="28"/>
-        </w:rPr>
-        <w:t>Bước 3: Kiểm tra tại cùng vị trí thư mục của BoiSoCua3.sh và tìm file kq.txt.</w:t>
+      <w:proofErr w:type="spellStart"/>
+      <w:r>
+        <w:rPr>
+          <w:rFonts w:ascii="Times New Roman" w:hAnsi="Times New Roman" w:cs="Times New Roman"/>
+          <w:sz w:val="28"/>
+          <w:szCs w:val="28"/>
+        </w:rPr>
+        <w:t>Bước</w:t>
+      </w:r>
+      <w:proofErr w:type="spellEnd"/>
+      <w:r>
+        <w:rPr>
+          <w:rFonts w:ascii="Times New Roman" w:hAnsi="Times New Roman" w:cs="Times New Roman"/>
+          <w:sz w:val="28"/>
+          <w:szCs w:val="28"/>
+        </w:rPr>
+        <w:t xml:space="preserve"> 3: </w:t>
+      </w:r>
+      <w:proofErr w:type="spellStart"/>
+      <w:r>
+        <w:rPr>
+          <w:rFonts w:ascii="Times New Roman" w:hAnsi="Times New Roman" w:cs="Times New Roman"/>
+          <w:sz w:val="28"/>
+          <w:szCs w:val="28"/>
+        </w:rPr>
+        <w:t>Kiểm</w:t>
+      </w:r>
+      <w:proofErr w:type="spellEnd"/>
+      <w:r>
+        <w:rPr>
+          <w:rFonts w:ascii="Times New Roman" w:hAnsi="Times New Roman" w:cs="Times New Roman"/>
+          <w:sz w:val="28"/>
+          <w:szCs w:val="28"/>
+        </w:rPr>
+        <w:t xml:space="preserve"> </w:t>
+      </w:r>
+      <w:proofErr w:type="spellStart"/>
+      <w:r>
+        <w:rPr>
+          <w:rFonts w:ascii="Times New Roman" w:hAnsi="Times New Roman" w:cs="Times New Roman"/>
+          <w:sz w:val="28"/>
+          <w:szCs w:val="28"/>
+        </w:rPr>
+        <w:t>tra</w:t>
+      </w:r>
+      <w:proofErr w:type="spellEnd"/>
+      <w:r>
+        <w:rPr>
+          <w:rFonts w:ascii="Times New Roman" w:hAnsi="Times New Roman" w:cs="Times New Roman"/>
+          <w:sz w:val="28"/>
+          <w:szCs w:val="28"/>
+        </w:rPr>
+        <w:t xml:space="preserve"> </w:t>
+      </w:r>
+      <w:proofErr w:type="spellStart"/>
+      <w:r>
+        <w:rPr>
+          <w:rFonts w:ascii="Times New Roman" w:hAnsi="Times New Roman" w:cs="Times New Roman"/>
+          <w:sz w:val="28"/>
+          <w:szCs w:val="28"/>
+        </w:rPr>
+        <w:t>tại</w:t>
+      </w:r>
+      <w:proofErr w:type="spellEnd"/>
+      <w:r>
+        <w:rPr>
+          <w:rFonts w:ascii="Times New Roman" w:hAnsi="Times New Roman" w:cs="Times New Roman"/>
+          <w:sz w:val="28"/>
+          <w:szCs w:val="28"/>
+        </w:rPr>
+        <w:t xml:space="preserve"> </w:t>
+      </w:r>
+      <w:proofErr w:type="spellStart"/>
+      <w:r>
+        <w:rPr>
+          <w:rFonts w:ascii="Times New Roman" w:hAnsi="Times New Roman" w:cs="Times New Roman"/>
+          <w:sz w:val="28"/>
+          <w:szCs w:val="28"/>
+        </w:rPr>
+        <w:t>cùng</w:t>
+      </w:r>
+      <w:proofErr w:type="spellEnd"/>
+      <w:r>
+        <w:rPr>
+          <w:rFonts w:ascii="Times New Roman" w:hAnsi="Times New Roman" w:cs="Times New Roman"/>
+          <w:sz w:val="28"/>
+          <w:szCs w:val="28"/>
+        </w:rPr>
+        <w:t xml:space="preserve"> </w:t>
+      </w:r>
+      <w:proofErr w:type="spellStart"/>
+      <w:r>
+        <w:rPr>
+          <w:rFonts w:ascii="Times New Roman" w:hAnsi="Times New Roman" w:cs="Times New Roman"/>
+          <w:sz w:val="28"/>
+          <w:szCs w:val="28"/>
+        </w:rPr>
+        <w:t>vị</w:t>
+      </w:r>
+      <w:proofErr w:type="spellEnd"/>
+      <w:r>
+        <w:rPr>
+          <w:rFonts w:ascii="Times New Roman" w:hAnsi="Times New Roman" w:cs="Times New Roman"/>
+          <w:sz w:val="28"/>
+          <w:szCs w:val="28"/>
+        </w:rPr>
+        <w:t xml:space="preserve"> </w:t>
+      </w:r>
+      <w:proofErr w:type="spellStart"/>
+      <w:r>
+        <w:rPr>
+          <w:rFonts w:ascii="Times New Roman" w:hAnsi="Times New Roman" w:cs="Times New Roman"/>
+          <w:sz w:val="28"/>
+          <w:szCs w:val="28"/>
+        </w:rPr>
+        <w:t>trí</w:t>
+      </w:r>
+      <w:proofErr w:type="spellEnd"/>
+      <w:r>
+        <w:rPr>
+          <w:rFonts w:ascii="Times New Roman" w:hAnsi="Times New Roman" w:cs="Times New Roman"/>
+          <w:sz w:val="28"/>
+          <w:szCs w:val="28"/>
+        </w:rPr>
+        <w:t xml:space="preserve"> th</w:t>
+      </w:r>
+      <w:proofErr w:type="spellStart"/>
+      <w:r>
+        <w:rPr>
+          <w:rFonts w:ascii="Times New Roman" w:hAnsi="Times New Roman" w:cs="Times New Roman"/>
+          <w:sz w:val="28"/>
+          <w:szCs w:val="28"/>
+        </w:rPr>
+        <w:t>ư</w:t>
+      </w:r>
+      <w:proofErr w:type="spellEnd"/>
+      <w:r>
+        <w:rPr>
+          <w:rFonts w:ascii="Times New Roman" w:hAnsi="Times New Roman" w:cs="Times New Roman"/>
+          <w:sz w:val="28"/>
+          <w:szCs w:val="28"/>
+        </w:rPr>
+        <w:t xml:space="preserve"> </w:t>
+      </w:r>
+      <w:proofErr w:type="spellStart"/>
+      <w:r>
+        <w:rPr>
+          <w:rFonts w:ascii="Times New Roman" w:hAnsi="Times New Roman" w:cs="Times New Roman"/>
+          <w:sz w:val="28"/>
+          <w:szCs w:val="28"/>
+        </w:rPr>
+        <w:t>mục</w:t>
+      </w:r>
+      <w:proofErr w:type="spellEnd"/>
+      <w:r>
+        <w:rPr>
+          <w:rFonts w:ascii="Times New Roman" w:hAnsi="Times New Roman" w:cs="Times New Roman"/>
+          <w:sz w:val="28"/>
+          <w:szCs w:val="28"/>
+        </w:rPr>
+        <w:t xml:space="preserve"> </w:t>
+      </w:r>
+      <w:proofErr w:type="spellStart"/>
+      <w:r>
+        <w:rPr>
+          <w:rFonts w:ascii="Times New Roman" w:hAnsi="Times New Roman" w:cs="Times New Roman"/>
+          <w:sz w:val="28"/>
+          <w:szCs w:val="28"/>
+        </w:rPr>
+        <w:t>của</w:t>
+      </w:r>
+      <w:proofErr w:type="spellEnd"/>
+      <w:r>
+        <w:rPr>
+          <w:rFonts w:ascii="Times New Roman" w:hAnsi="Times New Roman" w:cs="Times New Roman"/>
+          <w:sz w:val="28"/>
+          <w:szCs w:val="28"/>
+        </w:rPr>
+        <w:t xml:space="preserve"> BoiSoCua3.sh </w:t>
+      </w:r>
+      <w:proofErr w:type="spellStart"/>
+      <w:r>
+        <w:rPr>
+          <w:rFonts w:ascii="Times New Roman" w:hAnsi="Times New Roman" w:cs="Times New Roman"/>
+          <w:sz w:val="28"/>
+          <w:szCs w:val="28"/>
+        </w:rPr>
+        <w:t>và</w:t>
+      </w:r>
+      <w:proofErr w:type="spellEnd"/>
+      <w:r>
+        <w:rPr>
+          <w:rFonts w:ascii="Times New Roman" w:hAnsi="Times New Roman" w:cs="Times New Roman"/>
+          <w:sz w:val="28"/>
+          <w:szCs w:val="28"/>
+        </w:rPr>
+        <w:t xml:space="preserve"> </w:t>
+      </w:r>
+      <w:proofErr w:type="spellStart"/>
+      <w:r>
+        <w:rPr>
+          <w:rFonts w:ascii="Times New Roman" w:hAnsi="Times New Roman" w:cs="Times New Roman"/>
+          <w:sz w:val="28"/>
+          <w:szCs w:val="28"/>
+        </w:rPr>
+        <w:t>tìm</w:t>
+      </w:r>
+      <w:proofErr w:type="spellEnd"/>
+      <w:r>
+        <w:rPr>
+          <w:rFonts w:ascii="Times New Roman" w:hAnsi="Times New Roman" w:cs="Times New Roman"/>
+          <w:sz w:val="28"/>
+          <w:szCs w:val="28"/>
+        </w:rPr>
+        <w:t xml:space="preserve"> file kq.txt.</w:t>
       </w:r>
     </w:p>
     <w:p>
@@ -1281,13 +4443,131 @@
           <w:szCs w:val="28"/>
         </w:rPr>
       </w:pPr>
-      <w:r>
-        <w:rPr>
-          <w:rFonts w:ascii="Times New Roman" w:hAnsi="Times New Roman" w:cs="Times New Roman"/>
-          <w:sz w:val="28"/>
-          <w:szCs w:val="28"/>
-        </w:rPr>
-        <w:t>Bước 4: Mở file này để xem kết quả.</w:t>
+      <w:proofErr w:type="spellStart"/>
+      <w:r>
+        <w:rPr>
+          <w:rFonts w:ascii="Times New Roman" w:hAnsi="Times New Roman" w:cs="Times New Roman"/>
+          <w:sz w:val="28"/>
+          <w:szCs w:val="28"/>
+        </w:rPr>
+        <w:t>Bước</w:t>
+      </w:r>
+      <w:proofErr w:type="spellEnd"/>
+      <w:r>
+        <w:rPr>
+          <w:rFonts w:ascii="Times New Roman" w:hAnsi="Times New Roman" w:cs="Times New Roman"/>
+          <w:sz w:val="28"/>
+          <w:szCs w:val="28"/>
+        </w:rPr>
+        <w:t xml:space="preserve"> 4: </w:t>
+      </w:r>
+      <w:proofErr w:type="spellStart"/>
+      <w:r>
+        <w:rPr>
+          <w:rFonts w:ascii="Times New Roman" w:hAnsi="Times New Roman" w:cs="Times New Roman"/>
+          <w:sz w:val="28"/>
+          <w:szCs w:val="28"/>
+        </w:rPr>
+        <w:t>Mở</w:t>
+      </w:r>
+      <w:proofErr w:type="spellEnd"/>
+      <w:r>
+        <w:rPr>
+          <w:rFonts w:ascii="Times New Roman" w:hAnsi="Times New Roman" w:cs="Times New Roman"/>
+          <w:sz w:val="28"/>
+          <w:szCs w:val="28"/>
+        </w:rPr>
+        <w:t xml:space="preserve"> file </w:t>
+      </w:r>
+      <w:proofErr w:type="spellStart"/>
+      <w:r>
+        <w:rPr>
+          <w:rFonts w:ascii="Times New Roman" w:hAnsi="Times New Roman" w:cs="Times New Roman"/>
+          <w:sz w:val="28"/>
+          <w:szCs w:val="28"/>
+        </w:rPr>
+        <w:t>này</w:t>
+      </w:r>
+      <w:proofErr w:type="spellEnd"/>
+      <w:r>
+        <w:rPr>
+          <w:rFonts w:ascii="Times New Roman" w:hAnsi="Times New Roman" w:cs="Times New Roman"/>
+          <w:sz w:val="28"/>
+          <w:szCs w:val="28"/>
+        </w:rPr>
+        <w:t xml:space="preserve"> </w:t>
+      </w:r>
+      <w:proofErr w:type="spellStart"/>
+      <w:r>
+        <w:rPr>
+          <w:rFonts w:ascii="Times New Roman" w:hAnsi="Times New Roman" w:cs="Times New Roman"/>
+          <w:sz w:val="28"/>
+          <w:szCs w:val="28"/>
+        </w:rPr>
+        <w:t>để</w:t>
+      </w:r>
+      <w:proofErr w:type="spellEnd"/>
+      <w:r>
+        <w:rPr>
+          <w:rFonts w:ascii="Times New Roman" w:hAnsi="Times New Roman" w:cs="Times New Roman"/>
+          <w:sz w:val="28"/>
+          <w:szCs w:val="28"/>
+        </w:rPr>
+        <w:t xml:space="preserve"> </w:t>
+      </w:r>
+      <w:proofErr w:type="spellStart"/>
+      <w:r>
+        <w:rPr>
+          <w:rFonts w:ascii="Times New Roman" w:hAnsi="Times New Roman" w:cs="Times New Roman"/>
+          <w:sz w:val="28"/>
+          <w:szCs w:val="28"/>
+        </w:rPr>
+        <w:t>xem</w:t>
+      </w:r>
+      <w:proofErr w:type="spellEnd"/>
+      <w:r>
+        <w:rPr>
+          <w:rFonts w:ascii="Times New Roman" w:hAnsi="Times New Roman" w:cs="Times New Roman"/>
+          <w:sz w:val="28"/>
+          <w:szCs w:val="28"/>
+        </w:rPr>
+        <w:t xml:space="preserve"> </w:t>
+      </w:r>
+      <w:proofErr w:type="spellStart"/>
+      <w:r>
+        <w:rPr>
+          <w:rFonts w:ascii="Times New Roman" w:hAnsi="Times New Roman" w:cs="Times New Roman"/>
+          <w:sz w:val="28"/>
+          <w:szCs w:val="28"/>
+        </w:rPr>
+        <w:t>kết</w:t>
+      </w:r>
+      <w:proofErr w:type="spellEnd"/>
+      <w:r>
+        <w:rPr>
+          <w:rFonts w:ascii="Times New Roman" w:hAnsi="Times New Roman" w:cs="Times New Roman"/>
+          <w:sz w:val="28"/>
+          <w:szCs w:val="28"/>
+        </w:rPr>
+        <w:t xml:space="preserve"> </w:t>
+      </w:r>
+      <w:proofErr w:type="spellStart"/>
+      <w:r>
+        <w:rPr>
+          <w:rFonts w:ascii="Times New Roman" w:hAnsi="Times New Roman" w:cs="Times New Roman"/>
+          <w:sz w:val="28"/>
+          <w:szCs w:val="28"/>
+        </w:rPr>
+        <w:t>quả</w:t>
+      </w:r>
+      <w:proofErr w:type="spellEnd"/>
+      <w:r>
+        <w:rPr>
+          <w:rFonts w:ascii="Times New Roman" w:hAnsi="Times New Roman" w:cs="Times New Roman"/>
+          <w:sz w:val="28"/>
+          <w:szCs w:val="28"/>
+        </w:rPr>
+        <w:t>.</w:t>
       </w:r>
     </w:p>
     <w:p>
@@ -1310,7 +4590,7 @@
           <wp:inline distT="0" distB="0" distL="0" distR="0" wp14:anchorId="176D3410" wp14:editId="1626CD89">
             <wp:extent cx="5943600" cy="2566670"/>
             <wp:effectExtent l="0" t="0" r="0" b="5080"/>
-            <wp:docPr id="1973979595" name="Picture 1"/>
+            <wp:docPr id="1973979595" name="Picture 1" descr="A screenshot of a computer&#10;&#10;Description automatically generated"/>
             <wp:cNvGraphicFramePr>
               <a:graphicFrameLocks xmlns:a="http://schemas.openxmlformats.org/drawingml/2006/main" noChangeAspect="1"/>
             </wp:cNvGraphicFramePr>
@@ -1318,7 +4598,7 @@
               <a:graphicData uri="http://schemas.openxmlformats.org/drawingml/2006/picture">
                 <pic:pic xmlns:pic="http://schemas.openxmlformats.org/drawingml/2006/picture">
                   <pic:nvPicPr>
-                    <pic:cNvPr id="1973979595" name=""/>
+                    <pic:cNvPr id="1973979595" name="Picture 1" descr="A screenshot of a computer&#10;&#10;Description automatically generated"/>
                     <pic:cNvPicPr/>
                   </pic:nvPicPr>
                   <pic:blipFill>

</xml_diff>